<commit_message>
07/05/2026 - 12:42 h
</commit_message>
<xml_diff>
--- a/Estudo de O Livro dos Espíritos - 25-05-2026.docx
+++ b/Estudo de O Livro dos Espíritos - 25-05-2026.docx
@@ -132,96 +132,65 @@
           <w:szCs w:val="48"/>
           <w:lang w:val="pt-BR" w:eastAsia="zh-CN" w:bidi="hi-IN"/>
         </w:rPr>
-        <w:t>P</w:t>
-      </w:r>
-      <w:r>
-        <w:rPr>
-          <w:rFonts w:eastAsia="Noto Serif CJK SC" w:cs="Noto Sans Devanagari" w:ascii="Garamond" w:hAnsi="Garamond"/>
-          <w:b/>
-          <w:bCs/>
-          <w:i w:val="false"/>
-          <w:iCs w:val="false"/>
-          <w:color w:val="auto"/>
-          <w:kern w:val="2"/>
-          <w:sz w:val="48"/>
-          <w:szCs w:val="48"/>
-          <w:lang w:val="pt-BR" w:eastAsia="zh-CN" w:bidi="hi-IN"/>
-        </w:rPr>
-        <w:t>actos</w:t>
-      </w:r>
-    </w:p>
-    <w:p>
-      <w:pPr>
-        <w:pStyle w:val="Normal"/>
-        <w:bidi w:val="0"/>
-        <w:jc w:val="both"/>
-        <w:rPr>
-          <w:rFonts w:ascii="Garamond" w:hAnsi="Garamond"/>
-          <w:sz w:val="36"/>
-          <w:szCs w:val="36"/>
-        </w:rPr>
-      </w:pPr>
-      <w:r>
-        <w:rPr>
-          <w:rFonts w:ascii="Garamond" w:hAnsi="Garamond"/>
-          <w:sz w:val="36"/>
-          <w:szCs w:val="36"/>
-        </w:rPr>
-      </w:r>
-    </w:p>
-    <w:p>
-      <w:pPr>
-        <w:pStyle w:val="Normal"/>
-        <w:bidi w:val="0"/>
-        <w:jc w:val="both"/>
-        <w:rPr>
-          <w:rFonts w:ascii="Garamond" w:hAnsi="Garamond"/>
-          <w:sz w:val="36"/>
-          <w:szCs w:val="36"/>
-        </w:rPr>
-      </w:pPr>
-      <w:r>
-        <w:rPr>
-          <w:rFonts w:ascii="Garamond" w:hAnsi="Garamond"/>
-          <w:sz w:val="36"/>
-          <w:szCs w:val="36"/>
-        </w:rPr>
-      </w:r>
-    </w:p>
-    <w:p>
-      <w:pPr>
-        <w:pStyle w:val="Normal"/>
-        <w:bidi w:val="0"/>
-        <w:jc w:val="both"/>
-        <w:rPr>
-          <w:rFonts w:ascii="Garamond" w:hAnsi="Garamond"/>
-          <w:sz w:val="36"/>
-          <w:szCs w:val="36"/>
-        </w:rPr>
-      </w:pPr>
-      <w:r>
-        <w:rPr>
-          <w:rFonts w:ascii="Garamond" w:hAnsi="Garamond"/>
-          <w:sz w:val="36"/>
-          <w:szCs w:val="36"/>
-        </w:rPr>
-        <w:t>5</w:t>
-      </w:r>
-      <w:r>
-        <w:rPr>
-          <w:rFonts w:ascii="Garamond" w:hAnsi="Garamond"/>
-          <w:sz w:val="36"/>
-          <w:szCs w:val="36"/>
-        </w:rPr>
-        <w:t>49</w:t>
-      </w:r>
-      <w:r>
-        <w:rPr>
-          <w:rFonts w:ascii="Garamond" w:hAnsi="Garamond"/>
-          <w:sz w:val="36"/>
-          <w:szCs w:val="36"/>
-        </w:rPr>
-        <w:t>. Algo de verdade haverá nos pactos com os maus Espíritos?</w:t>
+        <w:t>Pactos</w:t>
+      </w:r>
+    </w:p>
+    <w:p>
+      <w:pPr>
+        <w:pStyle w:val="Normal"/>
+        <w:bidi w:val="0"/>
+        <w:jc w:val="both"/>
+        <w:rPr>
+          <w:rFonts w:ascii="Garamond" w:hAnsi="Garamond"/>
+          <w:sz w:val="36"/>
+          <w:szCs w:val="36"/>
+        </w:rPr>
+      </w:pPr>
+      <w:r>
+        <w:rPr>
+          <w:rFonts w:ascii="Garamond" w:hAnsi="Garamond"/>
+          <w:sz w:val="36"/>
+          <w:szCs w:val="36"/>
+        </w:rPr>
+      </w:r>
+    </w:p>
+    <w:p>
+      <w:pPr>
+        <w:pStyle w:val="Normal"/>
+        <w:bidi w:val="0"/>
+        <w:jc w:val="both"/>
+        <w:rPr>
+          <w:rFonts w:ascii="Garamond" w:hAnsi="Garamond"/>
+          <w:sz w:val="36"/>
+          <w:szCs w:val="36"/>
+        </w:rPr>
+      </w:pPr>
+      <w:r>
+        <w:rPr>
+          <w:rFonts w:ascii="Garamond" w:hAnsi="Garamond"/>
+          <w:sz w:val="36"/>
+          <w:szCs w:val="36"/>
+        </w:rPr>
+      </w:r>
+    </w:p>
+    <w:p>
+      <w:pPr>
+        <w:pStyle w:val="Normal"/>
+        <w:bidi w:val="0"/>
+        <w:jc w:val="both"/>
+        <w:rPr>
+          <w:rFonts w:ascii="Garamond" w:hAnsi="Garamond"/>
+          <w:sz w:val="36"/>
+          <w:szCs w:val="36"/>
+        </w:rPr>
+      </w:pPr>
+      <w:r>
+        <w:rPr>
+          <w:rFonts w:ascii="Garamond" w:hAnsi="Garamond"/>
+          <w:sz w:val="36"/>
+          <w:szCs w:val="36"/>
+        </w:rPr>
+        <w:t>549. Algo de verdade haverá nos pactos com os maus Espíritos?</w:t>
       </w:r>
     </w:p>
     <w:p>
@@ -272,202 +241,26 @@
           <w:sz w:val="36"/>
           <w:szCs w:val="36"/>
         </w:rPr>
-        <w:t>Não, não há pactos. Há, porém, naturezas más que simpatizam</w:t>
-      </w:r>
-      <w:r>
-        <w:rPr>
-          <w:rFonts w:ascii="Garamond" w:hAnsi="Garamond"/>
-          <w:i/>
-          <w:iCs/>
-          <w:sz w:val="36"/>
-          <w:szCs w:val="36"/>
-        </w:rPr>
-        <w:t xml:space="preserve"> </w:t>
-      </w:r>
-      <w:r>
-        <w:rPr>
-          <w:rFonts w:ascii="Garamond" w:hAnsi="Garamond"/>
-          <w:i/>
-          <w:iCs/>
-          <w:sz w:val="36"/>
-          <w:szCs w:val="36"/>
-        </w:rPr>
-        <w:t>com os maus Espíritos. Por exemplo: queres atormentar o teu</w:t>
-      </w:r>
-      <w:r>
-        <w:rPr>
-          <w:rFonts w:ascii="Garamond" w:hAnsi="Garamond"/>
-          <w:i/>
-          <w:iCs/>
-          <w:sz w:val="36"/>
-          <w:szCs w:val="36"/>
-        </w:rPr>
-        <w:t xml:space="preserve"> </w:t>
-      </w:r>
-      <w:r>
-        <w:rPr>
-          <w:rFonts w:ascii="Garamond" w:hAnsi="Garamond"/>
-          <w:i/>
-          <w:iCs/>
-          <w:sz w:val="36"/>
-          <w:szCs w:val="36"/>
-        </w:rPr>
-        <w:t>vizinho e não sabes como hás de fazer. Chamas então por Espíritos inferiores que, como tu, só querem o mal e que, para te</w:t>
-      </w:r>
-      <w:r>
-        <w:rPr>
-          <w:rFonts w:ascii="Garamond" w:hAnsi="Garamond"/>
-          <w:i/>
-          <w:iCs/>
-          <w:sz w:val="36"/>
-          <w:szCs w:val="36"/>
-        </w:rPr>
-        <w:t xml:space="preserve"> </w:t>
-      </w:r>
-      <w:r>
-        <w:rPr>
-          <w:rFonts w:ascii="Garamond" w:hAnsi="Garamond"/>
-          <w:i/>
-          <w:iCs/>
-          <w:sz w:val="36"/>
-          <w:szCs w:val="36"/>
-        </w:rPr>
-        <w:t>ajudarem, exigem que também os sirvas em seus maus desígnios.</w:t>
-      </w:r>
-      <w:r>
-        <w:rPr>
-          <w:rFonts w:ascii="Garamond" w:hAnsi="Garamond"/>
-          <w:i/>
-          <w:iCs/>
-          <w:sz w:val="36"/>
-          <w:szCs w:val="36"/>
-        </w:rPr>
-        <w:t xml:space="preserve"> </w:t>
-      </w:r>
-      <w:r>
-        <w:rPr>
-          <w:rFonts w:ascii="Garamond" w:hAnsi="Garamond"/>
-          <w:i/>
-          <w:iCs/>
-          <w:sz w:val="36"/>
-          <w:szCs w:val="36"/>
-        </w:rPr>
-        <w:t>Não se segue, porém, que o teu vizinho não possa livrar-se deles</w:t>
-      </w:r>
-      <w:r>
-        <w:rPr>
-          <w:rFonts w:ascii="Garamond" w:hAnsi="Garamond"/>
-          <w:i/>
-          <w:iCs/>
-          <w:sz w:val="36"/>
-          <w:szCs w:val="36"/>
-        </w:rPr>
-        <w:t xml:space="preserve"> </w:t>
-      </w:r>
-      <w:r>
-        <w:rPr>
-          <w:rFonts w:ascii="Garamond" w:hAnsi="Garamond"/>
-          <w:i/>
-          <w:iCs/>
-          <w:sz w:val="36"/>
-          <w:szCs w:val="36"/>
-        </w:rPr>
-        <w:t>por meio de uma conjuração oposta e pela ação da sua vontade.</w:t>
-      </w:r>
-      <w:r>
-        <w:rPr>
-          <w:rFonts w:ascii="Garamond" w:hAnsi="Garamond"/>
-          <w:i/>
-          <w:iCs/>
-          <w:sz w:val="36"/>
-          <w:szCs w:val="36"/>
-        </w:rPr>
-        <w:t xml:space="preserve"> </w:t>
-      </w:r>
-      <w:r>
-        <w:rPr>
-          <w:rFonts w:ascii="Garamond" w:hAnsi="Garamond"/>
-          <w:i/>
-          <w:iCs/>
-          <w:sz w:val="36"/>
-          <w:szCs w:val="36"/>
-        </w:rPr>
-        <w:t>Aquele que intenta praticar uma ação má, pelo simples fato de</w:t>
-      </w:r>
-      <w:r>
-        <w:rPr>
-          <w:rFonts w:ascii="Garamond" w:hAnsi="Garamond"/>
-          <w:i/>
-          <w:iCs/>
-          <w:sz w:val="36"/>
-          <w:szCs w:val="36"/>
-        </w:rPr>
-        <w:t xml:space="preserve"> </w:t>
-      </w:r>
-      <w:r>
-        <w:rPr>
-          <w:rFonts w:ascii="Garamond" w:hAnsi="Garamond"/>
-          <w:i/>
-          <w:iCs/>
-          <w:sz w:val="36"/>
-          <w:szCs w:val="36"/>
-        </w:rPr>
-        <w:t>alimentar essa intenção, chama em seu auxílio maus Espíritos,</w:t>
-      </w:r>
-      <w:r>
-        <w:rPr>
-          <w:rFonts w:ascii="Garamond" w:hAnsi="Garamond"/>
-          <w:i/>
-          <w:iCs/>
-          <w:sz w:val="36"/>
-          <w:szCs w:val="36"/>
-        </w:rPr>
-        <w:t xml:space="preserve"> </w:t>
-      </w:r>
-      <w:r>
-        <w:rPr>
-          <w:rFonts w:ascii="Garamond" w:hAnsi="Garamond"/>
-          <w:i/>
-          <w:iCs/>
-          <w:sz w:val="36"/>
-          <w:szCs w:val="36"/>
-        </w:rPr>
-        <w:t>aos quais fica então obrigado a servir, porque dele também precisam esses Espíritos, para o mal que queiram fazer. Nisto apenas é</w:t>
-      </w:r>
-      <w:r>
-        <w:rPr>
-          <w:rFonts w:ascii="Garamond" w:hAnsi="Garamond"/>
-          <w:i/>
-          <w:iCs/>
-          <w:sz w:val="36"/>
-          <w:szCs w:val="36"/>
-        </w:rPr>
-        <w:t xml:space="preserve"> </w:t>
-      </w:r>
-      <w:r>
-        <w:rPr>
-          <w:rFonts w:ascii="Garamond" w:hAnsi="Garamond"/>
-          <w:i/>
-          <w:iCs/>
-          <w:sz w:val="36"/>
-          <w:szCs w:val="36"/>
-        </w:rPr>
-        <w:t xml:space="preserve">que consiste o pacto.” </w:t>
-      </w:r>
-    </w:p>
-    <w:p>
-      <w:pPr>
-        <w:pStyle w:val="Normal"/>
-        <w:bidi w:val="0"/>
-        <w:jc w:val="both"/>
-        <w:rPr>
-          <w:rFonts w:ascii="Garamond" w:hAnsi="Garamond"/>
-          <w:sz w:val="36"/>
-          <w:szCs w:val="36"/>
-        </w:rPr>
-      </w:pPr>
-      <w:r>
-        <w:rPr/>
+        <w:t xml:space="preserve">Não, não há pactos. Há, porém, naturezas más que simpatizam com os maus Espíritos. Por exemplo: queres atormentar o teu vizinho e não sabes como hás de fazer. Chamas então por Espíritos inferiores que, como tu, só querem o mal e que, para te ajudarem, exigem que também os sirvas em seus maus desígnios. Não se segue, porém, que o teu vizinho não possa livrar-se deles por meio de uma conjuração oposta e pela ação da sua vontade. Aquele que intenta praticar uma ação má, pelo simples fato de alimentar essa intenção, chama em seu auxílio maus Espíritos, aos quais fica então obrigado a servir, porque dele também precisam esses Espíritos, para o mal que queiram fazer. Nisto apenas é que consiste o pacto.” </w:t>
+      </w:r>
+    </w:p>
+    <w:p>
+      <w:pPr>
+        <w:pStyle w:val="Normal"/>
+        <w:bidi w:val="0"/>
+        <w:jc w:val="both"/>
+        <w:rPr>
+          <w:rFonts w:ascii="Garamond" w:hAnsi="Garamond"/>
+          <w:sz w:val="36"/>
+          <w:szCs w:val="36"/>
+        </w:rPr>
+      </w:pPr>
+      <w:r>
+        <w:rPr>
+          <w:rFonts w:ascii="Garamond" w:hAnsi="Garamond"/>
+          <w:sz w:val="36"/>
+          <w:szCs w:val="36"/>
+        </w:rPr>
       </w:r>
     </w:p>
     <w:p>
@@ -499,215 +292,312 @@
           <w:szCs w:val="28"/>
           <w:lang w:val="pt-BR" w:eastAsia="zh-CN" w:bidi="hi-IN"/>
         </w:rPr>
-        <w:t>O fato de o homem ficar, às vezes, na dependência dos Espíritos inferiores nasce de se entregar aos maus pensamentos que estes lhe sugerem</w:t>
-      </w:r>
-      <w:r>
-        <w:rPr>
-          <w:rFonts w:eastAsia="Noto Serif CJK SC" w:cs="Noto Sans Devanagari" w:ascii="Garamond" w:hAnsi="Garamond"/>
-          <w:i w:val="false"/>
-          <w:iCs w:val="false"/>
-          <w:color w:val="000000"/>
-          <w:kern w:val="2"/>
-          <w:sz w:val="28"/>
-          <w:szCs w:val="28"/>
-          <w:lang w:val="pt-BR" w:eastAsia="zh-CN" w:bidi="hi-IN"/>
-        </w:rPr>
-        <w:t xml:space="preserve"> </w:t>
-      </w:r>
-      <w:r>
-        <w:rPr>
-          <w:rFonts w:eastAsia="Noto Serif CJK SC" w:cs="Noto Sans Devanagari" w:ascii="Garamond" w:hAnsi="Garamond"/>
-          <w:i w:val="false"/>
-          <w:iCs w:val="false"/>
-          <w:color w:val="000000"/>
-          <w:kern w:val="2"/>
-          <w:sz w:val="28"/>
-          <w:szCs w:val="28"/>
-          <w:lang w:val="pt-BR" w:eastAsia="zh-CN" w:bidi="hi-IN"/>
-        </w:rPr>
-        <w:t>e não de estipulações quaisquer que com eles faça. O pacto, no sentido</w:t>
-      </w:r>
-      <w:r>
-        <w:rPr>
-          <w:rFonts w:eastAsia="Noto Serif CJK SC" w:cs="Noto Sans Devanagari" w:ascii="Garamond" w:hAnsi="Garamond"/>
-          <w:i w:val="false"/>
-          <w:iCs w:val="false"/>
-          <w:color w:val="000000"/>
-          <w:kern w:val="2"/>
-          <w:sz w:val="28"/>
-          <w:szCs w:val="28"/>
-          <w:lang w:val="pt-BR" w:eastAsia="zh-CN" w:bidi="hi-IN"/>
-        </w:rPr>
-        <w:t xml:space="preserve"> </w:t>
-      </w:r>
-      <w:r>
-        <w:rPr>
-          <w:rFonts w:eastAsia="Noto Serif CJK SC" w:cs="Noto Sans Devanagari" w:ascii="Garamond" w:hAnsi="Garamond"/>
-          <w:i w:val="false"/>
-          <w:iCs w:val="false"/>
-          <w:color w:val="000000"/>
-          <w:kern w:val="2"/>
-          <w:sz w:val="28"/>
-          <w:szCs w:val="28"/>
-          <w:lang w:val="pt-BR" w:eastAsia="zh-CN" w:bidi="hi-IN"/>
-        </w:rPr>
-        <w:t>vulgar do termo, é uma alegoria representativa da simpatia existente entre um indivíduo de natureza má e Espíritos malfazejos.</w:t>
-      </w:r>
-    </w:p>
-    <w:p>
-      <w:pPr>
-        <w:pStyle w:val="Normal"/>
-        <w:bidi w:val="0"/>
-        <w:jc w:val="both"/>
-        <w:rPr>
-          <w:rFonts w:ascii="Garamond" w:hAnsi="Garamond"/>
-          <w:sz w:val="36"/>
-          <w:szCs w:val="36"/>
-        </w:rPr>
-      </w:pPr>
-      <w:r>
-        <w:rPr>
-          <w:rFonts w:ascii="Garamond" w:hAnsi="Garamond"/>
-          <w:sz w:val="36"/>
-          <w:szCs w:val="36"/>
-        </w:rPr>
-      </w:r>
-    </w:p>
-    <w:p>
-      <w:pPr>
-        <w:pStyle w:val="Normal"/>
-        <w:bidi w:val="0"/>
-        <w:ind w:left="709" w:hanging="0"/>
-        <w:jc w:val="both"/>
-        <w:rPr>
-          <w:rFonts w:ascii="Garamond" w:hAnsi="Garamond"/>
-          <w:color w:val="00A0FC"/>
-          <w:sz w:val="36"/>
-          <w:szCs w:val="36"/>
-        </w:rPr>
-      </w:pPr>
-      <w:r>
-        <w:rPr>
-          <w:rFonts w:eastAsia="Noto Serif CJK SC" w:cs="Noto Sans Devanagari" w:ascii="Garamond" w:hAnsi="Garamond"/>
-          <w:color w:val="00A0FC"/>
-          <w:kern w:val="2"/>
-          <w:sz w:val="36"/>
-          <w:szCs w:val="36"/>
-          <w:lang w:val="pt-BR" w:eastAsia="zh-CN" w:bidi="hi-IN"/>
-        </w:rPr>
-        <w:t xml:space="preserve">A pergunta de Kardec </w:t>
-      </w:r>
-      <w:r>
-        <w:rPr>
-          <w:rFonts w:eastAsia="Noto Serif CJK SC" w:cs="Noto Sans Devanagari" w:ascii="Garamond" w:hAnsi="Garamond"/>
-          <w:color w:val="00A0FC"/>
-          <w:kern w:val="2"/>
-          <w:sz w:val="36"/>
-          <w:szCs w:val="36"/>
-          <w:lang w:val="pt-BR" w:eastAsia="zh-CN" w:bidi="hi-IN"/>
-        </w:rPr>
-        <w:t>se baseia em uma crença popular que existia na época em que O Livro dos Espíritos foi lançado.</w:t>
-      </w:r>
-    </w:p>
-    <w:p>
-      <w:pPr>
-        <w:pStyle w:val="Normal"/>
-        <w:bidi w:val="0"/>
-        <w:ind w:left="709" w:hanging="0"/>
-        <w:jc w:val="both"/>
-        <w:rPr>
-          <w:rFonts w:ascii="Garamond" w:hAnsi="Garamond"/>
-          <w:color w:val="00A0FC"/>
-          <w:sz w:val="36"/>
-          <w:szCs w:val="36"/>
-        </w:rPr>
-      </w:pPr>
-      <w:r>
-        <w:rPr/>
-      </w:r>
-    </w:p>
-    <w:p>
-      <w:pPr>
-        <w:pStyle w:val="Normal"/>
-        <w:bidi w:val="0"/>
-        <w:ind w:left="709" w:hanging="0"/>
-        <w:jc w:val="both"/>
-        <w:rPr>
-          <w:rFonts w:ascii="Garamond" w:hAnsi="Garamond"/>
-          <w:color w:val="00A0FC"/>
-          <w:sz w:val="36"/>
-          <w:szCs w:val="36"/>
-        </w:rPr>
-      </w:pPr>
-      <w:r>
-        <w:rPr>
-          <w:rFonts w:eastAsia="Noto Serif CJK SC" w:cs="Noto Sans Devanagari" w:ascii="Garamond" w:hAnsi="Garamond"/>
-          <w:color w:val="00A0FC"/>
-          <w:kern w:val="2"/>
-          <w:sz w:val="36"/>
-          <w:szCs w:val="36"/>
-          <w:lang w:val="pt-BR" w:eastAsia="zh-CN" w:bidi="hi-IN"/>
-        </w:rPr>
-        <w:t>Em 1857, a crença predominante no imaginário popular ainda era a de que certas pessoas podiam fazer pactos com o diabo ou com entidades malignas para obter vantagens materiais (riqueza, poder, prestígio etc.). Essa ideia não era exatamente “oficial” no sentido teológico mais rigoroso do século XIX, mas permanecia muito viva culturalmente.</w:t>
-      </w:r>
-    </w:p>
-    <w:p>
-      <w:pPr>
-        <w:pStyle w:val="Normal"/>
-        <w:bidi w:val="0"/>
-        <w:ind w:left="709" w:hanging="0"/>
-        <w:jc w:val="both"/>
-        <w:rPr>
-          <w:rFonts w:ascii="Garamond" w:hAnsi="Garamond"/>
-          <w:color w:val="00A0FC"/>
-          <w:sz w:val="36"/>
-          <w:szCs w:val="36"/>
-        </w:rPr>
-      </w:pPr>
-      <w:r>
-        <w:rPr/>
-      </w:r>
-    </w:p>
-    <w:p>
-      <w:pPr>
-        <w:pStyle w:val="Normal"/>
-        <w:bidi w:val="0"/>
-        <w:ind w:left="709" w:hanging="0"/>
-        <w:jc w:val="both"/>
-        <w:rPr>
-          <w:rFonts w:ascii="Garamond" w:hAnsi="Garamond"/>
-          <w:color w:val="00A0FC"/>
-          <w:sz w:val="36"/>
-          <w:szCs w:val="36"/>
-        </w:rPr>
-      </w:pPr>
-      <w:r>
-        <w:rPr>
-          <w:rFonts w:eastAsia="Noto Serif CJK SC" w:cs="Noto Sans Devanagari" w:ascii="Garamond" w:hAnsi="Garamond"/>
-          <w:color w:val="00A0FC"/>
-          <w:kern w:val="2"/>
-          <w:sz w:val="36"/>
-          <w:szCs w:val="36"/>
-          <w:lang w:val="pt-BR" w:eastAsia="zh-CN" w:bidi="hi-IN"/>
-        </w:rPr>
-        <w:t>Ela vinha de uma longa tradição europeia ligada à Idade Média e ao início da Idade Moderna, fortemente influenciada por episódios como a Caça às Bruxas, quando se acreditava que bruxas e feiticeiros firmavam acordos com o demônio. Mesmo após o declínio dessas perseguições, a noção continuou no folclore, na literatura e na mentalidade popular.</w:t>
-      </w:r>
-    </w:p>
-    <w:p>
-      <w:pPr>
-        <w:pStyle w:val="Normal"/>
-        <w:bidi w:val="0"/>
-        <w:ind w:left="709" w:hanging="0"/>
-        <w:jc w:val="both"/>
-        <w:rPr>
-          <w:rFonts w:ascii="Garamond" w:hAnsi="Garamond"/>
-          <w:color w:val="00A0FC"/>
-          <w:sz w:val="36"/>
-          <w:szCs w:val="36"/>
-        </w:rPr>
-      </w:pPr>
-      <w:r>
-        <w:rPr/>
+        <w:t>O fato de o homem ficar, às vezes, na dependência dos Espíritos inferiores nasce de se entregar aos maus pensamentos que estes lhe sugerem e não de estipulações quaisquer que com eles faça. O pacto, no sentido vulgar do termo, é uma alegoria representativa da simpatia existente entre um indivíduo de natureza má e Espíritos malfazejos.</w:t>
+      </w:r>
+    </w:p>
+    <w:p>
+      <w:pPr>
+        <w:pStyle w:val="Normal"/>
+        <w:bidi w:val="0"/>
+        <w:jc w:val="both"/>
+        <w:rPr>
+          <w:rFonts w:ascii="Garamond" w:hAnsi="Garamond"/>
+          <w:sz w:val="36"/>
+          <w:szCs w:val="36"/>
+        </w:rPr>
+      </w:pPr>
+      <w:r>
+        <w:rPr>
+          <w:rFonts w:ascii="Garamond" w:hAnsi="Garamond"/>
+          <w:sz w:val="36"/>
+          <w:szCs w:val="36"/>
+        </w:rPr>
+      </w:r>
+    </w:p>
+    <w:p>
+      <w:pPr>
+        <w:pStyle w:val="Normal"/>
+        <w:bidi w:val="0"/>
+        <w:ind w:left="709" w:hanging="0"/>
+        <w:jc w:val="both"/>
+        <w:rPr>
+          <w:rFonts w:ascii="Garamond" w:hAnsi="Garamond"/>
+          <w:color w:val="00A0FC"/>
+          <w:sz w:val="36"/>
+          <w:szCs w:val="36"/>
+        </w:rPr>
+      </w:pPr>
+      <w:r>
+        <w:rPr>
+          <w:rFonts w:eastAsia="Noto Serif CJK SC" w:cs="Noto Sans Devanagari" w:ascii="Garamond" w:hAnsi="Garamond"/>
+          <w:color w:val="00A0FC"/>
+          <w:kern w:val="2"/>
+          <w:sz w:val="36"/>
+          <w:szCs w:val="36"/>
+          <w:lang w:val="pt-BR" w:eastAsia="zh-CN" w:bidi="hi-IN"/>
+        </w:rPr>
+        <w:t>A pergunta de Kardec se baseia em uma crença popular que existia na época em que O Livro dos Espíritos foi lançado.</w:t>
+      </w:r>
+    </w:p>
+    <w:p>
+      <w:pPr>
+        <w:pStyle w:val="Normal"/>
+        <w:bidi w:val="0"/>
+        <w:ind w:left="709" w:hanging="0"/>
+        <w:jc w:val="both"/>
+        <w:rPr>
+          <w:rFonts w:ascii="Garamond" w:hAnsi="Garamond"/>
+          <w:color w:val="00A0FC"/>
+          <w:sz w:val="36"/>
+          <w:szCs w:val="36"/>
+        </w:rPr>
+      </w:pPr>
+      <w:r>
+        <w:rPr>
+          <w:rFonts w:ascii="Garamond" w:hAnsi="Garamond"/>
+          <w:color w:val="00A0FC"/>
+          <w:sz w:val="36"/>
+          <w:szCs w:val="36"/>
+        </w:rPr>
+      </w:r>
+    </w:p>
+    <w:p>
+      <w:pPr>
+        <w:pStyle w:val="Normal"/>
+        <w:bidi w:val="0"/>
+        <w:ind w:left="709" w:hanging="0"/>
+        <w:jc w:val="both"/>
+        <w:rPr>
+          <w:rFonts w:ascii="Garamond" w:hAnsi="Garamond"/>
+          <w:color w:val="00A0FC"/>
+          <w:sz w:val="36"/>
+          <w:szCs w:val="36"/>
+        </w:rPr>
+      </w:pPr>
+      <w:r>
+        <w:rPr>
+          <w:rFonts w:eastAsia="Noto Serif CJK SC" w:cs="Noto Sans Devanagari" w:ascii="Garamond" w:hAnsi="Garamond"/>
+          <w:color w:val="00A0FC"/>
+          <w:kern w:val="2"/>
+          <w:sz w:val="36"/>
+          <w:szCs w:val="36"/>
+          <w:lang w:val="pt-BR" w:eastAsia="zh-CN" w:bidi="hi-IN"/>
+        </w:rPr>
+        <w:t>Por volta de</w:t>
+      </w:r>
+      <w:r>
+        <w:rPr>
+          <w:rFonts w:eastAsia="Noto Serif CJK SC" w:cs="Noto Sans Devanagari" w:ascii="Garamond" w:hAnsi="Garamond"/>
+          <w:color w:val="00A0FC"/>
+          <w:kern w:val="2"/>
+          <w:sz w:val="36"/>
+          <w:szCs w:val="36"/>
+          <w:lang w:val="pt-BR" w:eastAsia="zh-CN" w:bidi="hi-IN"/>
+        </w:rPr>
+        <w:t xml:space="preserve"> 1857, </w:t>
+      </w:r>
+      <w:r>
+        <w:rPr>
+          <w:rFonts w:eastAsia="Noto Serif CJK SC" w:cs="Noto Sans Devanagari" w:ascii="Garamond" w:hAnsi="Garamond"/>
+          <w:color w:val="00A0FC"/>
+          <w:kern w:val="2"/>
+          <w:sz w:val="36"/>
+          <w:szCs w:val="36"/>
+          <w:lang w:val="pt-BR" w:eastAsia="zh-CN" w:bidi="hi-IN"/>
+        </w:rPr>
+        <w:t>as pessoas</w:t>
+      </w:r>
+      <w:r>
+        <w:rPr>
+          <w:rFonts w:eastAsia="Noto Serif CJK SC" w:cs="Noto Sans Devanagari" w:ascii="Garamond" w:hAnsi="Garamond"/>
+          <w:color w:val="00A0FC"/>
+          <w:kern w:val="2"/>
+          <w:sz w:val="36"/>
+          <w:szCs w:val="36"/>
+          <w:lang w:val="pt-BR" w:eastAsia="zh-CN" w:bidi="hi-IN"/>
+        </w:rPr>
+        <w:t xml:space="preserve"> ainda tinha</w:t>
+      </w:r>
+      <w:r>
+        <w:rPr>
+          <w:rFonts w:eastAsia="Noto Serif CJK SC" w:cs="Noto Sans Devanagari" w:ascii="Garamond" w:hAnsi="Garamond"/>
+          <w:color w:val="00A0FC"/>
+          <w:kern w:val="2"/>
+          <w:sz w:val="36"/>
+          <w:szCs w:val="36"/>
+          <w:lang w:val="pt-BR" w:eastAsia="zh-CN" w:bidi="hi-IN"/>
+        </w:rPr>
+        <w:t>m</w:t>
+      </w:r>
+      <w:r>
+        <w:rPr>
+          <w:rFonts w:eastAsia="Noto Serif CJK SC" w:cs="Noto Sans Devanagari" w:ascii="Garamond" w:hAnsi="Garamond"/>
+          <w:color w:val="00A0FC"/>
+          <w:kern w:val="2"/>
+          <w:sz w:val="36"/>
+          <w:szCs w:val="36"/>
+          <w:lang w:val="pt-BR" w:eastAsia="zh-CN" w:bidi="hi-IN"/>
+        </w:rPr>
+        <w:t xml:space="preserve"> muito forte aquela ideia de que </w:t>
+      </w:r>
+      <w:r>
+        <w:rPr>
+          <w:rFonts w:eastAsia="Noto Serif CJK SC" w:cs="Noto Sans Devanagari" w:ascii="Garamond" w:hAnsi="Garamond"/>
+          <w:color w:val="00A0FC"/>
+          <w:kern w:val="2"/>
+          <w:sz w:val="36"/>
+          <w:szCs w:val="36"/>
+          <w:lang w:val="pt-BR" w:eastAsia="zh-CN" w:bidi="hi-IN"/>
+        </w:rPr>
+        <w:t>era possível</w:t>
+      </w:r>
+      <w:r>
+        <w:rPr>
+          <w:rFonts w:eastAsia="Noto Serif CJK SC" w:cs="Noto Sans Devanagari" w:ascii="Garamond" w:hAnsi="Garamond"/>
+          <w:color w:val="00A0FC"/>
+          <w:kern w:val="2"/>
+          <w:sz w:val="36"/>
+          <w:szCs w:val="36"/>
+          <w:lang w:val="pt-BR" w:eastAsia="zh-CN" w:bidi="hi-IN"/>
+        </w:rPr>
+        <w:t xml:space="preserve">  fazer um pacto com o diabo ou com "forças das trevas". O objetivo era o de sempre: ficar rico, ganhar poder ou ter status. No século XIX, a Igreja e os estudiosos já não levavam isso tão ao pé da letra, mas na boca do povo e na cultura do dia a dia, essa crença continuava forte.</w:t>
+      </w:r>
+    </w:p>
+    <w:p>
+      <w:pPr>
+        <w:pStyle w:val="Normal"/>
+        <w:bidi w:val="0"/>
+        <w:ind w:left="709" w:hanging="0"/>
+        <w:jc w:val="both"/>
+        <w:rPr>
+          <w:rFonts w:ascii="Garamond" w:hAnsi="Garamond"/>
+          <w:color w:val="00A0FC"/>
+          <w:sz w:val="36"/>
+          <w:szCs w:val="36"/>
+        </w:rPr>
+      </w:pPr>
+      <w:r>
+        <w:rPr>
+          <w:rFonts w:ascii="Garamond" w:hAnsi="Garamond"/>
+          <w:color w:val="00A0FC"/>
+          <w:sz w:val="36"/>
+          <w:szCs w:val="36"/>
+        </w:rPr>
+      </w:r>
+    </w:p>
+    <w:p>
+      <w:pPr>
+        <w:pStyle w:val="Normal"/>
+        <w:bidi w:val="0"/>
+        <w:ind w:left="709" w:hanging="0"/>
+        <w:jc w:val="both"/>
+        <w:rPr>
+          <w:rFonts w:ascii="Garamond" w:hAnsi="Garamond"/>
+          <w:color w:val="00A0FC"/>
+          <w:sz w:val="36"/>
+          <w:szCs w:val="36"/>
+        </w:rPr>
+      </w:pPr>
+      <w:r>
+        <w:rPr>
+          <w:rFonts w:eastAsia="Noto Serif CJK SC" w:cs="Noto Sans Devanagari" w:ascii="Garamond" w:hAnsi="Garamond"/>
+          <w:color w:val="00A0FC"/>
+          <w:kern w:val="2"/>
+          <w:sz w:val="36"/>
+          <w:szCs w:val="36"/>
+          <w:lang w:val="pt-BR" w:eastAsia="zh-CN" w:bidi="hi-IN"/>
+        </w:rPr>
+        <w:t xml:space="preserve">Essa história não surgiu do nada; ela era herança de uma tradição europeia bem antiga, que vinha desde a Idade Média. O auge disso foi </w:t>
+      </w:r>
+      <w:r>
+        <w:rPr>
+          <w:rFonts w:eastAsia="Noto Serif CJK SC" w:cs="Noto Sans Devanagari" w:ascii="Garamond" w:hAnsi="Garamond"/>
+          <w:color w:val="00A0FC"/>
+          <w:kern w:val="2"/>
+          <w:sz w:val="36"/>
+          <w:szCs w:val="36"/>
+          <w:lang w:val="pt-BR" w:eastAsia="zh-CN" w:bidi="hi-IN"/>
+        </w:rPr>
+        <w:t>a</w:t>
+      </w:r>
+      <w:r>
+        <w:rPr>
+          <w:rFonts w:eastAsia="Noto Serif CJK SC" w:cs="Noto Sans Devanagari" w:ascii="Garamond" w:hAnsi="Garamond"/>
+          <w:color w:val="00A0FC"/>
+          <w:kern w:val="2"/>
+          <w:sz w:val="36"/>
+          <w:szCs w:val="36"/>
+          <w:lang w:val="pt-BR" w:eastAsia="zh-CN" w:bidi="hi-IN"/>
+        </w:rPr>
+        <w:t xml:space="preserve"> época da </w:t>
+      </w:r>
+      <w:r>
+        <w:rPr>
+          <w:rFonts w:eastAsia="Noto Serif CJK SC" w:cs="Noto Sans Devanagari" w:ascii="Garamond" w:hAnsi="Garamond"/>
+          <w:b w:val="false"/>
+          <w:bCs w:val="false"/>
+          <w:color w:val="00A0FC"/>
+          <w:kern w:val="2"/>
+          <w:sz w:val="36"/>
+          <w:szCs w:val="36"/>
+          <w:lang w:val="pt-BR" w:eastAsia="zh-CN" w:bidi="hi-IN"/>
+        </w:rPr>
+        <w:t>Caça às Bruxas</w:t>
+      </w:r>
+      <w:r>
+        <w:rPr>
+          <w:rFonts w:eastAsia="Noto Serif CJK SC" w:cs="Noto Sans Devanagari" w:ascii="Garamond" w:hAnsi="Garamond"/>
+          <w:color w:val="00A0FC"/>
+          <w:kern w:val="2"/>
+          <w:sz w:val="36"/>
+          <w:szCs w:val="36"/>
+          <w:lang w:val="pt-BR" w:eastAsia="zh-CN" w:bidi="hi-IN"/>
+        </w:rPr>
+        <w:t xml:space="preserve">, quando todo mundo jurava que feiticeiros faziam acordos diretos com o demônio. Mesmo depois que as perseguições pararam, a ideia </w:t>
+      </w:r>
+      <w:r>
+        <w:rPr>
+          <w:rFonts w:eastAsia="Noto Serif CJK SC" w:cs="Noto Sans Devanagari" w:ascii="Garamond" w:hAnsi="Garamond"/>
+          <w:color w:val="00A0FC"/>
+          <w:kern w:val="2"/>
+          <w:sz w:val="36"/>
+          <w:szCs w:val="36"/>
+          <w:lang w:val="pt-BR" w:eastAsia="zh-CN" w:bidi="hi-IN"/>
+        </w:rPr>
+        <w:t>permaneceu</w:t>
+      </w:r>
+      <w:r>
+        <w:rPr>
+          <w:rFonts w:eastAsia="Noto Serif CJK SC" w:cs="Noto Sans Devanagari" w:ascii="Garamond" w:hAnsi="Garamond"/>
+          <w:color w:val="00A0FC"/>
+          <w:kern w:val="2"/>
+          <w:sz w:val="36"/>
+          <w:szCs w:val="36"/>
+          <w:lang w:val="pt-BR" w:eastAsia="zh-CN" w:bidi="hi-IN"/>
+        </w:rPr>
+        <w:t xml:space="preserve"> na cabeça das pessoas, sobrevivendo através do folclore, dos livros e das histórias contadas de geração em geração.</w:t>
+      </w:r>
+    </w:p>
+    <w:p>
+      <w:pPr>
+        <w:pStyle w:val="Normal"/>
+        <w:bidi w:val="0"/>
+        <w:ind w:left="709" w:hanging="0"/>
+        <w:jc w:val="both"/>
+        <w:rPr>
+          <w:rFonts w:ascii="Garamond" w:hAnsi="Garamond"/>
+          <w:color w:val="00A0FC"/>
+          <w:sz w:val="36"/>
+          <w:szCs w:val="36"/>
+        </w:rPr>
+      </w:pPr>
+      <w:r>
+        <w:rPr>
+          <w:rFonts w:ascii="Garamond" w:hAnsi="Garamond"/>
+          <w:color w:val="00A0FC"/>
+          <w:sz w:val="36"/>
+          <w:szCs w:val="36"/>
+        </w:rPr>
       </w:r>
     </w:p>
     <w:p>
@@ -749,7 +639,12 @@
         </w:rPr>
       </w:pPr>
       <w:r>
-        <w:rPr/>
+        <w:rPr>
+          <w:rFonts w:ascii="Garamond" w:hAnsi="Garamond"/>
+          <w:color w:val="00A0FC"/>
+          <w:sz w:val="36"/>
+          <w:szCs w:val="36"/>
+        </w:rPr>
       </w:r>
     </w:p>
     <w:p>
@@ -791,7 +686,12 @@
         </w:rPr>
       </w:pPr>
       <w:r>
-        <w:rPr/>
+        <w:rPr>
+          <w:rFonts w:ascii="Garamond" w:hAnsi="Garamond"/>
+          <w:color w:val="00A0FC"/>
+          <w:sz w:val="36"/>
+          <w:szCs w:val="36"/>
+        </w:rPr>
       </w:r>
     </w:p>
     <w:p>
@@ -833,7 +733,12 @@
         </w:rPr>
       </w:pPr>
       <w:r>
-        <w:rPr/>
+        <w:rPr>
+          <w:rFonts w:ascii="Garamond" w:hAnsi="Garamond"/>
+          <w:color w:val="00A0FC"/>
+          <w:sz w:val="36"/>
+          <w:szCs w:val="36"/>
+        </w:rPr>
       </w:r>
     </w:p>
     <w:p>
@@ -875,7 +780,12 @@
         </w:rPr>
       </w:pPr>
       <w:r>
-        <w:rPr/>
+        <w:rPr>
+          <w:rFonts w:ascii="Garamond" w:hAnsi="Garamond"/>
+          <w:color w:val="00A0FC"/>
+          <w:sz w:val="36"/>
+          <w:szCs w:val="36"/>
+        </w:rPr>
       </w:r>
     </w:p>
     <w:p>
@@ -904,7 +814,29 @@
           <w:szCs w:val="36"/>
           <w:lang w:val="pt-BR" w:eastAsia="zh-CN" w:bidi="hi-IN"/>
         </w:rPr>
-        <w:t>Os maus Espíritos que eventualmente atendam ao meu chamado e me auxiliem a perturbar meu vizinho, não farão isso gratuitamente. Eles exigirão que eu, de uma forma ou de outra, também os auxilie em seus propósitos igualmente maléficos;</w:t>
+        <w:t xml:space="preserve">Os maus Espíritos que eventualmente atendam ao meu chamado e me auxiliem a perturbar meu vizinho, não </w:t>
+      </w:r>
+      <w:r>
+        <w:rPr>
+          <w:rFonts w:eastAsia="Noto Serif CJK SC" w:cs="Noto Sans Devanagari" w:ascii="Garamond" w:hAnsi="Garamond"/>
+          <w:color w:val="00A0FC"/>
+          <w:kern w:val="2"/>
+          <w:sz w:val="36"/>
+          <w:szCs w:val="36"/>
+          <w:lang w:val="pt-BR" w:eastAsia="zh-CN" w:bidi="hi-IN"/>
+        </w:rPr>
+        <w:t>vão fazer isso de graça</w:t>
+      </w:r>
+      <w:r>
+        <w:rPr>
+          <w:rFonts w:eastAsia="Noto Serif CJK SC" w:cs="Noto Sans Devanagari" w:ascii="Garamond" w:hAnsi="Garamond"/>
+          <w:color w:val="00A0FC"/>
+          <w:kern w:val="2"/>
+          <w:sz w:val="36"/>
+          <w:szCs w:val="36"/>
+          <w:lang w:val="pt-BR" w:eastAsia="zh-CN" w:bidi="hi-IN"/>
+        </w:rPr>
+        <w:t>. Eles exigirão que eu, de uma forma ou de outra, também os auxilie em seus propósitos igualmente maléficos;</w:t>
       </w:r>
     </w:p>
     <w:p>
@@ -925,7 +857,12 @@
         </w:rPr>
       </w:pPr>
       <w:r>
-        <w:rPr/>
+        <w:rPr>
+          <w:rFonts w:ascii="Garamond" w:hAnsi="Garamond"/>
+          <w:color w:val="00A0FC"/>
+          <w:sz w:val="36"/>
+          <w:szCs w:val="36"/>
+        </w:rPr>
       </w:r>
     </w:p>
     <w:p>
@@ -954,20 +891,822 @@
           <w:szCs w:val="36"/>
           <w:lang w:val="pt-BR" w:eastAsia="zh-CN" w:bidi="hi-IN"/>
         </w:rPr>
-        <w:t xml:space="preserve">Meu vizinho não está fadado a sofrer as consequências do mal que eu planejei para ele.  A Espiritualidade diz que, através de uma conjuração oposta, meu vizinho poderá anular o efeito do mal que planejei a ele. </w:t>
-      </w:r>
-    </w:p>
-    <w:p>
-      <w:pPr>
-        <w:pStyle w:val="Normal"/>
-        <w:bidi w:val="0"/>
-        <w:ind w:left="709" w:hanging="0"/>
-        <w:jc w:val="both"/>
-        <w:rPr>
-          <w:rFonts w:ascii="Garamond" w:hAnsi="Garamond"/>
-          <w:color w:val="00A0FC"/>
-          <w:sz w:val="36"/>
-          <w:szCs w:val="36"/>
+        <w:t xml:space="preserve">Meu vizinho não está fadado a sofrer as consequências do mal que eu planejei para ele.  A Espiritualidade diz que, através de uma conjuração oposta, meu vizinho poderá anular o efeito </w:t>
+      </w:r>
+      <w:r>
+        <w:rPr>
+          <w:rFonts w:eastAsia="Noto Serif CJK SC" w:cs="Noto Sans Devanagari" w:ascii="Garamond" w:hAnsi="Garamond"/>
+          <w:color w:val="00A0FC"/>
+          <w:kern w:val="2"/>
+          <w:sz w:val="36"/>
+          <w:szCs w:val="36"/>
+          <w:lang w:val="pt-BR" w:eastAsia="zh-CN" w:bidi="hi-IN"/>
+        </w:rPr>
+        <w:t>da minha ação</w:t>
+      </w:r>
+      <w:r>
+        <w:rPr>
+          <w:rFonts w:eastAsia="Noto Serif CJK SC" w:cs="Noto Sans Devanagari" w:ascii="Garamond" w:hAnsi="Garamond"/>
+          <w:color w:val="00A0FC"/>
+          <w:kern w:val="2"/>
+          <w:sz w:val="36"/>
+          <w:szCs w:val="36"/>
+          <w:lang w:val="pt-BR" w:eastAsia="zh-CN" w:bidi="hi-IN"/>
+        </w:rPr>
+        <w:t xml:space="preserve">. </w:t>
+      </w:r>
+    </w:p>
+    <w:p>
+      <w:pPr>
+        <w:pStyle w:val="Normal"/>
+        <w:bidi w:val="0"/>
+        <w:ind w:left="709" w:hanging="0"/>
+        <w:jc w:val="both"/>
+        <w:rPr>
+          <w:rFonts w:ascii="Garamond" w:hAnsi="Garamond"/>
+          <w:color w:val="00A0FC"/>
+          <w:sz w:val="36"/>
+          <w:szCs w:val="36"/>
+        </w:rPr>
+      </w:pPr>
+      <w:r>
+        <w:rPr>
+          <w:rFonts w:ascii="Garamond" w:hAnsi="Garamond"/>
+          <w:color w:val="00A0FC"/>
+          <w:sz w:val="36"/>
+          <w:szCs w:val="36"/>
+        </w:rPr>
+      </w:r>
+    </w:p>
+    <w:p>
+      <w:pPr>
+        <w:pStyle w:val="Normal"/>
+        <w:bidi w:val="0"/>
+        <w:ind w:left="709" w:hanging="0"/>
+        <w:jc w:val="both"/>
+        <w:rPr>
+          <w:rFonts w:ascii="Garamond" w:hAnsi="Garamond"/>
+          <w:color w:val="00A0FC"/>
+          <w:sz w:val="36"/>
+          <w:szCs w:val="36"/>
+        </w:rPr>
+      </w:pPr>
+      <w:r>
+        <w:rPr>
+          <w:rFonts w:eastAsia="Noto Serif CJK SC" w:cs="Noto Sans Devanagari" w:ascii="Garamond" w:hAnsi="Garamond"/>
+          <w:color w:val="00A0FC"/>
+          <w:kern w:val="2"/>
+          <w:sz w:val="36"/>
+          <w:szCs w:val="36"/>
+          <w:lang w:val="pt-BR" w:eastAsia="zh-CN" w:bidi="hi-IN"/>
+        </w:rPr>
+        <w:t xml:space="preserve">Que conjuração oposta seria essa? Se eu chamei maus Espíritos para fazer o mal, meu vizinho poderá chamar os bons Espíritos para realizarem o bem. Dessa forma, ele não sofrerá as consequências </w:t>
+      </w:r>
+      <w:r>
+        <w:rPr>
+          <w:rFonts w:eastAsia="Noto Serif CJK SC" w:cs="Noto Sans Devanagari" w:ascii="Garamond" w:hAnsi="Garamond"/>
+          <w:color w:val="00A0FC"/>
+          <w:kern w:val="2"/>
+          <w:sz w:val="36"/>
+          <w:szCs w:val="36"/>
+          <w:lang w:val="pt-BR" w:eastAsia="zh-CN" w:bidi="hi-IN"/>
+        </w:rPr>
+        <w:t>do mal</w:t>
+      </w:r>
+      <w:r>
+        <w:rPr>
+          <w:rFonts w:eastAsia="Noto Serif CJK SC" w:cs="Noto Sans Devanagari" w:ascii="Garamond" w:hAnsi="Garamond"/>
+          <w:color w:val="00A0FC"/>
+          <w:kern w:val="2"/>
+          <w:sz w:val="36"/>
+          <w:szCs w:val="36"/>
+          <w:lang w:val="pt-BR" w:eastAsia="zh-CN" w:bidi="hi-IN"/>
+        </w:rPr>
+        <w:t xml:space="preserve"> que </w:t>
+      </w:r>
+      <w:r>
+        <w:rPr>
+          <w:rFonts w:eastAsia="Noto Serif CJK SC" w:cs="Noto Sans Devanagari" w:ascii="Garamond" w:hAnsi="Garamond"/>
+          <w:color w:val="00A0FC"/>
+          <w:kern w:val="2"/>
+          <w:sz w:val="36"/>
+          <w:szCs w:val="36"/>
+          <w:lang w:val="pt-BR" w:eastAsia="zh-CN" w:bidi="hi-IN"/>
+        </w:rPr>
+        <w:t>desejei</w:t>
+      </w:r>
+      <w:r>
+        <w:rPr>
+          <w:rFonts w:eastAsia="Noto Serif CJK SC" w:cs="Noto Sans Devanagari" w:ascii="Garamond" w:hAnsi="Garamond"/>
+          <w:color w:val="00A0FC"/>
+          <w:kern w:val="2"/>
+          <w:sz w:val="36"/>
+          <w:szCs w:val="36"/>
+          <w:lang w:val="pt-BR" w:eastAsia="zh-CN" w:bidi="hi-IN"/>
+        </w:rPr>
+        <w:t xml:space="preserve"> </w:t>
+      </w:r>
+      <w:r>
+        <w:rPr>
+          <w:rFonts w:eastAsia="Noto Serif CJK SC" w:cs="Noto Sans Devanagari" w:ascii="Garamond" w:hAnsi="Garamond"/>
+          <w:color w:val="00A0FC"/>
+          <w:kern w:val="2"/>
+          <w:sz w:val="36"/>
+          <w:szCs w:val="36"/>
+          <w:lang w:val="pt-BR" w:eastAsia="zh-CN" w:bidi="hi-IN"/>
+        </w:rPr>
+        <w:t xml:space="preserve">a </w:t>
+      </w:r>
+      <w:r>
+        <w:rPr>
+          <w:rFonts w:eastAsia="Noto Serif CJK SC" w:cs="Noto Sans Devanagari" w:ascii="Garamond" w:hAnsi="Garamond"/>
+          <w:color w:val="00A0FC"/>
+          <w:kern w:val="2"/>
+          <w:sz w:val="36"/>
+          <w:szCs w:val="36"/>
+          <w:lang w:val="pt-BR" w:eastAsia="zh-CN" w:bidi="hi-IN"/>
+        </w:rPr>
+        <w:t xml:space="preserve">ele. </w:t>
+      </w:r>
+    </w:p>
+    <w:p>
+      <w:pPr>
+        <w:pStyle w:val="Normal"/>
+        <w:bidi w:val="0"/>
+        <w:ind w:left="709" w:hanging="0"/>
+        <w:jc w:val="both"/>
+        <w:rPr>
+          <w:rFonts w:ascii="Garamond" w:hAnsi="Garamond"/>
+          <w:color w:val="00A0FC"/>
+          <w:sz w:val="36"/>
+          <w:szCs w:val="36"/>
+        </w:rPr>
+      </w:pPr>
+      <w:r>
+        <w:rPr>
+          <w:rFonts w:ascii="Garamond" w:hAnsi="Garamond"/>
+          <w:color w:val="00A0FC"/>
+          <w:sz w:val="36"/>
+          <w:szCs w:val="36"/>
+        </w:rPr>
+      </w:r>
+    </w:p>
+    <w:p>
+      <w:pPr>
+        <w:pStyle w:val="Normal"/>
+        <w:bidi w:val="0"/>
+        <w:ind w:left="709" w:hanging="0"/>
+        <w:jc w:val="both"/>
+        <w:rPr>
+          <w:rFonts w:ascii="Garamond" w:hAnsi="Garamond"/>
+          <w:color w:val="00A0FC"/>
+          <w:sz w:val="36"/>
+          <w:szCs w:val="36"/>
+        </w:rPr>
+      </w:pPr>
+      <w:r>
+        <w:rPr>
+          <w:rFonts w:eastAsia="Noto Serif CJK SC" w:cs="Noto Sans Devanagari" w:ascii="Garamond" w:hAnsi="Garamond"/>
+          <w:color w:val="00A0FC"/>
+          <w:kern w:val="2"/>
+          <w:sz w:val="36"/>
+          <w:szCs w:val="36"/>
+          <w:lang w:val="pt-BR" w:eastAsia="zh-CN" w:bidi="hi-IN"/>
+        </w:rPr>
+        <w:t>O Espiritismo nos ensina com muita clareza que a melhor defesa contra o mal é o bem. Através da prática do bem, conquistamos a simpatia dos bons Espíritos e eles podem nos proteger das investidas do mal contra nós.</w:t>
+      </w:r>
+    </w:p>
+    <w:p>
+      <w:pPr>
+        <w:pStyle w:val="Normal"/>
+        <w:bidi w:val="0"/>
+        <w:ind w:left="709" w:hanging="0"/>
+        <w:jc w:val="both"/>
+        <w:rPr>
+          <w:rFonts w:ascii="Garamond" w:hAnsi="Garamond"/>
+          <w:color w:val="00A0FC"/>
+          <w:sz w:val="36"/>
+          <w:szCs w:val="36"/>
+        </w:rPr>
+      </w:pPr>
+      <w:r>
+        <w:rPr>
+          <w:rFonts w:ascii="Garamond" w:hAnsi="Garamond"/>
+          <w:color w:val="00A0FC"/>
+          <w:sz w:val="36"/>
+          <w:szCs w:val="36"/>
+        </w:rPr>
+      </w:r>
+    </w:p>
+    <w:p>
+      <w:pPr>
+        <w:pStyle w:val="Normal"/>
+        <w:bidi w:val="0"/>
+        <w:ind w:left="709" w:hanging="0"/>
+        <w:jc w:val="both"/>
+        <w:rPr>
+          <w:rFonts w:ascii="Garamond" w:hAnsi="Garamond"/>
+          <w:color w:val="00A0FC"/>
+          <w:sz w:val="36"/>
+          <w:szCs w:val="36"/>
+        </w:rPr>
+      </w:pPr>
+      <w:r>
+        <w:rPr>
+          <w:rFonts w:eastAsia="Noto Serif CJK SC" w:cs="Noto Sans Devanagari" w:ascii="Garamond" w:hAnsi="Garamond"/>
+          <w:color w:val="00A0FC"/>
+          <w:kern w:val="2"/>
+          <w:sz w:val="36"/>
+          <w:szCs w:val="36"/>
+          <w:lang w:val="pt-BR" w:eastAsia="zh-CN" w:bidi="hi-IN"/>
+        </w:rPr>
+        <w:t xml:space="preserve">Não podemos nos esquecer também que a Justiça Divina tudo vê e tudo controla. Ninguém passa por aquilo que não merece </w:t>
+      </w:r>
+      <w:r>
+        <w:rPr>
+          <w:rFonts w:eastAsia="Noto Serif CJK SC" w:cs="Noto Sans Devanagari" w:ascii="Garamond" w:hAnsi="Garamond"/>
+          <w:color w:val="00A0FC"/>
+          <w:kern w:val="2"/>
+          <w:sz w:val="36"/>
+          <w:szCs w:val="36"/>
+          <w:lang w:val="pt-BR" w:eastAsia="zh-CN" w:bidi="hi-IN"/>
+        </w:rPr>
+        <w:t xml:space="preserve">ou precisa </w:t>
+      </w:r>
+      <w:r>
+        <w:rPr>
+          <w:rFonts w:eastAsia="Noto Serif CJK SC" w:cs="Noto Sans Devanagari" w:ascii="Garamond" w:hAnsi="Garamond"/>
+          <w:color w:val="00A0FC"/>
+          <w:kern w:val="2"/>
+          <w:sz w:val="36"/>
+          <w:szCs w:val="36"/>
+          <w:lang w:val="pt-BR" w:eastAsia="zh-CN" w:bidi="hi-IN"/>
+        </w:rPr>
+        <w:t xml:space="preserve">passar. Portanto, não adianta eu desejar o mal ao meu vizinho se </w:t>
+      </w:r>
+      <w:r>
+        <w:rPr>
+          <w:rFonts w:eastAsia="Noto Serif CJK SC" w:cs="Noto Sans Devanagari" w:ascii="Garamond" w:hAnsi="Garamond"/>
+          <w:color w:val="00A0FC"/>
+          <w:kern w:val="2"/>
+          <w:sz w:val="36"/>
+          <w:szCs w:val="36"/>
+          <w:lang w:val="pt-BR" w:eastAsia="zh-CN" w:bidi="hi-IN"/>
+        </w:rPr>
+        <w:t xml:space="preserve">não está nos desígnios de </w:t>
+      </w:r>
+      <w:r>
+        <w:rPr>
+          <w:rFonts w:eastAsia="Noto Serif CJK SC" w:cs="Noto Sans Devanagari" w:ascii="Garamond" w:hAnsi="Garamond"/>
+          <w:color w:val="00A0FC"/>
+          <w:kern w:val="2"/>
+          <w:sz w:val="36"/>
+          <w:szCs w:val="36"/>
+          <w:lang w:val="pt-BR" w:eastAsia="zh-CN" w:bidi="hi-IN"/>
+        </w:rPr>
+        <w:t xml:space="preserve">Deus </w:t>
+      </w:r>
+      <w:r>
+        <w:rPr>
+          <w:rFonts w:eastAsia="Noto Serif CJK SC" w:cs="Noto Sans Devanagari" w:ascii="Garamond" w:hAnsi="Garamond"/>
+          <w:color w:val="00A0FC"/>
+          <w:kern w:val="2"/>
+          <w:sz w:val="36"/>
+          <w:szCs w:val="36"/>
+          <w:lang w:val="pt-BR" w:eastAsia="zh-CN" w:bidi="hi-IN"/>
+        </w:rPr>
+        <w:t>que ele passe por isso</w:t>
+      </w:r>
+      <w:r>
+        <w:rPr>
+          <w:rFonts w:eastAsia="Noto Serif CJK SC" w:cs="Noto Sans Devanagari" w:ascii="Garamond" w:hAnsi="Garamond"/>
+          <w:color w:val="00A0FC"/>
+          <w:kern w:val="2"/>
+          <w:sz w:val="36"/>
+          <w:szCs w:val="36"/>
+          <w:lang w:val="pt-BR" w:eastAsia="zh-CN" w:bidi="hi-IN"/>
+        </w:rPr>
+        <w:t>.</w:t>
+      </w:r>
+    </w:p>
+    <w:p>
+      <w:pPr>
+        <w:pStyle w:val="Normal"/>
+        <w:bidi w:val="0"/>
+        <w:ind w:left="709" w:hanging="0"/>
+        <w:jc w:val="both"/>
+        <w:rPr>
+          <w:rFonts w:ascii="Garamond" w:hAnsi="Garamond"/>
+          <w:color w:val="00A0FC"/>
+          <w:sz w:val="36"/>
+          <w:szCs w:val="36"/>
+        </w:rPr>
+      </w:pPr>
+      <w:r>
+        <w:rPr>
+          <w:rFonts w:ascii="Garamond" w:hAnsi="Garamond"/>
+          <w:color w:val="00A0FC"/>
+          <w:sz w:val="36"/>
+          <w:szCs w:val="36"/>
+        </w:rPr>
+      </w:r>
+    </w:p>
+    <w:p>
+      <w:pPr>
+        <w:pStyle w:val="Normal"/>
+        <w:bidi w:val="0"/>
+        <w:ind w:left="709" w:hanging="0"/>
+        <w:jc w:val="both"/>
+        <w:rPr>
+          <w:rFonts w:ascii="Garamond" w:hAnsi="Garamond"/>
+          <w:color w:val="00A0FC"/>
+          <w:sz w:val="36"/>
+          <w:szCs w:val="36"/>
+        </w:rPr>
+      </w:pPr>
+      <w:r>
+        <w:rPr>
+          <w:rFonts w:eastAsia="Noto Serif CJK SC" w:cs="Noto Sans Devanagari" w:ascii="Garamond" w:hAnsi="Garamond"/>
+          <w:color w:val="00A0FC"/>
+          <w:kern w:val="2"/>
+          <w:sz w:val="36"/>
+          <w:szCs w:val="36"/>
+          <w:lang w:val="pt-BR" w:eastAsia="zh-CN" w:bidi="hi-IN"/>
+        </w:rPr>
+        <w:t>A Espiritualidade conclui a resposta dizendo que o pacto que se estabelece é aquele da sintonia, das vibrações</w:t>
+      </w:r>
+      <w:r>
+        <w:rPr>
+          <w:rFonts w:eastAsia="Noto Serif CJK SC" w:cs="Noto Sans Devanagari" w:ascii="Garamond" w:hAnsi="Garamond"/>
+          <w:color w:val="00A0FC"/>
+          <w:kern w:val="2"/>
+          <w:sz w:val="36"/>
+          <w:szCs w:val="36"/>
+          <w:lang w:val="pt-BR" w:eastAsia="zh-CN" w:bidi="hi-IN"/>
+        </w:rPr>
+        <w:t>, dos desejos e pensamentos</w:t>
+      </w:r>
+      <w:r>
+        <w:rPr>
+          <w:rFonts w:eastAsia="Noto Serif CJK SC" w:cs="Noto Sans Devanagari" w:ascii="Garamond" w:hAnsi="Garamond"/>
+          <w:color w:val="00A0FC"/>
+          <w:kern w:val="2"/>
+          <w:sz w:val="36"/>
+          <w:szCs w:val="36"/>
+          <w:lang w:val="pt-BR" w:eastAsia="zh-CN" w:bidi="hi-IN"/>
+        </w:rPr>
+        <w:t xml:space="preserve"> inferiores. </w:t>
+      </w:r>
+    </w:p>
+    <w:p>
+      <w:pPr>
+        <w:pStyle w:val="Normal"/>
+        <w:bidi w:val="0"/>
+        <w:ind w:left="709" w:hanging="0"/>
+        <w:jc w:val="both"/>
+        <w:rPr>
+          <w:rFonts w:ascii="Garamond" w:hAnsi="Garamond"/>
+          <w:color w:val="00A0FC"/>
+          <w:sz w:val="36"/>
+          <w:szCs w:val="36"/>
+        </w:rPr>
+      </w:pPr>
+      <w:r>
+        <w:rPr>
+          <w:rFonts w:ascii="Garamond" w:hAnsi="Garamond"/>
+          <w:color w:val="00A0FC"/>
+          <w:sz w:val="36"/>
+          <w:szCs w:val="36"/>
+        </w:rPr>
+      </w:r>
+    </w:p>
+    <w:p>
+      <w:pPr>
+        <w:pStyle w:val="Normal"/>
+        <w:bidi w:val="0"/>
+        <w:ind w:left="709" w:hanging="0"/>
+        <w:jc w:val="both"/>
+        <w:rPr>
+          <w:rFonts w:ascii="Garamond" w:hAnsi="Garamond"/>
+          <w:color w:val="00A0FC"/>
+          <w:sz w:val="36"/>
+          <w:szCs w:val="36"/>
+        </w:rPr>
+      </w:pPr>
+      <w:r>
+        <w:rPr>
+          <w:rFonts w:eastAsia="Noto Serif CJK SC" w:cs="Noto Sans Devanagari" w:ascii="Garamond" w:hAnsi="Garamond"/>
+          <w:color w:val="00A0FC"/>
+          <w:kern w:val="2"/>
+          <w:sz w:val="36"/>
+          <w:szCs w:val="36"/>
+          <w:lang w:val="pt-BR" w:eastAsia="zh-CN" w:bidi="hi-IN"/>
+        </w:rPr>
+        <w:t xml:space="preserve">Na nota que Kardec adicionou à resposta da Espiritualidade, ele reafirma que os laços entre os homens e os maus Espíritos são estabelecidos pelos maus pensamentos e que o pacto, como conhecido popularmente, nada mais é que uma representação dessa vinculação </w:t>
+      </w:r>
+      <w:r>
+        <w:rPr>
+          <w:rFonts w:eastAsia="Noto Serif CJK SC" w:cs="Noto Sans Devanagari" w:ascii="Garamond" w:hAnsi="Garamond"/>
+          <w:color w:val="00A0FC"/>
+          <w:kern w:val="2"/>
+          <w:sz w:val="36"/>
+          <w:szCs w:val="36"/>
+          <w:lang w:val="pt-BR" w:eastAsia="zh-CN" w:bidi="hi-IN"/>
+        </w:rPr>
+        <w:t>que se cria através dos</w:t>
+      </w:r>
+      <w:r>
+        <w:rPr>
+          <w:rFonts w:eastAsia="Noto Serif CJK SC" w:cs="Noto Sans Devanagari" w:ascii="Garamond" w:hAnsi="Garamond"/>
+          <w:color w:val="00A0FC"/>
+          <w:kern w:val="2"/>
+          <w:sz w:val="36"/>
+          <w:szCs w:val="36"/>
+          <w:lang w:val="pt-BR" w:eastAsia="zh-CN" w:bidi="hi-IN"/>
+        </w:rPr>
+        <w:t xml:space="preserve"> maus pensamentos.</w:t>
+      </w:r>
+    </w:p>
+    <w:p>
+      <w:pPr>
+        <w:pStyle w:val="Normal"/>
+        <w:bidi w:val="0"/>
+        <w:ind w:left="709" w:hanging="0"/>
+        <w:jc w:val="both"/>
+        <w:rPr>
+          <w:rFonts w:ascii="Garamond" w:hAnsi="Garamond"/>
+          <w:color w:val="00A0FC"/>
+          <w:sz w:val="36"/>
+          <w:szCs w:val="36"/>
+        </w:rPr>
+      </w:pPr>
+      <w:r>
+        <w:rPr>
+          <w:rFonts w:ascii="Garamond" w:hAnsi="Garamond"/>
+          <w:color w:val="00A0FC"/>
+          <w:sz w:val="36"/>
+          <w:szCs w:val="36"/>
+        </w:rPr>
+      </w:r>
+    </w:p>
+    <w:p>
+      <w:pPr>
+        <w:pStyle w:val="Normal"/>
+        <w:bidi w:val="0"/>
+        <w:ind w:left="709" w:hanging="0"/>
+        <w:jc w:val="both"/>
+        <w:rPr>
+          <w:rFonts w:ascii="Garamond" w:hAnsi="Garamond"/>
+          <w:color w:val="00A0FC"/>
+          <w:sz w:val="36"/>
+          <w:szCs w:val="36"/>
+        </w:rPr>
+      </w:pPr>
+      <w:r>
+        <w:rPr>
+          <w:rFonts w:ascii="Garamond" w:hAnsi="Garamond"/>
+          <w:color w:val="00A0FC"/>
+          <w:sz w:val="36"/>
+          <w:szCs w:val="36"/>
+        </w:rPr>
+      </w:r>
+    </w:p>
+    <w:p>
+      <w:pPr>
+        <w:pStyle w:val="Normal"/>
+        <w:bidi w:val="0"/>
+        <w:jc w:val="both"/>
+        <w:rPr>
+          <w:rFonts w:ascii="Garamond" w:hAnsi="Garamond"/>
+          <w:sz w:val="36"/>
+          <w:szCs w:val="36"/>
+        </w:rPr>
+      </w:pPr>
+      <w:r>
+        <w:rPr>
+          <w:rFonts w:eastAsia="Noto Serif CJK SC" w:cs="Noto Sans Devanagari" w:ascii="Garamond" w:hAnsi="Garamond"/>
+          <w:color w:val="auto"/>
+          <w:kern w:val="2"/>
+          <w:sz w:val="36"/>
+          <w:szCs w:val="36"/>
+          <w:lang w:val="pt-BR" w:eastAsia="zh-CN" w:bidi="hi-IN"/>
+        </w:rPr>
+        <w:t>550</w:t>
+      </w:r>
+      <w:r>
+        <w:rPr>
+          <w:rFonts w:ascii="Garamond" w:hAnsi="Garamond"/>
+          <w:sz w:val="36"/>
+          <w:szCs w:val="36"/>
+        </w:rPr>
+        <w:t>. Qual o sentido das lendas fantásticas em que figuram indivíduos que teriam vendido suas almas a Satanás para obterem certos favores?</w:t>
+      </w:r>
+    </w:p>
+    <w:p>
+      <w:pPr>
+        <w:pStyle w:val="Normal"/>
+        <w:bidi w:val="0"/>
+        <w:jc w:val="both"/>
+        <w:rPr>
+          <w:rFonts w:ascii="Garamond" w:hAnsi="Garamond"/>
+          <w:sz w:val="36"/>
+          <w:szCs w:val="36"/>
+        </w:rPr>
+      </w:pPr>
+      <w:r>
+        <w:rPr>
+          <w:rFonts w:ascii="Garamond" w:hAnsi="Garamond"/>
+          <w:sz w:val="36"/>
+          <w:szCs w:val="36"/>
+        </w:rPr>
+      </w:r>
+    </w:p>
+    <w:p>
+      <w:pPr>
+        <w:pStyle w:val="Normal"/>
+        <w:bidi w:val="0"/>
+        <w:jc w:val="both"/>
+        <w:rPr>
+          <w:rFonts w:ascii="Garamond" w:hAnsi="Garamond"/>
+          <w:sz w:val="36"/>
+          <w:szCs w:val="36"/>
+        </w:rPr>
+      </w:pPr>
+      <w:r>
+        <w:rPr>
+          <w:rFonts w:ascii="Garamond" w:hAnsi="Garamond"/>
+          <w:i/>
+          <w:iCs/>
+          <w:sz w:val="36"/>
+          <w:szCs w:val="36"/>
+        </w:rPr>
+        <w:t>“</w:t>
+      </w:r>
+      <w:r>
+        <w:rPr>
+          <w:rFonts w:ascii="Garamond" w:hAnsi="Garamond"/>
+          <w:i/>
+          <w:iCs/>
+          <w:sz w:val="36"/>
+          <w:szCs w:val="36"/>
+        </w:rPr>
+        <w:t>Todas as fábulas encerram um ensinamento e um sentido moral. O vosso erro consiste em tomá-las ao pé da letra. Isso a que te referes é uma alegoria, que se pode explicar desta maneira: aquele que chama em seu auxílio os Espíritos, para deles obter riquezas, ou qualquer outro favor, rebela-se contra a Providência; renuncia à missão que recebeu e às provas que lhe cumpre suportar neste mundo. Sofrerá na vida futura as consequências desse ato. Não quer isto dizer que sua alma fique para sempre condenada à desgraça, mas, desde que, em lugar de se desprender da matéria, nela cada vez se enterra mais, não terá, no mundo dos Espíritos, a satisfação de que haja gozado na Terra, até que tenha resgatado a sua falta, por meio de novas provas, talvez maiores e mais penosas. Coloca-se, por amor dos gozos materiais, na dependência dos Espíritos impuros. Estabelece-se assim, tacitamente, entre estes e ele, o Espírito delinquente, um pacto que o leva à sua perda, mas que lhe será sempre fácil romper, se o quiser firmemente, granjeando a assistência dos bons Espíritos".</w:t>
+      </w:r>
+    </w:p>
+    <w:p>
+      <w:pPr>
+        <w:pStyle w:val="Normal"/>
+        <w:bidi w:val="0"/>
+        <w:jc w:val="both"/>
+        <w:rPr>
+          <w:rFonts w:ascii="Garamond" w:hAnsi="Garamond"/>
+          <w:sz w:val="36"/>
+          <w:szCs w:val="36"/>
+        </w:rPr>
+      </w:pPr>
+      <w:r>
+        <w:rPr>
+          <w:rFonts w:ascii="Garamond" w:hAnsi="Garamond"/>
+          <w:sz w:val="36"/>
+          <w:szCs w:val="36"/>
+        </w:rPr>
+      </w:r>
+    </w:p>
+    <w:p>
+      <w:pPr>
+        <w:pStyle w:val="Normal"/>
+        <w:bidi w:val="0"/>
+        <w:ind w:left="709" w:hanging="0"/>
+        <w:jc w:val="both"/>
+        <w:rPr>
+          <w:i w:val="false"/>
+          <w:i w:val="false"/>
+          <w:iCs w:val="false"/>
+        </w:rPr>
+      </w:pPr>
+      <w:r>
+        <w:rPr>
+          <w:i w:val="false"/>
+          <w:iCs w:val="false"/>
+        </w:rPr>
+      </w:r>
+    </w:p>
+    <w:p>
+      <w:pPr>
+        <w:pStyle w:val="Normal"/>
+        <w:bidi w:val="0"/>
+        <w:ind w:left="709" w:hanging="0"/>
+        <w:jc w:val="both"/>
+        <w:rPr>
+          <w:i w:val="false"/>
+          <w:i w:val="false"/>
+          <w:iCs w:val="false"/>
+        </w:rPr>
+      </w:pPr>
+      <w:r>
+        <w:rPr>
+          <w:rFonts w:eastAsia="Noto Serif CJK SC" w:cs="Noto Sans Devanagari" w:ascii="Garamond" w:hAnsi="Garamond"/>
+          <w:i w:val="false"/>
+          <w:iCs w:val="false"/>
+          <w:color w:val="00A0FC"/>
+          <w:kern w:val="2"/>
+          <w:sz w:val="36"/>
+          <w:szCs w:val="36"/>
+          <w:lang w:val="pt-BR" w:eastAsia="zh-CN" w:bidi="hi-IN"/>
+        </w:rPr>
+        <w:t xml:space="preserve">Em 1857 havia também uma crença de que algumas pessoas poderiam “vender a alma ao diabo” em troca de riqueza, poder, talento ou conhecimentos extraordinários. </w:t>
+      </w:r>
+    </w:p>
+    <w:p>
+      <w:pPr>
+        <w:pStyle w:val="Normal"/>
+        <w:bidi w:val="0"/>
+        <w:ind w:left="709" w:hanging="0"/>
+        <w:jc w:val="both"/>
+        <w:rPr>
+          <w:i w:val="false"/>
+          <w:i w:val="false"/>
+          <w:iCs w:val="false"/>
+        </w:rPr>
+      </w:pPr>
+      <w:r>
+        <w:rPr>
+          <w:i w:val="false"/>
+          <w:iCs w:val="false"/>
+        </w:rPr>
+      </w:r>
+    </w:p>
+    <w:p>
+      <w:pPr>
+        <w:pStyle w:val="Normal"/>
+        <w:bidi w:val="0"/>
+        <w:ind w:left="709" w:hanging="0"/>
+        <w:jc w:val="both"/>
+        <w:rPr>
+          <w:i w:val="false"/>
+          <w:i w:val="false"/>
+          <w:iCs w:val="false"/>
+        </w:rPr>
+      </w:pPr>
+      <w:r>
+        <w:rPr>
+          <w:rFonts w:eastAsia="Noto Serif CJK SC" w:cs="Noto Sans Devanagari" w:ascii="Garamond" w:hAnsi="Garamond"/>
+          <w:i w:val="false"/>
+          <w:iCs w:val="false"/>
+          <w:color w:val="00A0FC"/>
+          <w:kern w:val="2"/>
+          <w:sz w:val="36"/>
+          <w:szCs w:val="36"/>
+          <w:lang w:val="pt-BR" w:eastAsia="zh-CN" w:bidi="hi-IN"/>
+        </w:rPr>
+        <w:t>Essa ideia, herdada da tradição medieval e da demonologia cristã, fazia com que indivíduos muito bem-sucedidos ou dotados de aptidões incomuns fossem vistos com suspeita, como se suas capacidades tivessem origem sobrenatural e maléfica.</w:t>
+      </w:r>
+    </w:p>
+    <w:p>
+      <w:pPr>
+        <w:pStyle w:val="Normal"/>
+        <w:bidi w:val="0"/>
+        <w:ind w:left="709" w:hanging="0"/>
+        <w:jc w:val="both"/>
+        <w:rPr>
+          <w:i w:val="false"/>
+          <w:i w:val="false"/>
+          <w:iCs w:val="false"/>
+        </w:rPr>
+      </w:pPr>
+      <w:r>
+        <w:rPr>
+          <w:i w:val="false"/>
+          <w:iCs w:val="false"/>
+        </w:rPr>
+      </w:r>
+    </w:p>
+    <w:p>
+      <w:pPr>
+        <w:pStyle w:val="Normal"/>
+        <w:bidi w:val="0"/>
+        <w:ind w:left="709" w:hanging="0"/>
+        <w:jc w:val="both"/>
+        <w:rPr>
+          <w:i w:val="false"/>
+          <w:i w:val="false"/>
+          <w:iCs w:val="false"/>
+        </w:rPr>
+      </w:pPr>
+      <w:r>
+        <w:rPr>
+          <w:rFonts w:eastAsia="Noto Serif CJK SC" w:cs="Noto Sans Devanagari" w:ascii="Garamond" w:hAnsi="Garamond"/>
+          <w:i w:val="false"/>
+          <w:iCs w:val="false"/>
+          <w:color w:val="00A0FC"/>
+          <w:kern w:val="2"/>
+          <w:sz w:val="36"/>
+          <w:szCs w:val="36"/>
+          <w:lang w:val="pt-BR" w:eastAsia="zh-CN" w:bidi="hi-IN"/>
+        </w:rPr>
+        <w:t xml:space="preserve">Um exemplo marcante foi o do violinista Niccolò Paganini. Seu virtuosismo era tão extraordinário para os padrões da época que muitas pessoas buscavam explicações sobrenaturais para sua habilidade. </w:t>
+      </w:r>
+    </w:p>
+    <w:p>
+      <w:pPr>
+        <w:pStyle w:val="Normal"/>
+        <w:bidi w:val="0"/>
+        <w:ind w:left="709" w:hanging="0"/>
+        <w:jc w:val="both"/>
+        <w:rPr>
+          <w:i w:val="false"/>
+          <w:i w:val="false"/>
+          <w:iCs w:val="false"/>
+        </w:rPr>
+      </w:pPr>
+      <w:r>
+        <w:rPr>
+          <w:i w:val="false"/>
+          <w:iCs w:val="false"/>
+        </w:rPr>
+      </w:r>
+    </w:p>
+    <w:p>
+      <w:pPr>
+        <w:pStyle w:val="Normal"/>
+        <w:bidi w:val="0"/>
+        <w:ind w:left="709" w:hanging="0"/>
+        <w:jc w:val="both"/>
+        <w:rPr>
+          <w:i w:val="false"/>
+          <w:i w:val="false"/>
+          <w:iCs w:val="false"/>
+        </w:rPr>
+      </w:pPr>
+      <w:r>
+        <w:rPr>
+          <w:rFonts w:eastAsia="Noto Serif CJK SC" w:cs="Noto Sans Devanagari" w:ascii="Garamond" w:hAnsi="Garamond"/>
+          <w:i w:val="false"/>
+          <w:iCs w:val="false"/>
+          <w:color w:val="00A0FC"/>
+          <w:kern w:val="2"/>
+          <w:sz w:val="36"/>
+          <w:szCs w:val="36"/>
+          <w:lang w:val="pt-BR" w:eastAsia="zh-CN" w:bidi="hi-IN"/>
+        </w:rPr>
+        <w:t xml:space="preserve">No tempo de Paganini, as cordas dos violinos eram feitas com entranhas de animais. Entre as lendas populares acerca do violinista, dizia-se que ele teria feito um pacto com o demônio e até que utilizaria cordas feitas de entranhas humanas — especialmente de vítimas assassinadas ou de uma mulher amada. </w:t>
+      </w:r>
+    </w:p>
+    <w:p>
+      <w:pPr>
+        <w:pStyle w:val="Normal"/>
+        <w:bidi w:val="0"/>
+        <w:ind w:left="709" w:hanging="0"/>
+        <w:jc w:val="both"/>
+        <w:rPr>
+          <w:i w:val="false"/>
+          <w:i w:val="false"/>
+          <w:iCs w:val="false"/>
+        </w:rPr>
+      </w:pPr>
+      <w:r>
+        <w:rPr>
+          <w:i w:val="false"/>
+          <w:iCs w:val="false"/>
+        </w:rPr>
+      </w:r>
+    </w:p>
+    <w:p>
+      <w:pPr>
+        <w:pStyle w:val="Normal"/>
+        <w:bidi w:val="0"/>
+        <w:ind w:left="709" w:hanging="0"/>
+        <w:jc w:val="both"/>
+        <w:rPr>
+          <w:i w:val="false"/>
+          <w:i w:val="false"/>
+          <w:iCs w:val="false"/>
+        </w:rPr>
+      </w:pPr>
+      <w:r>
+        <w:rPr>
+          <w:rFonts w:eastAsia="Noto Serif CJK SC" w:cs="Noto Sans Devanagari" w:ascii="Garamond" w:hAnsi="Garamond"/>
+          <w:i w:val="false"/>
+          <w:iCs w:val="false"/>
+          <w:color w:val="00A0FC"/>
+          <w:kern w:val="2"/>
+          <w:sz w:val="36"/>
+          <w:szCs w:val="36"/>
+          <w:lang w:val="pt-BR" w:eastAsia="zh-CN" w:bidi="hi-IN"/>
+        </w:rPr>
+        <w:t>O que Kardec pergunta à Espiritualidade nessa questão é se há algo de verídico nessa crença.</w:t>
+      </w:r>
+    </w:p>
+    <w:p>
+      <w:pPr>
+        <w:pStyle w:val="Normal"/>
+        <w:bidi w:val="0"/>
+        <w:ind w:left="709" w:hanging="0"/>
+        <w:jc w:val="both"/>
+        <w:rPr>
+          <w:i w:val="false"/>
+          <w:i w:val="false"/>
+          <w:iCs w:val="false"/>
         </w:rPr>
       </w:pPr>
       <w:r>
@@ -981,35 +1720,35 @@
         <w:ind w:left="709" w:hanging="0"/>
         <w:jc w:val="both"/>
         <w:rPr>
-          <w:rFonts w:ascii="Garamond" w:hAnsi="Garamond"/>
-          <w:color w:val="00A0FC"/>
-          <w:sz w:val="36"/>
-          <w:szCs w:val="36"/>
-        </w:rPr>
-      </w:pPr>
-      <w:r>
-        <w:rPr>
-          <w:rFonts w:eastAsia="Noto Serif CJK SC" w:cs="Noto Sans Devanagari" w:ascii="Garamond" w:hAnsi="Garamond"/>
-          <w:color w:val="00A0FC"/>
-          <w:kern w:val="2"/>
-          <w:sz w:val="36"/>
-          <w:szCs w:val="36"/>
-          <w:lang w:val="pt-BR" w:eastAsia="zh-CN" w:bidi="hi-IN"/>
-        </w:rPr>
-        <w:t xml:space="preserve">Que conjuração oposta seria essa? Se eu chamei maus Espíritos para fazer o mal, meu vizinho poderá chamar os bons Espíritos para realizarem o bem. Dessa forma, ele não sofrerá as consequências daquilo que planejei para ele. </w:t>
-      </w:r>
-    </w:p>
-    <w:p>
-      <w:pPr>
-        <w:pStyle w:val="Normal"/>
-        <w:bidi w:val="0"/>
-        <w:ind w:left="709" w:hanging="0"/>
-        <w:jc w:val="both"/>
-        <w:rPr>
-          <w:rFonts w:ascii="Garamond" w:hAnsi="Garamond"/>
-          <w:color w:val="00A0FC"/>
-          <w:sz w:val="36"/>
-          <w:szCs w:val="36"/>
+          <w:i w:val="false"/>
+          <w:i w:val="false"/>
+          <w:iCs w:val="false"/>
+        </w:rPr>
+      </w:pPr>
+      <w:r>
+        <w:rPr>
+          <w:rFonts w:eastAsia="Noto Serif CJK SC" w:cs="Noto Sans Devanagari" w:ascii="Garamond" w:hAnsi="Garamond"/>
+          <w:i w:val="false"/>
+          <w:iCs w:val="false"/>
+          <w:color w:val="00A0FC"/>
+          <w:kern w:val="2"/>
+          <w:sz w:val="36"/>
+          <w:szCs w:val="36"/>
+          <w:lang w:val="pt-BR" w:eastAsia="zh-CN" w:bidi="hi-IN"/>
+        </w:rPr>
+        <w:t>A Espiritualidade diz que todas as fábulas trazem consigo um ensinamento e um sentido moral, mas é um erro de nossa parte, interpretar essas fábulas em sentido literal. O que temos que fazer é interpretar a fábula e extrair o ensinamento que ela carrega.</w:t>
+      </w:r>
+    </w:p>
+    <w:p>
+      <w:pPr>
+        <w:pStyle w:val="Normal"/>
+        <w:bidi w:val="0"/>
+        <w:ind w:left="709" w:hanging="0"/>
+        <w:jc w:val="both"/>
+        <w:rPr>
+          <w:i w:val="false"/>
+          <w:i w:val="false"/>
+          <w:iCs w:val="false"/>
         </w:rPr>
       </w:pPr>
       <w:r>
@@ -1023,46 +1762,35 @@
         <w:ind w:left="709" w:hanging="0"/>
         <w:jc w:val="both"/>
         <w:rPr>
-          <w:rFonts w:ascii="Garamond" w:hAnsi="Garamond"/>
-          <w:color w:val="00A0FC"/>
-          <w:sz w:val="36"/>
-          <w:szCs w:val="36"/>
-        </w:rPr>
-      </w:pPr>
-      <w:r>
-        <w:rPr>
-          <w:rFonts w:eastAsia="Noto Serif CJK SC" w:cs="Noto Sans Devanagari" w:ascii="Garamond" w:hAnsi="Garamond"/>
-          <w:color w:val="00A0FC"/>
-          <w:kern w:val="2"/>
-          <w:sz w:val="36"/>
-          <w:szCs w:val="36"/>
-          <w:lang w:val="pt-BR" w:eastAsia="zh-CN" w:bidi="hi-IN"/>
-        </w:rPr>
-        <w:t xml:space="preserve">O Espiritismo nos ensina com muita clareza que a melhor defesa contra o mal é o bem. </w:t>
-      </w:r>
-      <w:r>
-        <w:rPr>
-          <w:rFonts w:eastAsia="Noto Serif CJK SC" w:cs="Noto Sans Devanagari" w:ascii="Garamond" w:hAnsi="Garamond"/>
-          <w:color w:val="00A0FC"/>
-          <w:kern w:val="2"/>
-          <w:sz w:val="36"/>
-          <w:szCs w:val="36"/>
-          <w:lang w:val="pt-BR" w:eastAsia="zh-CN" w:bidi="hi-IN"/>
-        </w:rPr>
-        <w:t>Através da prática do bem, conquistamos a simpatia dos bons Espíritos e eles podem nos proteger das investidas do mal contra nós.</w:t>
-      </w:r>
-    </w:p>
-    <w:p>
-      <w:pPr>
-        <w:pStyle w:val="Normal"/>
-        <w:bidi w:val="0"/>
-        <w:ind w:left="709" w:hanging="0"/>
-        <w:jc w:val="both"/>
-        <w:rPr>
-          <w:rFonts w:ascii="Garamond" w:hAnsi="Garamond"/>
-          <w:color w:val="00A0FC"/>
-          <w:sz w:val="36"/>
-          <w:szCs w:val="36"/>
+          <w:i w:val="false"/>
+          <w:i w:val="false"/>
+          <w:iCs w:val="false"/>
+        </w:rPr>
+      </w:pPr>
+      <w:r>
+        <w:rPr>
+          <w:rFonts w:eastAsia="Noto Serif CJK SC" w:cs="Noto Sans Devanagari" w:ascii="Garamond" w:hAnsi="Garamond"/>
+          <w:i w:val="false"/>
+          <w:iCs w:val="false"/>
+          <w:color w:val="00A0FC"/>
+          <w:kern w:val="2"/>
+          <w:sz w:val="36"/>
+          <w:szCs w:val="36"/>
+          <w:lang w:val="pt-BR" w:eastAsia="zh-CN" w:bidi="hi-IN"/>
+        </w:rPr>
+        <w:t xml:space="preserve">Diz ainda a Espiritualidade que a interpretação que devemos dar a essas lendas é a seguinte: toda pessoa que busca o auxílio de Espíritos para obter riqueza, fama e poder, está, na verdade, se rebelando contra a Providência Divina. </w:t>
+      </w:r>
+    </w:p>
+    <w:p>
+      <w:pPr>
+        <w:pStyle w:val="Normal"/>
+        <w:bidi w:val="0"/>
+        <w:ind w:left="709" w:hanging="0"/>
+        <w:jc w:val="both"/>
+        <w:rPr>
+          <w:i w:val="false"/>
+          <w:i w:val="false"/>
+          <w:iCs w:val="false"/>
         </w:rPr>
       </w:pPr>
       <w:r>
@@ -1076,57 +1804,35 @@
         <w:ind w:left="709" w:hanging="0"/>
         <w:jc w:val="both"/>
         <w:rPr>
-          <w:rFonts w:ascii="Garamond" w:hAnsi="Garamond"/>
-          <w:color w:val="00A0FC"/>
-          <w:sz w:val="36"/>
-          <w:szCs w:val="36"/>
-        </w:rPr>
-      </w:pPr>
-      <w:r>
-        <w:rPr>
-          <w:rFonts w:eastAsia="Noto Serif CJK SC" w:cs="Noto Sans Devanagari" w:ascii="Garamond" w:hAnsi="Garamond"/>
-          <w:color w:val="00A0FC"/>
-          <w:kern w:val="2"/>
-          <w:sz w:val="36"/>
-          <w:szCs w:val="36"/>
-          <w:lang w:val="pt-BR" w:eastAsia="zh-CN" w:bidi="hi-IN"/>
-        </w:rPr>
-        <w:t xml:space="preserve">Não podemos nos esquecer também que a Justiça Divina tudo vê e tudo controla. Ninguém passa por aquilo que não merece passar. Portanto, não adianta </w:t>
-      </w:r>
-      <w:r>
-        <w:rPr>
-          <w:rFonts w:eastAsia="Noto Serif CJK SC" w:cs="Noto Sans Devanagari" w:ascii="Garamond" w:hAnsi="Garamond"/>
-          <w:color w:val="00A0FC"/>
-          <w:kern w:val="2"/>
-          <w:sz w:val="36"/>
-          <w:szCs w:val="36"/>
-          <w:lang w:val="pt-BR" w:eastAsia="zh-CN" w:bidi="hi-IN"/>
-        </w:rPr>
-        <w:t>eu</w:t>
-      </w:r>
-      <w:r>
-        <w:rPr>
-          <w:rFonts w:eastAsia="Noto Serif CJK SC" w:cs="Noto Sans Devanagari" w:ascii="Garamond" w:hAnsi="Garamond"/>
-          <w:color w:val="00A0FC"/>
-          <w:kern w:val="2"/>
-          <w:sz w:val="36"/>
-          <w:szCs w:val="36"/>
-          <w:lang w:val="pt-BR" w:eastAsia="zh-CN" w:bidi="hi-IN"/>
-        </w:rPr>
-        <w:t xml:space="preserve"> desejar o mal ao meu vizinho se Deus entende que ele não precisa passar por aquilo que desejo a ele.</w:t>
-      </w:r>
-    </w:p>
-    <w:p>
-      <w:pPr>
-        <w:pStyle w:val="Normal"/>
-        <w:bidi w:val="0"/>
-        <w:ind w:left="709" w:hanging="0"/>
-        <w:jc w:val="both"/>
-        <w:rPr>
-          <w:rFonts w:ascii="Garamond" w:hAnsi="Garamond"/>
-          <w:color w:val="00A0FC"/>
-          <w:sz w:val="36"/>
-          <w:szCs w:val="36"/>
+          <w:i w:val="false"/>
+          <w:i w:val="false"/>
+          <w:iCs w:val="false"/>
+        </w:rPr>
+      </w:pPr>
+      <w:r>
+        <w:rPr>
+          <w:rFonts w:eastAsia="Noto Serif CJK SC" w:cs="Noto Sans Devanagari" w:ascii="Garamond" w:hAnsi="Garamond"/>
+          <w:i w:val="false"/>
+          <w:iCs w:val="false"/>
+          <w:color w:val="00A0FC"/>
+          <w:kern w:val="2"/>
+          <w:sz w:val="36"/>
+          <w:szCs w:val="36"/>
+          <w:lang w:val="pt-BR" w:eastAsia="zh-CN" w:bidi="hi-IN"/>
+        </w:rPr>
+        <w:t>Por quê se rebelando? Porque a pessoa está tentando fugir daquilo que foi estabelecido para sua atual existência. Riqueza, fama, poder não eram condições previstas para a atual encarnação, muito provavelmente porque dificultariam a evolução da pessoa, mas ela não aceita essa condição.</w:t>
+      </w:r>
+    </w:p>
+    <w:p>
+      <w:pPr>
+        <w:pStyle w:val="Normal"/>
+        <w:bidi w:val="0"/>
+        <w:ind w:left="709" w:hanging="0"/>
+        <w:jc w:val="both"/>
+        <w:rPr>
+          <w:i w:val="false"/>
+          <w:i w:val="false"/>
+          <w:iCs w:val="false"/>
         </w:rPr>
       </w:pPr>
       <w:r>
@@ -1140,93 +1846,35 @@
         <w:ind w:left="709" w:hanging="0"/>
         <w:jc w:val="both"/>
         <w:rPr>
-          <w:rFonts w:ascii="Garamond" w:hAnsi="Garamond"/>
-          <w:color w:val="00A0FC"/>
-          <w:sz w:val="36"/>
-          <w:szCs w:val="36"/>
-        </w:rPr>
-      </w:pPr>
-      <w:r>
-        <w:rPr>
-          <w:rFonts w:eastAsia="Noto Serif CJK SC" w:cs="Noto Sans Devanagari" w:ascii="Garamond" w:hAnsi="Garamond"/>
-          <w:color w:val="00A0FC"/>
-          <w:kern w:val="2"/>
-          <w:sz w:val="36"/>
-          <w:szCs w:val="36"/>
-          <w:lang w:val="pt-BR" w:eastAsia="zh-CN" w:bidi="hi-IN"/>
-        </w:rPr>
-        <w:t xml:space="preserve">A Espiritualidade conclui a resposta dizendo que o pacto que se estabelece é aquele da sintonia, das vibrações inferiores. </w:t>
-      </w:r>
-    </w:p>
-    <w:p>
-      <w:pPr>
-        <w:pStyle w:val="Normal"/>
-        <w:bidi w:val="0"/>
-        <w:ind w:left="709" w:hanging="0"/>
-        <w:jc w:val="both"/>
-        <w:rPr>
-          <w:rFonts w:ascii="Garamond" w:hAnsi="Garamond"/>
-          <w:color w:val="00A0FC"/>
-          <w:sz w:val="36"/>
-          <w:szCs w:val="36"/>
-        </w:rPr>
-      </w:pPr>
-      <w:r>
-        <w:rPr>
-          <w:rFonts w:ascii="Garamond" w:hAnsi="Garamond"/>
-          <w:color w:val="00A0FC"/>
-          <w:sz w:val="36"/>
-          <w:szCs w:val="36"/>
-        </w:rPr>
-      </w:r>
-    </w:p>
-    <w:p>
-      <w:pPr>
-        <w:pStyle w:val="Normal"/>
-        <w:bidi w:val="0"/>
-        <w:ind w:left="709" w:hanging="0"/>
-        <w:jc w:val="both"/>
-        <w:rPr>
-          <w:rFonts w:ascii="Garamond" w:hAnsi="Garamond"/>
-          <w:color w:val="00A0FC"/>
-          <w:sz w:val="36"/>
-          <w:szCs w:val="36"/>
-        </w:rPr>
-      </w:pPr>
-      <w:r>
-        <w:rPr>
-          <w:rFonts w:eastAsia="Noto Serif CJK SC" w:cs="Noto Sans Devanagari" w:ascii="Garamond" w:hAnsi="Garamond"/>
-          <w:color w:val="00A0FC"/>
-          <w:kern w:val="2"/>
-          <w:sz w:val="36"/>
-          <w:szCs w:val="36"/>
-          <w:lang w:val="pt-BR" w:eastAsia="zh-CN" w:bidi="hi-IN"/>
-        </w:rPr>
-        <w:t xml:space="preserve">Na nota que Kardec adicionou à resposta da Espiritualidade, ele reafirma que os laços entre os homens e os maus Espíritos são estabelecidos pelos maus pensamentos </w:t>
-      </w:r>
-      <w:r>
-        <w:rPr>
-          <w:rFonts w:eastAsia="Noto Serif CJK SC" w:cs="Noto Sans Devanagari" w:ascii="Garamond" w:hAnsi="Garamond"/>
-          <w:color w:val="00A0FC"/>
-          <w:kern w:val="2"/>
-          <w:sz w:val="36"/>
-          <w:szCs w:val="36"/>
-          <w:lang w:val="pt-BR" w:eastAsia="zh-CN" w:bidi="hi-IN"/>
-        </w:rPr>
-        <w:t>e que o pacto, como conhecido popularmente, nada mais é que uma representação dessa vinculação pelos maus pensamentos.</w:t>
-      </w:r>
-    </w:p>
-    <w:p>
-      <w:pPr>
-        <w:pStyle w:val="Normal"/>
-        <w:bidi w:val="0"/>
-        <w:ind w:left="709" w:hanging="0"/>
-        <w:jc w:val="both"/>
-        <w:rPr>
-          <w:rFonts w:ascii="Garamond" w:hAnsi="Garamond"/>
-          <w:color w:val="00A0FC"/>
-          <w:sz w:val="36"/>
-          <w:szCs w:val="36"/>
+          <w:i w:val="false"/>
+          <w:i w:val="false"/>
+          <w:iCs w:val="false"/>
+        </w:rPr>
+      </w:pPr>
+      <w:r>
+        <w:rPr>
+          <w:rFonts w:eastAsia="Noto Serif CJK SC" w:cs="Noto Sans Devanagari" w:ascii="Garamond" w:hAnsi="Garamond"/>
+          <w:i w:val="false"/>
+          <w:iCs w:val="false"/>
+          <w:color w:val="00A0FC"/>
+          <w:kern w:val="2"/>
+          <w:sz w:val="36"/>
+          <w:szCs w:val="36"/>
+          <w:lang w:val="pt-BR" w:eastAsia="zh-CN" w:bidi="hi-IN"/>
+        </w:rPr>
+        <w:t>Então ela recorre aos Espíritos inferiores - sim, inferiores, visto que Espíritos superiores não se ocupam com esse tipo de coisa - na ânsia de obter aquilo que não foi concedido a ela, digamos, por meios naturais.</w:t>
+      </w:r>
+    </w:p>
+    <w:p>
+      <w:pPr>
+        <w:pStyle w:val="Normal"/>
+        <w:bidi w:val="0"/>
+        <w:ind w:left="709" w:hanging="0"/>
+        <w:jc w:val="both"/>
+        <w:rPr>
+          <w:i w:val="false"/>
+          <w:i w:val="false"/>
+          <w:iCs w:val="false"/>
         </w:rPr>
       </w:pPr>
       <w:r>
@@ -1240,197 +1888,23 @@
         <w:ind w:left="709" w:hanging="0"/>
         <w:jc w:val="both"/>
         <w:rPr>
-          <w:rFonts w:ascii="Garamond" w:hAnsi="Garamond"/>
-          <w:color w:val="00A0FC"/>
-          <w:sz w:val="36"/>
-          <w:szCs w:val="36"/>
-        </w:rPr>
-      </w:pPr>
-      <w:r>
-        <w:rPr>
-          <w:rFonts w:ascii="Garamond" w:hAnsi="Garamond"/>
-          <w:color w:val="00A0FC"/>
-          <w:sz w:val="36"/>
-          <w:szCs w:val="36"/>
-        </w:rPr>
-      </w:r>
-    </w:p>
-    <w:p>
-      <w:pPr>
-        <w:pStyle w:val="Normal"/>
-        <w:bidi w:val="0"/>
-        <w:jc w:val="both"/>
-        <w:rPr>
-          <w:rFonts w:ascii="Garamond" w:hAnsi="Garamond"/>
-          <w:sz w:val="36"/>
-          <w:szCs w:val="36"/>
-        </w:rPr>
-      </w:pPr>
-      <w:r>
-        <w:rPr>
-          <w:rFonts w:eastAsia="Noto Serif CJK SC" w:cs="Noto Sans Devanagari" w:ascii="Garamond" w:hAnsi="Garamond"/>
-          <w:color w:val="auto"/>
-          <w:kern w:val="2"/>
-          <w:sz w:val="36"/>
-          <w:szCs w:val="36"/>
-          <w:lang w:val="pt-BR" w:eastAsia="zh-CN" w:bidi="hi-IN"/>
-        </w:rPr>
-        <w:t>5</w:t>
-      </w:r>
-      <w:r>
-        <w:rPr>
-          <w:rFonts w:eastAsia="Noto Serif CJK SC" w:cs="Noto Sans Devanagari" w:ascii="Garamond" w:hAnsi="Garamond"/>
-          <w:color w:val="auto"/>
-          <w:kern w:val="2"/>
-          <w:sz w:val="36"/>
-          <w:szCs w:val="36"/>
-          <w:lang w:val="pt-BR" w:eastAsia="zh-CN" w:bidi="hi-IN"/>
-        </w:rPr>
-        <w:t>50</w:t>
-      </w:r>
-      <w:r>
-        <w:rPr>
-          <w:rFonts w:ascii="Garamond" w:hAnsi="Garamond"/>
-          <w:sz w:val="36"/>
-          <w:szCs w:val="36"/>
-        </w:rPr>
-        <w:t>. Qual o sentido das lendas fantásticas em que figuram indivíduos que</w:t>
-      </w:r>
-      <w:r>
-        <w:rPr>
-          <w:rFonts w:ascii="Garamond" w:hAnsi="Garamond"/>
-          <w:sz w:val="36"/>
-          <w:szCs w:val="36"/>
-        </w:rPr>
-        <w:t xml:space="preserve"> </w:t>
-      </w:r>
-      <w:r>
-        <w:rPr>
-          <w:rFonts w:ascii="Garamond" w:hAnsi="Garamond"/>
-          <w:sz w:val="36"/>
-          <w:szCs w:val="36"/>
-        </w:rPr>
-        <w:t>teriam vendido suas almas a Satanás para obterem certos favores?</w:t>
-      </w:r>
-    </w:p>
-    <w:p>
-      <w:pPr>
-        <w:pStyle w:val="Normal"/>
-        <w:bidi w:val="0"/>
-        <w:jc w:val="both"/>
-        <w:rPr>
-          <w:rFonts w:ascii="Garamond" w:hAnsi="Garamond"/>
-          <w:sz w:val="36"/>
-          <w:szCs w:val="36"/>
-        </w:rPr>
-      </w:pPr>
-      <w:r>
-        <w:rPr>
-          <w:rFonts w:ascii="Garamond" w:hAnsi="Garamond"/>
-          <w:sz w:val="36"/>
-          <w:szCs w:val="36"/>
-        </w:rPr>
-      </w:r>
-    </w:p>
-    <w:p>
-      <w:pPr>
-        <w:pStyle w:val="Normal"/>
-        <w:bidi w:val="0"/>
-        <w:jc w:val="both"/>
-        <w:rPr>
-          <w:rFonts w:ascii="Garamond" w:hAnsi="Garamond"/>
-          <w:sz w:val="36"/>
-          <w:szCs w:val="36"/>
-        </w:rPr>
-      </w:pPr>
-      <w:r>
-        <w:rPr>
-          <w:rFonts w:ascii="Garamond" w:hAnsi="Garamond"/>
-          <w:i/>
-          <w:iCs/>
-          <w:sz w:val="36"/>
-          <w:szCs w:val="36"/>
-        </w:rPr>
-        <w:t>“</w:t>
-      </w:r>
-      <w:r>
-        <w:rPr>
-          <w:rFonts w:ascii="Garamond" w:hAnsi="Garamond"/>
-          <w:i/>
-          <w:iCs/>
-          <w:sz w:val="36"/>
-          <w:szCs w:val="36"/>
-        </w:rPr>
-        <w:t>Todas as fábulas encerram um ensinamento e um sentido moral. O vosso erro consiste em tomá-las ao pé da letra. Isso a que</w:t>
-      </w:r>
-      <w:r>
-        <w:rPr>
-          <w:rFonts w:ascii="Garamond" w:hAnsi="Garamond"/>
-          <w:i/>
-          <w:iCs/>
-          <w:sz w:val="36"/>
-          <w:szCs w:val="36"/>
-        </w:rPr>
-        <w:t xml:space="preserve"> </w:t>
-      </w:r>
-      <w:r>
-        <w:rPr>
-          <w:rFonts w:ascii="Garamond" w:hAnsi="Garamond"/>
-          <w:i/>
-          <w:iCs/>
-          <w:sz w:val="36"/>
-          <w:szCs w:val="36"/>
-        </w:rPr>
-        <w:t>te referes é uma alegoria, que se pode explicar desta maneira:</w:t>
-      </w:r>
-      <w:r>
-        <w:rPr>
-          <w:rFonts w:ascii="Garamond" w:hAnsi="Garamond"/>
-          <w:i/>
-          <w:iCs/>
-          <w:sz w:val="36"/>
-          <w:szCs w:val="36"/>
-        </w:rPr>
-        <w:t xml:space="preserve"> </w:t>
-      </w:r>
-      <w:r>
-        <w:rPr>
-          <w:rFonts w:ascii="Garamond" w:hAnsi="Garamond"/>
-          <w:i/>
-          <w:iCs/>
-          <w:sz w:val="36"/>
-          <w:szCs w:val="36"/>
-        </w:rPr>
-        <w:t>aquele que chama em seu auxílio os Espíritos, para deles obter</w:t>
-      </w:r>
-      <w:r>
-        <w:rPr>
-          <w:rFonts w:ascii="Garamond" w:hAnsi="Garamond"/>
-          <w:i/>
-          <w:iCs/>
-          <w:sz w:val="36"/>
-          <w:szCs w:val="36"/>
-        </w:rPr>
-        <w:t xml:space="preserve"> riquezas, ou qualquer outro favor, rebela-se contra a Providência; renuncia à missão que recebeu e às provas que lhe cumpre suportar neste mundo. Sofrerá na vida futura as consequências desse ato. Não quer isto dizer que sua alma fique para sempre condenada à desgraça, mas, desde que, em lugar de se desprender da matéria, nela cada vez se enterra mais, não terá, no mundo dos Espíritos, a satisfação de que haja gozado na Terra, até que tenha resgatado a sua falta, por meio de novas provas, talvez maiores e mais penosas. Coloca-se, por amor dos gozos materiais, na dependência dos Espíritos impuros. Estabelece-se assim, tacitamente, entre estes e ele, o Espírito delinquente, um pacto que o leva à sua perda, mas que lhe será sempre fácil romper, se o quiser firmemente, granjeando a assistência dos bons Espíritos".</w:t>
-      </w:r>
-    </w:p>
-    <w:p>
-      <w:pPr>
-        <w:pStyle w:val="Normal"/>
-        <w:bidi w:val="0"/>
-        <w:jc w:val="both"/>
-        <w:rPr>
-          <w:rFonts w:ascii="Garamond" w:hAnsi="Garamond"/>
-          <w:sz w:val="36"/>
-          <w:szCs w:val="36"/>
-        </w:rPr>
-      </w:pPr>
-      <w:r>
-        <w:rPr>
-          <w:rFonts w:ascii="Garamond" w:hAnsi="Garamond"/>
-          <w:sz w:val="36"/>
-          <w:szCs w:val="36"/>
-        </w:rPr>
+          <w:i w:val="false"/>
+          <w:i w:val="false"/>
+          <w:iCs w:val="false"/>
+        </w:rPr>
+      </w:pPr>
+      <w:r>
+        <w:rPr>
+          <w:rFonts w:eastAsia="Noto Serif CJK SC" w:cs="Noto Sans Devanagari" w:ascii="Garamond" w:hAnsi="Garamond"/>
+          <w:i w:val="false"/>
+          <w:iCs w:val="false"/>
+          <w:color w:val="00A0FC"/>
+          <w:kern w:val="2"/>
+          <w:sz w:val="36"/>
+          <w:szCs w:val="36"/>
+          <w:lang w:val="pt-BR" w:eastAsia="zh-CN" w:bidi="hi-IN"/>
+        </w:rPr>
+        <w:t>Bom, alguém pode argumentar o seguinte: "Ah, mas tem muita gente que nasce pobre e fica rica, nasce anônima e alcança a fama, era uma pessoa comum e chega a uma condição de poder". Sim, de fato nós vemos isso acontecer com muita frequência, mas geralmente isso se dá através de acontecimentos na vida da pessoa.</w:t>
       </w:r>
     </w:p>
     <w:p>
@@ -1472,7 +1946,7 @@
           <w:szCs w:val="36"/>
           <w:lang w:val="pt-BR" w:eastAsia="zh-CN" w:bidi="hi-IN"/>
         </w:rPr>
-        <w:t xml:space="preserve">Em 1857 havia também uma crença de que algumas pessoas poderiam “vender a alma ao diabo” em troca de riqueza, poder, talento ou conhecimentos extraordinários. </w:t>
+        <w:t xml:space="preserve">Ela pode ficar rica ganhando na loteria ou empreendendo com sucesso. Pode manifestar um talento e se tornar famosa. Pode apresentar uma  inteligência incomum e chegar ao poder, mas todas essas coisas aconteceriam de modo mais ou menos natural ao longo da vida da pessoa. </w:t>
       </w:r>
     </w:p>
     <w:p>
@@ -1514,7 +1988,7 @@
           <w:szCs w:val="36"/>
           <w:lang w:val="pt-BR" w:eastAsia="zh-CN" w:bidi="hi-IN"/>
         </w:rPr>
-        <w:t>Essa ideia, herdada da tradição medieval e da demonologia cristã, fazia com que indivíduos muito bem-sucedidos ou dotados de aptidões incomuns fossem vistos com suspeita, como se suas capacidades tivessem origem sobrenatural e maléfica.</w:t>
+        <w:t>Aqui nós estamos falando de pessoas que não aceitam sua condição de vida e recorrem aos Espíritos para fugir dos caminhos naturais de suas existências.</w:t>
       </w:r>
     </w:p>
     <w:p>
@@ -1556,7 +2030,7 @@
           <w:szCs w:val="36"/>
           <w:lang w:val="pt-BR" w:eastAsia="zh-CN" w:bidi="hi-IN"/>
         </w:rPr>
-        <w:t xml:space="preserve">Um exemplo marcante foi o do violinista Niccolò Paganini. Seu virtuosismo era tão extraordinário para os padrões da época que muitas pessoas buscavam explicações sobrenaturais para sua habilidade. </w:t>
+        <w:t xml:space="preserve">Por isso a Espiritualidade diz que é um ato de rebeldia contra a Providência Divina, ato esse que terá consequências na vida futura. </w:t>
       </w:r>
     </w:p>
     <w:p>
@@ -1598,7 +2072,7 @@
           <w:szCs w:val="36"/>
           <w:lang w:val="pt-BR" w:eastAsia="zh-CN" w:bidi="hi-IN"/>
         </w:rPr>
-        <w:t xml:space="preserve">No tempo de Paganini, as cordas dos violinos eram feitas com entranhas de animais. Entre as lendas populares acerca do violinista, dizia-se que ele teria feito um pacto com o demônio e até que utilizaria cordas feitas de entranhas humanas — especialmente de vítimas assassinadas ou de uma mulher amada. </w:t>
+        <w:t>Mas a Espiritualidade diz também que essas consequências infelizes não durarão para sempre. A ideia de "vender a alma ao diabo" pressupõe o sofrimento eterno. Entretanto, uma vez que aquele que obteve os gozos terrestres em uma existência, valendo-se do auxílio de Espíritos inferiores, vença, em uma nova existência, as provas resultantes de sua escolha infeliz, os antigos laços estarão rompidos e o sofrimento se encerra.</w:t>
       </w:r>
     </w:p>
     <w:p>
@@ -1640,1404 +2114,7 @@
           <w:szCs w:val="36"/>
           <w:lang w:val="pt-BR" w:eastAsia="zh-CN" w:bidi="hi-IN"/>
         </w:rPr>
-        <w:t>O que Kardec pergunta à Espiritualidade nessa questão é se há algo de verídico nessa crença.</w:t>
-      </w:r>
-    </w:p>
-    <w:p>
-      <w:pPr>
-        <w:pStyle w:val="Normal"/>
-        <w:bidi w:val="0"/>
-        <w:ind w:left="709" w:hanging="0"/>
-        <w:jc w:val="both"/>
-        <w:rPr>
-          <w:i w:val="false"/>
-          <w:i w:val="false"/>
-          <w:iCs w:val="false"/>
-        </w:rPr>
-      </w:pPr>
-      <w:r>
-        <w:rPr/>
-      </w:r>
-    </w:p>
-    <w:p>
-      <w:pPr>
-        <w:pStyle w:val="Normal"/>
-        <w:bidi w:val="0"/>
-        <w:ind w:left="709" w:hanging="0"/>
-        <w:jc w:val="both"/>
-        <w:rPr>
-          <w:i w:val="false"/>
-          <w:i w:val="false"/>
-          <w:iCs w:val="false"/>
-        </w:rPr>
-      </w:pPr>
-      <w:r>
-        <w:rPr>
-          <w:rFonts w:eastAsia="Noto Serif CJK SC" w:cs="Noto Sans Devanagari" w:ascii="Garamond" w:hAnsi="Garamond"/>
-          <w:i w:val="false"/>
-          <w:iCs w:val="false"/>
-          <w:color w:val="00A0FC"/>
-          <w:kern w:val="2"/>
-          <w:sz w:val="36"/>
-          <w:szCs w:val="36"/>
-          <w:lang w:val="pt-BR" w:eastAsia="zh-CN" w:bidi="hi-IN"/>
-        </w:rPr>
-        <w:t>[ Colocar aqui o comentário sobre a resposta da Espiritualidade ].Foi nesse contexto cultural que Allan Kardec rejeitou a ideia de pactos literais com Espíritos maus, explicando que as aptidões humanas e as influências espirituais decorrem de leis naturais e do grau de adiantamento moral e intelectual dos Espíritos, e não de concessões demoníacas.</w:t>
-      </w:r>
-      <w:r>
-        <w:rPr>
-          <w:rFonts w:eastAsia="Noto Serif CJK SC" w:cs="Noto Sans Devanagari" w:ascii="Garamond" w:hAnsi="Garamond"/>
-          <w:i w:val="false"/>
-          <w:iCs w:val="false"/>
-          <w:color w:val="00A0FC"/>
-          <w:kern w:val="2"/>
-          <w:sz w:val="36"/>
-          <w:szCs w:val="36"/>
-          <w:lang w:val="pt-BR" w:eastAsia="zh-CN" w:bidi="hi-IN"/>
-        </w:rPr>
-        <w:t>na crença ntes de adentramos na questão</w:t>
-      </w:r>
-      <w:r>
-        <w:rPr>
-          <w:rFonts w:eastAsia="Noto Serif CJK SC" w:cs="Noto Sans Devanagari" w:ascii="Garamond" w:hAnsi="Garamond"/>
-          <w:i w:val="false"/>
-          <w:iCs w:val="false"/>
-          <w:color w:val="00A0FC"/>
-          <w:kern w:val="2"/>
-          <w:sz w:val="36"/>
-          <w:szCs w:val="36"/>
-          <w:lang w:val="pt-BR" w:eastAsia="zh-CN" w:bidi="hi-IN"/>
-        </w:rPr>
-        <w:t>astante interessante a pergunta de Kardec. Os pressentimentos — sejam eles conselhos dos Espíritos amigos ou lembranças gravadas em nosso íntimo — surgem para nós muito mais na forma de intuições do que de certezas daquilo que está por vir. Portanto, é natural que tenhamos dúvidas acerca dos pressentimentos. Podemos sentir medo e insegurança. Kardec pergunta: como proceder em momentos assim?</w:t>
-      </w:r>
-    </w:p>
-    <w:p>
-      <w:pPr>
-        <w:pStyle w:val="Normal"/>
-        <w:bidi w:val="0"/>
-        <w:ind w:left="709" w:hanging="0"/>
-        <w:jc w:val="both"/>
-        <w:rPr>
-          <w:i w:val="false"/>
-          <w:i w:val="false"/>
-          <w:iCs w:val="false"/>
-        </w:rPr>
-      </w:pPr>
-      <w:r>
-        <w:rPr>
-          <w:i w:val="false"/>
-          <w:iCs w:val="false"/>
-        </w:rPr>
-      </w:r>
-    </w:p>
-    <w:p>
-      <w:pPr>
-        <w:pStyle w:val="Normal"/>
-        <w:bidi w:val="0"/>
-        <w:ind w:left="709" w:hanging="0"/>
-        <w:jc w:val="both"/>
-        <w:rPr>
-          <w:i w:val="false"/>
-          <w:i w:val="false"/>
-          <w:iCs w:val="false"/>
-        </w:rPr>
-      </w:pPr>
-      <w:r>
-        <w:rPr>
-          <w:rFonts w:eastAsia="Noto Serif CJK SC" w:cs="Noto Sans Devanagari" w:ascii="Garamond" w:hAnsi="Garamond"/>
-          <w:i w:val="false"/>
-          <w:iCs w:val="false"/>
-          <w:color w:val="00A0FC"/>
-          <w:kern w:val="2"/>
-          <w:sz w:val="36"/>
-          <w:szCs w:val="36"/>
-          <w:lang w:val="pt-BR" w:eastAsia="zh-CN" w:bidi="hi-IN"/>
-        </w:rPr>
-        <w:t>A Espiritualidade diz que, quando nos encontramos nessa situação, devemos solicitar o amparo do nosso anjo de guarda ou orar a Deus pedindo orientação, pois Ele enviará um de Seus mensageiros para nos auxiliar.</w:t>
-      </w:r>
-    </w:p>
-    <w:p>
-      <w:pPr>
-        <w:pStyle w:val="Normal"/>
-        <w:bidi w:val="0"/>
-        <w:ind w:left="709" w:hanging="0"/>
-        <w:jc w:val="both"/>
-        <w:rPr>
-          <w:i w:val="false"/>
-          <w:i w:val="false"/>
-          <w:iCs w:val="false"/>
-        </w:rPr>
-      </w:pPr>
-      <w:r>
-        <w:rPr>
-          <w:i w:val="false"/>
-          <w:iCs w:val="false"/>
-        </w:rPr>
-      </w:r>
-    </w:p>
-    <w:p>
-      <w:pPr>
-        <w:pStyle w:val="Normal"/>
-        <w:bidi w:val="0"/>
-        <w:ind w:left="709" w:hanging="0"/>
-        <w:jc w:val="both"/>
-        <w:rPr>
-          <w:i w:val="false"/>
-          <w:i w:val="false"/>
-          <w:iCs w:val="false"/>
-        </w:rPr>
-      </w:pPr>
-      <w:r>
-        <w:rPr>
-          <w:rFonts w:eastAsia="Noto Serif CJK SC" w:cs="Noto Sans Devanagari" w:ascii="Garamond" w:hAnsi="Garamond"/>
-          <w:i w:val="false"/>
-          <w:iCs w:val="false"/>
-          <w:color w:val="00A0FC"/>
-          <w:kern w:val="2"/>
-          <w:sz w:val="36"/>
-          <w:szCs w:val="36"/>
-          <w:lang w:val="pt-BR" w:eastAsia="zh-CN" w:bidi="hi-IN"/>
-        </w:rPr>
-        <w:t>Vamos imaginar duas situações distintas.</w:t>
-      </w:r>
-    </w:p>
-    <w:p>
-      <w:pPr>
-        <w:pStyle w:val="Normal"/>
-        <w:bidi w:val="0"/>
-        <w:ind w:left="709" w:hanging="0"/>
-        <w:jc w:val="both"/>
-        <w:rPr>
-          <w:i w:val="false"/>
-          <w:i w:val="false"/>
-          <w:iCs w:val="false"/>
-        </w:rPr>
-      </w:pPr>
-      <w:r>
-        <w:rPr>
-          <w:i w:val="false"/>
-          <w:iCs w:val="false"/>
-        </w:rPr>
-      </w:r>
-    </w:p>
-    <w:p>
-      <w:pPr>
-        <w:pStyle w:val="Normal"/>
-        <w:bidi w:val="0"/>
-        <w:ind w:left="709" w:hanging="0"/>
-        <w:jc w:val="both"/>
-        <w:rPr>
-          <w:i w:val="false"/>
-          <w:i w:val="false"/>
-          <w:iCs w:val="false"/>
-        </w:rPr>
-      </w:pPr>
-      <w:r>
-        <w:rPr>
-          <w:rFonts w:eastAsia="Noto Serif CJK SC" w:cs="Noto Sans Devanagari" w:ascii="Garamond" w:hAnsi="Garamond"/>
-          <w:i w:val="false"/>
-          <w:iCs w:val="false"/>
-          <w:color w:val="00A0FC"/>
-          <w:kern w:val="2"/>
-          <w:sz w:val="36"/>
-          <w:szCs w:val="36"/>
-          <w:lang w:val="pt-BR" w:eastAsia="zh-CN" w:bidi="hi-IN"/>
-        </w:rPr>
-        <w:t>Digamos que estou fazendo uma viagem que já fiz várias vezes. Em determinado ponto da estrada, posso seguir pelo caminho A ou pelo caminho B. Geralmente, vou pelo caminho B, porque o asfalto é melhor e a estrada é melhor sinalizada, etc. Entretanto, naquele dia específico, meu anjo de guarda prevê — por razões que só ele e Deus conhecem — que, se eu tomar o caminho B, como de costume, há chances de eu me envolver em um acidente. Então, ele me sugere que eu vá pelo caminho A.</w:t>
-      </w:r>
-    </w:p>
-    <w:p>
-      <w:pPr>
-        <w:pStyle w:val="Normal"/>
-        <w:bidi w:val="0"/>
-        <w:ind w:left="709" w:hanging="0"/>
-        <w:jc w:val="both"/>
-        <w:rPr>
-          <w:i w:val="false"/>
-          <w:i w:val="false"/>
-          <w:iCs w:val="false"/>
-        </w:rPr>
-      </w:pPr>
-      <w:r>
-        <w:rPr>
-          <w:i w:val="false"/>
-          <w:iCs w:val="false"/>
-        </w:rPr>
-      </w:r>
-    </w:p>
-    <w:p>
-      <w:pPr>
-        <w:pStyle w:val="Normal"/>
-        <w:bidi w:val="0"/>
-        <w:ind w:left="709" w:hanging="0"/>
-        <w:jc w:val="both"/>
-        <w:rPr>
-          <w:i w:val="false"/>
-          <w:i w:val="false"/>
-          <w:iCs w:val="false"/>
-        </w:rPr>
-      </w:pPr>
-      <w:r>
-        <w:rPr>
-          <w:rFonts w:eastAsia="Noto Serif CJK SC" w:cs="Noto Sans Devanagari" w:ascii="Garamond" w:hAnsi="Garamond"/>
-          <w:i w:val="false"/>
-          <w:iCs w:val="false"/>
-          <w:color w:val="00A0FC"/>
-          <w:kern w:val="2"/>
-          <w:sz w:val="36"/>
-          <w:szCs w:val="36"/>
-          <w:lang w:val="pt-BR" w:eastAsia="zh-CN" w:bidi="hi-IN"/>
-        </w:rPr>
-        <w:t>Quando eu receber essa sugestão, vou dizer a mim mesmo: “Estranho. Eu sempre vou pelo caminho B, mas hoje tem alguma coisa me dizendo para eu ir pelo caminho A”. Isso vai gerar dúvida em mim: “Será que é coisa da minha cabeça ou realmente eu não devo seguir pelo caminho B hoje?”.</w:t>
-      </w:r>
-    </w:p>
-    <w:p>
-      <w:pPr>
-        <w:pStyle w:val="Normal"/>
-        <w:bidi w:val="0"/>
-        <w:ind w:left="709" w:hanging="0"/>
-        <w:jc w:val="both"/>
-        <w:rPr>
-          <w:i w:val="false"/>
-          <w:i w:val="false"/>
-          <w:iCs w:val="false"/>
-        </w:rPr>
-      </w:pPr>
-      <w:r>
-        <w:rPr>
-          <w:i w:val="false"/>
-          <w:iCs w:val="false"/>
-        </w:rPr>
-      </w:r>
-    </w:p>
-    <w:p>
-      <w:pPr>
-        <w:pStyle w:val="Normal"/>
-        <w:bidi w:val="0"/>
-        <w:ind w:left="709" w:hanging="0"/>
-        <w:jc w:val="both"/>
-        <w:rPr>
-          <w:i w:val="false"/>
-          <w:i w:val="false"/>
-          <w:iCs w:val="false"/>
-        </w:rPr>
-      </w:pPr>
-      <w:r>
-        <w:rPr>
-          <w:rFonts w:eastAsia="Noto Serif CJK SC" w:cs="Noto Sans Devanagari" w:ascii="Garamond" w:hAnsi="Garamond"/>
-          <w:i w:val="false"/>
-          <w:iCs w:val="false"/>
-          <w:color w:val="00A0FC"/>
-          <w:kern w:val="2"/>
-          <w:sz w:val="36"/>
-          <w:szCs w:val="36"/>
-          <w:lang w:val="pt-BR" w:eastAsia="zh-CN" w:bidi="hi-IN"/>
-        </w:rPr>
-        <w:t>Se eu seguir a recomendação da Espiritualidade, vou direcionar um pensamento ao meu anjo de guarda e solicitar orientação. Isso vai criar uma sintonia maior entre nós, e ele poderá me transmitir, de forma clara, que eu não devo seguir pelo caminho B. Eu entendo o recado, sigo pelo caminho A e termino minha viagem sem quaisquer incidentes.</w:t>
-      </w:r>
-    </w:p>
-    <w:p>
-      <w:pPr>
-        <w:pStyle w:val="Normal"/>
-        <w:bidi w:val="0"/>
-        <w:ind w:left="709" w:hanging="0"/>
-        <w:jc w:val="both"/>
-        <w:rPr>
-          <w:i w:val="false"/>
-          <w:i w:val="false"/>
-          <w:iCs w:val="false"/>
-        </w:rPr>
-      </w:pPr>
-      <w:r>
-        <w:rPr>
-          <w:i w:val="false"/>
-          <w:iCs w:val="false"/>
-        </w:rPr>
-      </w:r>
-    </w:p>
-    <w:p>
-      <w:pPr>
-        <w:pStyle w:val="Normal"/>
-        <w:bidi w:val="0"/>
-        <w:ind w:left="709" w:hanging="0"/>
-        <w:jc w:val="both"/>
-        <w:rPr>
-          <w:i w:val="false"/>
-          <w:i w:val="false"/>
-          <w:iCs w:val="false"/>
-        </w:rPr>
-      </w:pPr>
-      <w:r>
-        <w:rPr>
-          <w:rFonts w:eastAsia="Noto Serif CJK SC" w:cs="Noto Sans Devanagari" w:ascii="Garamond" w:hAnsi="Garamond"/>
-          <w:i w:val="false"/>
-          <w:iCs w:val="false"/>
-          <w:color w:val="00A0FC"/>
-          <w:kern w:val="2"/>
-          <w:sz w:val="36"/>
-          <w:szCs w:val="36"/>
-          <w:lang w:val="pt-BR" w:eastAsia="zh-CN" w:bidi="hi-IN"/>
-        </w:rPr>
-        <w:t>Agora, a segunda situação: vamos imaginar que ficou estabelecido em meu plano reencarnatório que, quando eu completar 30 anos de idade, serei acometido por uma doença grave.</w:t>
-      </w:r>
-    </w:p>
-    <w:p>
-      <w:pPr>
-        <w:pStyle w:val="Normal"/>
-        <w:bidi w:val="0"/>
-        <w:ind w:left="709" w:hanging="0"/>
-        <w:jc w:val="both"/>
-        <w:rPr>
-          <w:i w:val="false"/>
-          <w:i w:val="false"/>
-          <w:iCs w:val="false"/>
-        </w:rPr>
-      </w:pPr>
-      <w:r>
-        <w:rPr>
-          <w:i w:val="false"/>
-          <w:iCs w:val="false"/>
-        </w:rPr>
-      </w:r>
-    </w:p>
-    <w:p>
-      <w:pPr>
-        <w:pStyle w:val="Normal"/>
-        <w:bidi w:val="0"/>
-        <w:ind w:left="709" w:hanging="0"/>
-        <w:jc w:val="both"/>
-        <w:rPr>
-          <w:i w:val="false"/>
-          <w:i w:val="false"/>
-          <w:iCs w:val="false"/>
-        </w:rPr>
-      </w:pPr>
-      <w:r>
-        <w:rPr>
-          <w:rFonts w:eastAsia="Noto Serif CJK SC" w:cs="Noto Sans Devanagari" w:ascii="Garamond" w:hAnsi="Garamond"/>
-          <w:i w:val="false"/>
-          <w:iCs w:val="false"/>
-          <w:color w:val="00A0FC"/>
-          <w:kern w:val="2"/>
-          <w:sz w:val="36"/>
-          <w:szCs w:val="36"/>
-          <w:lang w:val="pt-BR" w:eastAsia="zh-CN" w:bidi="hi-IN"/>
-        </w:rPr>
-        <w:t>Próximo de completar 30 anos, meu corpo começa a manifestar os sintomas da doença. Eu começo a ficar preocupado e, como trago na consciência a lembrança de que aquilo vai acontecer, também sinto medo, a tal ponto de não procurar um médico, com receio de que o diagnóstico se confirme.</w:t>
-      </w:r>
-    </w:p>
-    <w:p>
-      <w:pPr>
-        <w:pStyle w:val="Normal"/>
-        <w:bidi w:val="0"/>
-        <w:ind w:left="709" w:hanging="0"/>
-        <w:jc w:val="both"/>
-        <w:rPr>
-          <w:i w:val="false"/>
-          <w:i w:val="false"/>
-          <w:iCs w:val="false"/>
-        </w:rPr>
-      </w:pPr>
-      <w:r>
-        <w:rPr>
-          <w:i w:val="false"/>
-          <w:iCs w:val="false"/>
-        </w:rPr>
-      </w:r>
-    </w:p>
-    <w:p>
-      <w:pPr>
-        <w:pStyle w:val="Normal"/>
-        <w:bidi w:val="0"/>
-        <w:ind w:left="709" w:hanging="0"/>
-        <w:jc w:val="both"/>
-        <w:rPr>
-          <w:i w:val="false"/>
-          <w:i w:val="false"/>
-          <w:iCs w:val="false"/>
-        </w:rPr>
-      </w:pPr>
-      <w:r>
-        <w:rPr>
-          <w:rFonts w:eastAsia="Noto Serif CJK SC" w:cs="Noto Sans Devanagari" w:ascii="Garamond" w:hAnsi="Garamond"/>
-          <w:i w:val="false"/>
-          <w:iCs w:val="false"/>
-          <w:color w:val="00A0FC"/>
-          <w:kern w:val="2"/>
-          <w:sz w:val="36"/>
-          <w:szCs w:val="36"/>
-          <w:lang w:val="pt-BR" w:eastAsia="zh-CN" w:bidi="hi-IN"/>
-        </w:rPr>
-        <w:t>Novamente, se eu seguir a recomendação da Espiritualidade, vou orar a Deus e pedir orientação e amparo, recursos que certamente chegarão até mim.</w:t>
-      </w:r>
-    </w:p>
-    <w:p>
-      <w:pPr>
-        <w:pStyle w:val="Normal"/>
-        <w:bidi w:val="0"/>
-        <w:ind w:left="709" w:hanging="0"/>
-        <w:jc w:val="both"/>
-        <w:rPr>
-          <w:i w:val="false"/>
-          <w:i w:val="false"/>
-          <w:iCs w:val="false"/>
-        </w:rPr>
-      </w:pPr>
-      <w:r>
-        <w:rPr>
-          <w:i w:val="false"/>
-          <w:iCs w:val="false"/>
-        </w:rPr>
-      </w:r>
-    </w:p>
-    <w:p>
-      <w:pPr>
-        <w:pStyle w:val="Normal"/>
-        <w:bidi w:val="0"/>
-        <w:ind w:left="709" w:hanging="0"/>
-        <w:jc w:val="both"/>
-        <w:rPr>
-          <w:i w:val="false"/>
-          <w:i w:val="false"/>
-          <w:iCs w:val="false"/>
-        </w:rPr>
-      </w:pPr>
-      <w:r>
-        <w:rPr>
-          <w:rFonts w:eastAsia="Noto Serif CJK SC" w:cs="Noto Sans Devanagari" w:ascii="Garamond" w:hAnsi="Garamond"/>
-          <w:i w:val="false"/>
-          <w:iCs w:val="false"/>
-          <w:color w:val="00A0FC"/>
-          <w:kern w:val="2"/>
-          <w:sz w:val="36"/>
-          <w:szCs w:val="36"/>
-          <w:lang w:val="pt-BR" w:eastAsia="zh-CN" w:bidi="hi-IN"/>
-        </w:rPr>
-        <w:t>É importante enfatizar que, nesse caso, é pouco provável que Deus me conceda a cura, ainda que eu a peça. Afinal de contas, eu mesmo pedi para ter aquela doença ou, no mínimo, concordei com isso. A doença é necessária para meu crescimento e evolução.</w:t>
-      </w:r>
-    </w:p>
-    <w:p>
-      <w:pPr>
-        <w:pStyle w:val="Normal"/>
-        <w:bidi w:val="0"/>
-        <w:ind w:left="709" w:hanging="0"/>
-        <w:jc w:val="both"/>
-        <w:rPr>
-          <w:i w:val="false"/>
-          <w:i w:val="false"/>
-          <w:iCs w:val="false"/>
-        </w:rPr>
-      </w:pPr>
-      <w:r>
-        <w:rPr>
-          <w:i w:val="false"/>
-          <w:iCs w:val="false"/>
-        </w:rPr>
-      </w:r>
-    </w:p>
-    <w:p>
-      <w:pPr>
-        <w:pStyle w:val="Normal"/>
-        <w:bidi w:val="0"/>
-        <w:ind w:left="709" w:hanging="0"/>
-        <w:jc w:val="both"/>
-        <w:rPr>
-          <w:i w:val="false"/>
-          <w:i w:val="false"/>
-          <w:iCs w:val="false"/>
-        </w:rPr>
-      </w:pPr>
-      <w:r>
-        <w:rPr>
-          <w:rFonts w:eastAsia="Noto Serif CJK SC" w:cs="Noto Sans Devanagari" w:ascii="Garamond" w:hAnsi="Garamond"/>
-          <w:i w:val="false"/>
-          <w:iCs w:val="false"/>
-          <w:color w:val="00A0FC"/>
-          <w:kern w:val="2"/>
-          <w:sz w:val="36"/>
-          <w:szCs w:val="36"/>
-          <w:lang w:val="pt-BR" w:eastAsia="zh-CN" w:bidi="hi-IN"/>
-        </w:rPr>
-        <w:t>E, mesmo que eu não possa ser curado, ao rogar a Deus o amparo, Ele me concederá a assistência de amigos espirituais que me ajudarão a passar por esse processo da melhor maneira possível.</w:t>
-      </w:r>
-    </w:p>
-    <w:p>
-      <w:pPr>
-        <w:pStyle w:val="Normal"/>
-        <w:bidi w:val="0"/>
-        <w:ind w:left="709" w:hanging="0"/>
-        <w:jc w:val="both"/>
-        <w:rPr>
-          <w:i w:val="false"/>
-          <w:i w:val="false"/>
-          <w:iCs w:val="false"/>
-        </w:rPr>
-      </w:pPr>
-      <w:r>
-        <w:rPr>
-          <w:i w:val="false"/>
-          <w:iCs w:val="false"/>
-        </w:rPr>
-      </w:r>
-    </w:p>
-    <w:p>
-      <w:pPr>
-        <w:pStyle w:val="Normal"/>
-        <w:bidi w:val="0"/>
-        <w:ind w:left="709" w:hanging="0"/>
-        <w:jc w:val="both"/>
-        <w:rPr>
-          <w:i w:val="false"/>
-          <w:i w:val="false"/>
-          <w:iCs w:val="false"/>
-        </w:rPr>
-      </w:pPr>
-      <w:r>
-        <w:rPr>
-          <w:rFonts w:eastAsia="Noto Serif CJK SC" w:cs="Noto Sans Devanagari" w:ascii="Garamond" w:hAnsi="Garamond"/>
-          <w:i w:val="false"/>
-          <w:iCs w:val="false"/>
-          <w:color w:val="00A0FC"/>
-          <w:kern w:val="2"/>
-          <w:sz w:val="36"/>
-          <w:szCs w:val="36"/>
-          <w:lang w:val="pt-BR" w:eastAsia="zh-CN" w:bidi="hi-IN"/>
-        </w:rPr>
-        <w:t>Então, diante da dúvida causada por um pressentimento, solicitar amparo espiritual e orar a Deus é sempre o melhor a ser feito.</w:t>
-      </w:r>
-    </w:p>
-    <w:p>
-      <w:pPr>
-        <w:pStyle w:val="Normal"/>
-        <w:bidi w:val="0"/>
-        <w:ind w:left="709" w:hanging="0"/>
-        <w:jc w:val="both"/>
-        <w:rPr>
-          <w:i w:val="false"/>
-          <w:i w:val="false"/>
-          <w:iCs w:val="false"/>
-        </w:rPr>
-      </w:pPr>
-      <w:r>
-        <w:rPr>
-          <w:i w:val="false"/>
-          <w:iCs w:val="false"/>
-        </w:rPr>
-      </w:r>
-    </w:p>
-    <w:p>
-      <w:pPr>
-        <w:pStyle w:val="Normal"/>
-        <w:bidi w:val="0"/>
-        <w:ind w:left="709" w:hanging="0"/>
-        <w:jc w:val="both"/>
-        <w:rPr>
-          <w:i w:val="false"/>
-          <w:i w:val="false"/>
-          <w:iCs w:val="false"/>
-        </w:rPr>
-      </w:pPr>
-      <w:r>
-        <w:rPr>
-          <w:i w:val="false"/>
-          <w:iCs w:val="false"/>
-        </w:rPr>
-      </w:r>
-    </w:p>
-    <w:p>
-      <w:pPr>
-        <w:pStyle w:val="Normal"/>
-        <w:bidi w:val="0"/>
-        <w:jc w:val="both"/>
-        <w:rPr>
-          <w:rFonts w:ascii="Garamond" w:hAnsi="Garamond"/>
-          <w:sz w:val="36"/>
-          <w:szCs w:val="36"/>
-        </w:rPr>
-      </w:pPr>
-      <w:r>
-        <w:rPr>
-          <w:rFonts w:eastAsia="Noto Serif CJK SC" w:cs="Noto Sans Devanagari" w:ascii="Garamond" w:hAnsi="Garamond"/>
-          <w:color w:val="auto"/>
-          <w:kern w:val="2"/>
-          <w:sz w:val="36"/>
-          <w:szCs w:val="36"/>
-          <w:lang w:val="pt-BR" w:eastAsia="zh-CN" w:bidi="hi-IN"/>
-        </w:rPr>
-        <w:t>524</w:t>
-      </w:r>
-      <w:r>
-        <w:rPr>
-          <w:rFonts w:ascii="Garamond" w:hAnsi="Garamond"/>
-          <w:sz w:val="36"/>
-          <w:szCs w:val="36"/>
-        </w:rPr>
-        <w:t>. Os avisos dos Espíritos protetores objetivam unicamente o nosso procedimento moral, ou também o proceder que devamos adotar nos assuntos da vida particular?</w:t>
-      </w:r>
-    </w:p>
-    <w:p>
-      <w:pPr>
-        <w:pStyle w:val="Normal"/>
-        <w:bidi w:val="0"/>
-        <w:jc w:val="both"/>
-        <w:rPr>
-          <w:rFonts w:ascii="Garamond" w:hAnsi="Garamond"/>
-          <w:sz w:val="36"/>
-          <w:szCs w:val="36"/>
-        </w:rPr>
-      </w:pPr>
-      <w:r>
-        <w:rPr>
-          <w:rFonts w:ascii="Garamond" w:hAnsi="Garamond"/>
-          <w:sz w:val="36"/>
-          <w:szCs w:val="36"/>
-        </w:rPr>
-      </w:r>
-    </w:p>
-    <w:p>
-      <w:pPr>
-        <w:pStyle w:val="Normal"/>
-        <w:bidi w:val="0"/>
-        <w:ind w:hanging="0"/>
-        <w:jc w:val="both"/>
-        <w:rPr>
-          <w:rFonts w:ascii="Garamond" w:hAnsi="Garamond"/>
-          <w:sz w:val="36"/>
-          <w:szCs w:val="36"/>
-        </w:rPr>
-      </w:pPr>
-      <w:r>
-        <w:rPr>
-          <w:rFonts w:ascii="Garamond" w:hAnsi="Garamond"/>
-          <w:i/>
-          <w:iCs/>
-          <w:sz w:val="36"/>
-          <w:szCs w:val="36"/>
-        </w:rPr>
-        <w:t>“</w:t>
-      </w:r>
-      <w:r>
-        <w:rPr>
-          <w:rFonts w:ascii="Garamond" w:hAnsi="Garamond"/>
-          <w:i/>
-          <w:iCs/>
-          <w:sz w:val="36"/>
-          <w:szCs w:val="36"/>
-        </w:rPr>
-        <w:t>Tudo. Eles se esforçam para que vivais o melhor possível. Mas, quase sempre tapais os ouvidos aos avisos salutares e vos tornais desgraçados por culpa vossa.”</w:t>
-      </w:r>
-    </w:p>
-    <w:p>
-      <w:pPr>
-        <w:pStyle w:val="Normal"/>
-        <w:bidi w:val="0"/>
-        <w:ind w:hanging="0"/>
-        <w:jc w:val="both"/>
-        <w:rPr>
-          <w:rFonts w:ascii="Garamond" w:hAnsi="Garamond"/>
-          <w:sz w:val="36"/>
-          <w:szCs w:val="36"/>
-        </w:rPr>
-      </w:pPr>
-      <w:r>
-        <w:rPr>
-          <w:rFonts w:ascii="Garamond" w:hAnsi="Garamond"/>
-          <w:sz w:val="36"/>
-          <w:szCs w:val="36"/>
-        </w:rPr>
-      </w:r>
-    </w:p>
-    <w:p>
-      <w:pPr>
-        <w:pStyle w:val="Normal"/>
-        <w:bidi w:val="0"/>
-        <w:ind w:left="709" w:hanging="0"/>
-        <w:jc w:val="both"/>
-        <w:rPr>
-          <w:rFonts w:ascii="Garamond" w:hAnsi="Garamond" w:eastAsia="Noto Serif CJK SC" w:cs="Noto Sans Devanagari"/>
-          <w:i w:val="false"/>
-          <w:i w:val="false"/>
-          <w:iCs w:val="false"/>
-          <w:color w:val="000000"/>
-          <w:kern w:val="2"/>
-          <w:sz w:val="36"/>
-          <w:szCs w:val="36"/>
-          <w:lang w:val="pt-BR" w:eastAsia="zh-CN" w:bidi="hi-IN"/>
-        </w:rPr>
-      </w:pPr>
-      <w:r>
-        <w:rPr>
-          <w:rFonts w:eastAsia="Noto Serif CJK SC" w:cs="Noto Sans Devanagari" w:ascii="Garamond" w:hAnsi="Garamond"/>
-          <w:i w:val="false"/>
-          <w:iCs w:val="false"/>
-          <w:color w:val="000000"/>
-          <w:kern w:val="2"/>
-          <w:sz w:val="28"/>
-          <w:szCs w:val="28"/>
-          <w:lang w:val="pt-BR" w:eastAsia="zh-CN" w:bidi="hi-IN"/>
-        </w:rPr>
-        <w:t>Os Espíritos protetores nos ajudam com seus conselhos, mediante a voz da consciência que fazem ressoar em nosso íntimo. Como, porém, nem sempre ligamos a isso a devida importância, outros conselhos mais diretos eles nos dão, servindo-se das pessoas que nos cercam. Examine cada um as diversas circunstâncias felizes ou infelizes de sua vida e verá que em muitas ocasiões recebeu conselhos de que se não aproveitou e que lhe teriam poupado muitos desgostos, se os houvera escutado.</w:t>
-      </w:r>
-    </w:p>
-    <w:p>
-      <w:pPr>
-        <w:pStyle w:val="Normal"/>
-        <w:bidi w:val="0"/>
-        <w:ind w:left="709" w:hanging="0"/>
-        <w:jc w:val="both"/>
-        <w:rPr>
-          <w:rFonts w:ascii="Garamond" w:hAnsi="Garamond" w:eastAsia="Noto Serif CJK SC" w:cs="Noto Sans Devanagari"/>
-          <w:i w:val="false"/>
-          <w:i w:val="false"/>
-          <w:iCs w:val="false"/>
-          <w:color w:val="00A0FC"/>
-          <w:kern w:val="2"/>
-          <w:sz w:val="36"/>
-          <w:szCs w:val="36"/>
-          <w:lang w:val="pt-BR" w:eastAsia="zh-CN" w:bidi="hi-IN"/>
-        </w:rPr>
-      </w:pPr>
-      <w:r>
-        <w:rPr>
-          <w:rFonts w:eastAsia="Noto Serif CJK SC" w:cs="Noto Sans Devanagari" w:ascii="Garamond" w:hAnsi="Garamond"/>
-          <w:i w:val="false"/>
-          <w:iCs w:val="false"/>
-          <w:color w:val="00A0FC"/>
-          <w:kern w:val="2"/>
-          <w:sz w:val="36"/>
-          <w:szCs w:val="36"/>
-          <w:lang w:val="pt-BR" w:eastAsia="zh-CN" w:bidi="hi-IN"/>
-        </w:rPr>
-      </w:r>
-    </w:p>
-    <w:p>
-      <w:pPr>
-        <w:pStyle w:val="Normal"/>
-        <w:bidi w:val="0"/>
-        <w:ind w:left="709" w:hanging="0"/>
-        <w:jc w:val="both"/>
-        <w:rPr>
-          <w:i w:val="false"/>
-          <w:i w:val="false"/>
-          <w:iCs w:val="false"/>
-        </w:rPr>
-      </w:pPr>
-      <w:r>
-        <w:rPr>
-          <w:rFonts w:eastAsia="Noto Serif CJK SC" w:cs="Noto Sans Devanagari" w:ascii="Garamond" w:hAnsi="Garamond"/>
-          <w:i w:val="false"/>
-          <w:iCs w:val="false"/>
-          <w:color w:val="00A0FC"/>
-          <w:kern w:val="2"/>
-          <w:sz w:val="36"/>
-          <w:szCs w:val="36"/>
-          <w:lang w:val="pt-BR" w:eastAsia="zh-CN" w:bidi="hi-IN"/>
-        </w:rPr>
-        <w:t>Nessa questão, Kardec quer saber se o auxílio que os Espíritos protetores nos dão está restrito às questões de ordem moral ou se também se aplica às questões pessoais do nosso dia a dia.</w:t>
-      </w:r>
-    </w:p>
-    <w:p>
-      <w:pPr>
-        <w:pStyle w:val="Normal"/>
-        <w:bidi w:val="0"/>
-        <w:ind w:left="709" w:hanging="0"/>
-        <w:jc w:val="both"/>
-        <w:rPr>
-          <w:i w:val="false"/>
-          <w:i w:val="false"/>
-          <w:iCs w:val="false"/>
-        </w:rPr>
-      </w:pPr>
-      <w:r>
-        <w:rPr>
-          <w:i w:val="false"/>
-          <w:iCs w:val="false"/>
-        </w:rPr>
-      </w:r>
-    </w:p>
-    <w:p>
-      <w:pPr>
-        <w:pStyle w:val="Normal"/>
-        <w:bidi w:val="0"/>
-        <w:ind w:left="709" w:hanging="0"/>
-        <w:jc w:val="both"/>
-        <w:rPr>
-          <w:i w:val="false"/>
-          <w:i w:val="false"/>
-          <w:iCs w:val="false"/>
-        </w:rPr>
-      </w:pPr>
-      <w:r>
-        <w:rPr>
-          <w:rFonts w:eastAsia="Noto Serif CJK SC" w:cs="Noto Sans Devanagari" w:ascii="Garamond" w:hAnsi="Garamond"/>
-          <w:i w:val="false"/>
-          <w:iCs w:val="false"/>
-          <w:color w:val="00A0FC"/>
-          <w:kern w:val="2"/>
-          <w:sz w:val="36"/>
-          <w:szCs w:val="36"/>
-          <w:lang w:val="pt-BR" w:eastAsia="zh-CN" w:bidi="hi-IN"/>
-        </w:rPr>
-        <w:t>O procedimento moral refere-se às escolhas que envolvem diretamente o bem, o mal e o progresso espiritual do indivíduo. Tem relação direta com o nosso caráter e com o uso do livre-arbítrio.</w:t>
-      </w:r>
-    </w:p>
-    <w:p>
-      <w:pPr>
-        <w:pStyle w:val="Normal"/>
-        <w:bidi w:val="0"/>
-        <w:ind w:left="709" w:hanging="0"/>
-        <w:jc w:val="both"/>
-        <w:rPr>
-          <w:i w:val="false"/>
-          <w:i w:val="false"/>
-          <w:iCs w:val="false"/>
-        </w:rPr>
-      </w:pPr>
-      <w:r>
-        <w:rPr>
-          <w:i w:val="false"/>
-          <w:iCs w:val="false"/>
-        </w:rPr>
-      </w:r>
-    </w:p>
-    <w:p>
-      <w:pPr>
-        <w:pStyle w:val="Normal"/>
-        <w:bidi w:val="0"/>
-        <w:ind w:left="709" w:hanging="0"/>
-        <w:jc w:val="both"/>
-        <w:rPr>
-          <w:i w:val="false"/>
-          <w:i w:val="false"/>
-          <w:iCs w:val="false"/>
-        </w:rPr>
-      </w:pPr>
-      <w:r>
-        <w:rPr>
-          <w:rFonts w:eastAsia="Noto Serif CJK SC" w:cs="Noto Sans Devanagari" w:ascii="Garamond" w:hAnsi="Garamond"/>
-          <w:i w:val="false"/>
-          <w:iCs w:val="false"/>
-          <w:color w:val="00A0FC"/>
-          <w:kern w:val="2"/>
-          <w:sz w:val="36"/>
-          <w:szCs w:val="36"/>
-          <w:lang w:val="pt-BR" w:eastAsia="zh-CN" w:bidi="hi-IN"/>
-        </w:rPr>
-        <w:t>Já o proceder nos assuntos da vida particular diz respeito às circunstâncias práticas e cotidianas da existência material, nas quais a Espiritualidade nos auxilia por meio da inspiração e da intuição, desde que façamos o esforço necessário para merecer essa assistência.</w:t>
-      </w:r>
-    </w:p>
-    <w:p>
-      <w:pPr>
-        <w:pStyle w:val="Normal"/>
-        <w:bidi w:val="0"/>
-        <w:ind w:left="709" w:hanging="0"/>
-        <w:jc w:val="both"/>
-        <w:rPr>
-          <w:i w:val="false"/>
-          <w:i w:val="false"/>
-          <w:iCs w:val="false"/>
-        </w:rPr>
-      </w:pPr>
-      <w:r>
-        <w:rPr>
-          <w:i w:val="false"/>
-          <w:iCs w:val="false"/>
-        </w:rPr>
-      </w:r>
-    </w:p>
-    <w:p>
-      <w:pPr>
-        <w:pStyle w:val="Normal"/>
-        <w:bidi w:val="0"/>
-        <w:ind w:left="709" w:hanging="0"/>
-        <w:jc w:val="both"/>
-        <w:rPr>
-          <w:i w:val="false"/>
-          <w:i w:val="false"/>
-          <w:iCs w:val="false"/>
-        </w:rPr>
-      </w:pPr>
-      <w:r>
-        <w:rPr>
-          <w:rFonts w:eastAsia="Noto Serif CJK SC" w:cs="Noto Sans Devanagari" w:ascii="Garamond" w:hAnsi="Garamond"/>
-          <w:i w:val="false"/>
-          <w:iCs w:val="false"/>
-          <w:color w:val="00A0FC"/>
-          <w:kern w:val="2"/>
-          <w:sz w:val="36"/>
-          <w:szCs w:val="36"/>
-          <w:lang w:val="pt-BR" w:eastAsia="zh-CN" w:bidi="hi-IN"/>
-        </w:rPr>
-        <w:t>A Espiritualidade responde afirmando que, sim, os Espíritos protetores nos auxiliam em todos os campos da vida. Porém, é preciso que tenhamos a compreensão exata sobre a maneira como esse auxílio chega até nós.</w:t>
-      </w:r>
-    </w:p>
-    <w:p>
-      <w:pPr>
-        <w:pStyle w:val="Normal"/>
-        <w:bidi w:val="0"/>
-        <w:ind w:left="709" w:hanging="0"/>
-        <w:jc w:val="both"/>
-        <w:rPr>
-          <w:i w:val="false"/>
-          <w:i w:val="false"/>
-          <w:iCs w:val="false"/>
-        </w:rPr>
-      </w:pPr>
-      <w:r>
-        <w:rPr>
-          <w:i w:val="false"/>
-          <w:iCs w:val="false"/>
-        </w:rPr>
-      </w:r>
-    </w:p>
-    <w:p>
-      <w:pPr>
-        <w:pStyle w:val="Normal"/>
-        <w:bidi w:val="0"/>
-        <w:ind w:left="709" w:hanging="0"/>
-        <w:jc w:val="both"/>
-        <w:rPr>
-          <w:i w:val="false"/>
-          <w:i w:val="false"/>
-          <w:iCs w:val="false"/>
-        </w:rPr>
-      </w:pPr>
-      <w:r>
-        <w:rPr>
-          <w:rFonts w:eastAsia="Noto Serif CJK SC" w:cs="Noto Sans Devanagari" w:ascii="Garamond" w:hAnsi="Garamond"/>
-          <w:i w:val="false"/>
-          <w:iCs w:val="false"/>
-          <w:color w:val="00A0FC"/>
-          <w:kern w:val="2"/>
-          <w:sz w:val="36"/>
-          <w:szCs w:val="36"/>
-          <w:lang w:val="pt-BR" w:eastAsia="zh-CN" w:bidi="hi-IN"/>
-        </w:rPr>
-        <w:t>Não adianta pedirmos aos Espíritos protetores para ganharmos na loteria, obtermos uma promoção no emprego ou passarmos em um concurso público. Eles não se ocupam com esse tipo de solicitação.</w:t>
-      </w:r>
-    </w:p>
-    <w:p>
-      <w:pPr>
-        <w:pStyle w:val="Normal"/>
-        <w:bidi w:val="0"/>
-        <w:ind w:left="709" w:hanging="0"/>
-        <w:jc w:val="both"/>
-        <w:rPr>
-          <w:i w:val="false"/>
-          <w:i w:val="false"/>
-          <w:iCs w:val="false"/>
-        </w:rPr>
-      </w:pPr>
-      <w:r>
-        <w:rPr>
-          <w:i w:val="false"/>
-          <w:iCs w:val="false"/>
-        </w:rPr>
-      </w:r>
-    </w:p>
-    <w:p>
-      <w:pPr>
-        <w:pStyle w:val="Normal"/>
-        <w:bidi w:val="0"/>
-        <w:ind w:left="709" w:hanging="0"/>
-        <w:jc w:val="both"/>
-        <w:rPr>
-          <w:i w:val="false"/>
-          <w:i w:val="false"/>
-          <w:iCs w:val="false"/>
-        </w:rPr>
-      </w:pPr>
-      <w:r>
-        <w:rPr>
-          <w:rFonts w:eastAsia="Noto Serif CJK SC" w:cs="Noto Sans Devanagari" w:ascii="Garamond" w:hAnsi="Garamond"/>
-          <w:i w:val="false"/>
-          <w:iCs w:val="false"/>
-          <w:color w:val="00A0FC"/>
-          <w:kern w:val="2"/>
-          <w:sz w:val="36"/>
-          <w:szCs w:val="36"/>
-          <w:lang w:val="pt-BR" w:eastAsia="zh-CN" w:bidi="hi-IN"/>
-        </w:rPr>
-        <w:t>O que eles farão, desde que tenhamos realizado o trabalho que nos cabe, é nos ajudar a proceder da melhor maneira no trabalho, de forma que, eventualmente, venha uma promoção. Não vão nos dar as respostas das provas de um concurso público, mas podem nos auxiliar a manter a tranquilidade durante a prova, favorecendo que nos lembremos daquilo que estudamos.</w:t>
-      </w:r>
-    </w:p>
-    <w:p>
-      <w:pPr>
-        <w:pStyle w:val="Normal"/>
-        <w:bidi w:val="0"/>
-        <w:ind w:left="709" w:hanging="0"/>
-        <w:jc w:val="both"/>
-        <w:rPr>
-          <w:i w:val="false"/>
-          <w:i w:val="false"/>
-          <w:iCs w:val="false"/>
-        </w:rPr>
-      </w:pPr>
-      <w:r>
-        <w:rPr>
-          <w:i w:val="false"/>
-          <w:iCs w:val="false"/>
-        </w:rPr>
-      </w:r>
-    </w:p>
-    <w:p>
-      <w:pPr>
-        <w:pStyle w:val="Normal"/>
-        <w:bidi w:val="0"/>
-        <w:ind w:left="709" w:hanging="0"/>
-        <w:jc w:val="both"/>
-        <w:rPr>
-          <w:i w:val="false"/>
-          <w:i w:val="false"/>
-          <w:iCs w:val="false"/>
-        </w:rPr>
-      </w:pPr>
-      <w:r>
-        <w:rPr>
-          <w:rFonts w:eastAsia="Noto Serif CJK SC" w:cs="Noto Sans Devanagari" w:ascii="Garamond" w:hAnsi="Garamond"/>
-          <w:i w:val="false"/>
-          <w:iCs w:val="false"/>
-          <w:color w:val="00A0FC"/>
-          <w:kern w:val="2"/>
-          <w:sz w:val="36"/>
-          <w:szCs w:val="36"/>
-          <w:lang w:val="pt-BR" w:eastAsia="zh-CN" w:bidi="hi-IN"/>
-        </w:rPr>
-        <w:t>Pode parecer estranho que os Espíritos protetores nos ajudem nas questões materiais, mas não podemos nos esquecer da relação que existe entre essas duas esferas.</w:t>
-      </w:r>
-    </w:p>
-    <w:p>
-      <w:pPr>
-        <w:pStyle w:val="Normal"/>
-        <w:bidi w:val="0"/>
-        <w:ind w:left="709" w:hanging="0"/>
-        <w:jc w:val="both"/>
-        <w:rPr>
-          <w:i w:val="false"/>
-          <w:i w:val="false"/>
-          <w:iCs w:val="false"/>
-        </w:rPr>
-      </w:pPr>
-      <w:r>
-        <w:rPr>
-          <w:i w:val="false"/>
-          <w:iCs w:val="false"/>
-        </w:rPr>
-      </w:r>
-    </w:p>
-    <w:p>
-      <w:pPr>
-        <w:pStyle w:val="Normal"/>
-        <w:bidi w:val="0"/>
-        <w:ind w:left="709" w:hanging="0"/>
-        <w:jc w:val="both"/>
-        <w:rPr>
-          <w:i w:val="false"/>
-          <w:i w:val="false"/>
-          <w:iCs w:val="false"/>
-        </w:rPr>
-      </w:pPr>
-      <w:r>
-        <w:rPr>
-          <w:rFonts w:eastAsia="Noto Serif CJK SC" w:cs="Noto Sans Devanagari" w:ascii="Garamond" w:hAnsi="Garamond"/>
-          <w:i w:val="false"/>
-          <w:iCs w:val="false"/>
-          <w:color w:val="00A0FC"/>
-          <w:kern w:val="2"/>
-          <w:sz w:val="36"/>
-          <w:szCs w:val="36"/>
-          <w:lang w:val="pt-BR" w:eastAsia="zh-CN" w:bidi="hi-IN"/>
-        </w:rPr>
-        <w:t>Na resposta dada a Kardec, a Espiritualidade afirmou: “</w:t>
-      </w:r>
-      <w:r>
-        <w:rPr>
-          <w:rFonts w:eastAsia="Noto Serif CJK SC" w:cs="Noto Sans Devanagari" w:ascii="Garamond" w:hAnsi="Garamond"/>
-          <w:i/>
-          <w:iCs/>
-          <w:color w:val="00A0FC"/>
-          <w:kern w:val="2"/>
-          <w:sz w:val="36"/>
-          <w:szCs w:val="36"/>
-          <w:lang w:val="pt-BR" w:eastAsia="zh-CN" w:bidi="hi-IN"/>
-        </w:rPr>
-        <w:t>Eles se esforçam para que vivais o melhor possível</w:t>
-      </w:r>
-      <w:r>
-        <w:rPr>
-          <w:rFonts w:eastAsia="Noto Serif CJK SC" w:cs="Noto Sans Devanagari" w:ascii="Garamond" w:hAnsi="Garamond"/>
-          <w:i w:val="false"/>
-          <w:iCs w:val="false"/>
-          <w:color w:val="00A0FC"/>
-          <w:kern w:val="2"/>
-          <w:sz w:val="36"/>
-          <w:szCs w:val="36"/>
-          <w:lang w:val="pt-BR" w:eastAsia="zh-CN" w:bidi="hi-IN"/>
-        </w:rPr>
-        <w:t>”. Nosso crescimento e evolução espiritual passam, invariavelmente, pelas questões materiais e terrenas. Portanto, é natural que os Espíritos protetores nos auxiliem também nessas questões, quando elas estiverem relacionadas à nossa evolução.</w:t>
-      </w:r>
-    </w:p>
-    <w:p>
-      <w:pPr>
-        <w:pStyle w:val="Normal"/>
-        <w:bidi w:val="0"/>
-        <w:ind w:left="709" w:hanging="0"/>
-        <w:jc w:val="both"/>
-        <w:rPr>
-          <w:i w:val="false"/>
-          <w:i w:val="false"/>
-          <w:iCs w:val="false"/>
-        </w:rPr>
-      </w:pPr>
-      <w:r>
-        <w:rPr>
-          <w:i w:val="false"/>
-          <w:iCs w:val="false"/>
-        </w:rPr>
-      </w:r>
-    </w:p>
-    <w:p>
-      <w:pPr>
-        <w:pStyle w:val="Normal"/>
-        <w:bidi w:val="0"/>
-        <w:ind w:left="709" w:hanging="0"/>
-        <w:jc w:val="both"/>
-        <w:rPr>
-          <w:i w:val="false"/>
-          <w:i w:val="false"/>
-          <w:iCs w:val="false"/>
-        </w:rPr>
-      </w:pPr>
-      <w:r>
-        <w:rPr>
-          <w:rFonts w:eastAsia="Noto Serif CJK SC" w:cs="Noto Sans Devanagari" w:ascii="Garamond" w:hAnsi="Garamond"/>
-          <w:i w:val="false"/>
-          <w:iCs w:val="false"/>
-          <w:color w:val="00A0FC"/>
-          <w:kern w:val="2"/>
-          <w:sz w:val="36"/>
-          <w:szCs w:val="36"/>
-          <w:lang w:val="pt-BR" w:eastAsia="zh-CN" w:bidi="hi-IN"/>
-        </w:rPr>
-        <w:t>Entretanto, a Espiritualidade também afirma que, frequentemente, ignoramos os avisos e conselhos dos Espíritos protetores e acabamos caindo ou enveredando por caminhos dolorosos. Ou seja, eles nos ajudariam ainda mais se nos permitíssemos ser auxiliados.</w:t>
-      </w:r>
-    </w:p>
-    <w:p>
-      <w:pPr>
-        <w:pStyle w:val="Normal"/>
-        <w:bidi w:val="0"/>
-        <w:ind w:left="709" w:hanging="0"/>
-        <w:jc w:val="both"/>
-        <w:rPr>
-          <w:i w:val="false"/>
-          <w:i w:val="false"/>
-          <w:iCs w:val="false"/>
-        </w:rPr>
-      </w:pPr>
-      <w:r>
-        <w:rPr>
-          <w:i w:val="false"/>
-          <w:iCs w:val="false"/>
-        </w:rPr>
-      </w:r>
-    </w:p>
-    <w:p>
-      <w:pPr>
-        <w:pStyle w:val="Normal"/>
-        <w:bidi w:val="0"/>
-        <w:ind w:left="709" w:hanging="0"/>
-        <w:jc w:val="both"/>
-        <w:rPr>
-          <w:i w:val="false"/>
-          <w:i w:val="false"/>
-          <w:iCs w:val="false"/>
-        </w:rPr>
-      </w:pPr>
-      <w:r>
-        <w:rPr>
-          <w:rFonts w:eastAsia="Noto Serif CJK SC" w:cs="Noto Sans Devanagari" w:ascii="Garamond" w:hAnsi="Garamond"/>
-          <w:i w:val="false"/>
-          <w:iCs w:val="false"/>
-          <w:color w:val="00A0FC"/>
-          <w:kern w:val="2"/>
-          <w:sz w:val="36"/>
-          <w:szCs w:val="36"/>
-          <w:lang w:val="pt-BR" w:eastAsia="zh-CN" w:bidi="hi-IN"/>
-        </w:rPr>
-        <w:t>Quase todos nós já passamos por situações na vida em que fazemos uma escolha equivocada, colhemos os frutos amargos dessa escolha e, depois, lamentamos, dizendo: “Puxa vida, tinha alguma coisa me dizendo para eu não agir da maneira como agi. Se eu tivesse ouvido a minha consciência, isso não teria acontecido”.</w:t>
-      </w:r>
-    </w:p>
-    <w:p>
-      <w:pPr>
-        <w:pStyle w:val="Normal"/>
-        <w:bidi w:val="0"/>
-        <w:ind w:left="709" w:hanging="0"/>
-        <w:jc w:val="both"/>
-        <w:rPr>
-          <w:i w:val="false"/>
-          <w:i w:val="false"/>
-          <w:iCs w:val="false"/>
-        </w:rPr>
-      </w:pPr>
-      <w:r>
-        <w:rPr>
-          <w:i w:val="false"/>
-          <w:iCs w:val="false"/>
-        </w:rPr>
-      </w:r>
-    </w:p>
-    <w:p>
-      <w:pPr>
-        <w:pStyle w:val="Normal"/>
-        <w:bidi w:val="0"/>
-        <w:ind w:left="709" w:hanging="0"/>
-        <w:jc w:val="both"/>
-        <w:rPr>
-          <w:i w:val="false"/>
-          <w:i w:val="false"/>
-          <w:iCs w:val="false"/>
-        </w:rPr>
-      </w:pPr>
-      <w:r>
-        <w:rPr>
-          <w:rFonts w:eastAsia="Noto Serif CJK SC" w:cs="Noto Sans Devanagari" w:ascii="Garamond" w:hAnsi="Garamond"/>
-          <w:i w:val="false"/>
-          <w:iCs w:val="false"/>
-          <w:color w:val="00A0FC"/>
-          <w:kern w:val="2"/>
-          <w:sz w:val="36"/>
-          <w:szCs w:val="36"/>
-          <w:lang w:val="pt-BR" w:eastAsia="zh-CN" w:bidi="hi-IN"/>
-        </w:rPr>
-        <w:t>É exatamente isso que a Espiritualidade respondeu a Kardec: o Espírito protetor tentou nos avisar, nós ignoramos o aviso, seguimos pelo caminho errado e, depois, nos lamentamos.</w:t>
-      </w:r>
-    </w:p>
-    <w:p>
-      <w:pPr>
-        <w:pStyle w:val="Normal"/>
-        <w:bidi w:val="0"/>
-        <w:ind w:left="709" w:hanging="0"/>
-        <w:jc w:val="both"/>
-        <w:rPr>
-          <w:i w:val="false"/>
-          <w:i w:val="false"/>
-          <w:iCs w:val="false"/>
-        </w:rPr>
-      </w:pPr>
-      <w:r>
-        <w:rPr>
-          <w:i w:val="false"/>
-          <w:iCs w:val="false"/>
-        </w:rPr>
-      </w:r>
-    </w:p>
-    <w:p>
-      <w:pPr>
-        <w:pStyle w:val="Normal"/>
-        <w:bidi w:val="0"/>
-        <w:ind w:left="709" w:hanging="0"/>
-        <w:jc w:val="both"/>
-        <w:rPr>
-          <w:i w:val="false"/>
-          <w:i w:val="false"/>
-          <w:iCs w:val="false"/>
-        </w:rPr>
-      </w:pPr>
-      <w:r>
-        <w:rPr>
-          <w:rFonts w:eastAsia="Noto Serif CJK SC" w:cs="Noto Sans Devanagari" w:ascii="Garamond" w:hAnsi="Garamond"/>
-          <w:i w:val="false"/>
-          <w:iCs w:val="false"/>
-          <w:color w:val="00A0FC"/>
-          <w:kern w:val="2"/>
-          <w:sz w:val="36"/>
-          <w:szCs w:val="36"/>
-          <w:lang w:val="pt-BR" w:eastAsia="zh-CN" w:bidi="hi-IN"/>
-        </w:rPr>
-        <w:t>Na nota que acrescentou à resposta dessa questão, Kardec afirma que, mesmo quando ignoramos a voz da nossa consciência, os Espíritos protetores podem utilizar as pessoas à nossa volta para que possamos ouvir aquilo que eles desejam nos transmitir. Trata-se de um último recurso que utilizam na tentativa de serem ouvidos.</w:t>
-      </w:r>
-    </w:p>
-    <w:p>
-      <w:pPr>
-        <w:pStyle w:val="Normal"/>
-        <w:bidi w:val="0"/>
-        <w:ind w:left="709" w:hanging="0"/>
-        <w:jc w:val="both"/>
-        <w:rPr>
-          <w:i w:val="false"/>
-          <w:i w:val="false"/>
-          <w:iCs w:val="false"/>
-        </w:rPr>
-      </w:pPr>
-      <w:r>
-        <w:rPr>
-          <w:i w:val="false"/>
-          <w:iCs w:val="false"/>
-        </w:rPr>
-      </w:r>
-    </w:p>
-    <w:p>
-      <w:pPr>
-        <w:pStyle w:val="Normal"/>
-        <w:bidi w:val="0"/>
-        <w:ind w:left="709" w:hanging="0"/>
-        <w:jc w:val="both"/>
-        <w:rPr>
-          <w:i w:val="false"/>
-          <w:i w:val="false"/>
-          <w:iCs w:val="false"/>
-        </w:rPr>
-      </w:pPr>
-      <w:r>
-        <w:rPr>
-          <w:rFonts w:eastAsia="Noto Serif CJK SC" w:cs="Noto Sans Devanagari" w:ascii="Garamond" w:hAnsi="Garamond"/>
-          <w:i w:val="false"/>
-          <w:iCs w:val="false"/>
-          <w:color w:val="00A0FC"/>
-          <w:kern w:val="2"/>
-          <w:sz w:val="36"/>
-          <w:szCs w:val="36"/>
-          <w:lang w:val="pt-BR" w:eastAsia="zh-CN" w:bidi="hi-IN"/>
-        </w:rPr>
-        <w:t>Kardec ainda nos convida a resgatar, em nossa memória, as situações infelizes que ocorreram em nossa vida e a realizar um exame de consciência sincero sobre elas. Ele afirma que chegaremos à conclusão de que, na grande maioria das vezes, ignoramos o auxílio espiritual que recebemos e que poderia ter evitado o desfecho infeliz.</w:t>
-      </w:r>
-    </w:p>
-    <w:p>
-      <w:pPr>
-        <w:pStyle w:val="Normal"/>
-        <w:bidi w:val="0"/>
-        <w:ind w:left="709" w:hanging="0"/>
-        <w:jc w:val="both"/>
-        <w:rPr>
-          <w:i w:val="false"/>
-          <w:i w:val="false"/>
-          <w:iCs w:val="false"/>
-        </w:rPr>
-      </w:pPr>
-      <w:r>
-        <w:rPr>
-          <w:i w:val="false"/>
-          <w:iCs w:val="false"/>
-        </w:rPr>
-      </w:r>
-    </w:p>
-    <w:p>
-      <w:pPr>
-        <w:pStyle w:val="Normal"/>
-        <w:bidi w:val="0"/>
-        <w:ind w:left="709" w:hanging="0"/>
-        <w:jc w:val="both"/>
-        <w:rPr>
-          <w:i w:val="false"/>
-          <w:i w:val="false"/>
-          <w:iCs w:val="false"/>
-        </w:rPr>
-      </w:pPr>
-      <w:r>
-        <w:rPr>
-          <w:i w:val="false"/>
-          <w:iCs w:val="false"/>
-        </w:rPr>
+        <w:t>A Espiritualidade conclui dizendo que sempre é possível romper os vínculos criados com os Espíritos inferiores, através do desejo sincero de se redimir e recorrendo ao auxílio dos Espíritos Superiores.</w:t>
       </w:r>
     </w:p>
     <w:p>
@@ -3074,7 +2151,861 @@
           <w:szCs w:val="48"/>
           <w:lang w:val="pt-BR" w:eastAsia="zh-CN" w:bidi="hi-IN"/>
         </w:rPr>
-        <w:t>Influência dos Espíritos nos acontecimentos da vida</w:t>
+        <w:t>P</w:t>
+      </w:r>
+      <w:r>
+        <w:rPr>
+          <w:rFonts w:eastAsia="Noto Serif CJK SC" w:cs="Noto Sans Devanagari" w:ascii="Garamond" w:hAnsi="Garamond"/>
+          <w:b/>
+          <w:bCs/>
+          <w:i w:val="false"/>
+          <w:iCs w:val="false"/>
+          <w:color w:val="auto"/>
+          <w:kern w:val="2"/>
+          <w:sz w:val="48"/>
+          <w:szCs w:val="48"/>
+          <w:lang w:val="pt-BR" w:eastAsia="zh-CN" w:bidi="hi-IN"/>
+        </w:rPr>
+        <w:t>oder oculto. Talismãs. Feiticeiros.</w:t>
+      </w:r>
+    </w:p>
+    <w:p>
+      <w:pPr>
+        <w:pStyle w:val="Normal"/>
+        <w:bidi w:val="0"/>
+        <w:ind w:left="709" w:hanging="0"/>
+        <w:jc w:val="both"/>
+        <w:rPr>
+          <w:i w:val="false"/>
+          <w:i w:val="false"/>
+          <w:iCs w:val="false"/>
+        </w:rPr>
+      </w:pPr>
+      <w:r>
+        <w:rPr>
+          <w:i w:val="false"/>
+          <w:iCs w:val="false"/>
+        </w:rPr>
+      </w:r>
+    </w:p>
+    <w:p>
+      <w:pPr>
+        <w:pStyle w:val="Normal"/>
+        <w:bidi w:val="0"/>
+        <w:ind w:left="709" w:hanging="0"/>
+        <w:jc w:val="both"/>
+        <w:rPr>
+          <w:i w:val="false"/>
+          <w:i w:val="false"/>
+          <w:iCs w:val="false"/>
+        </w:rPr>
+      </w:pPr>
+      <w:r>
+        <w:rPr>
+          <w:i w:val="false"/>
+          <w:iCs w:val="false"/>
+        </w:rPr>
+      </w:r>
+    </w:p>
+    <w:p>
+      <w:pPr>
+        <w:pStyle w:val="Normal"/>
+        <w:bidi w:val="0"/>
+        <w:jc w:val="both"/>
+        <w:rPr>
+          <w:rFonts w:ascii="Garamond" w:hAnsi="Garamond"/>
+          <w:sz w:val="36"/>
+          <w:szCs w:val="36"/>
+        </w:rPr>
+      </w:pPr>
+      <w:r>
+        <w:rPr>
+          <w:rFonts w:eastAsia="Noto Serif CJK SC" w:cs="Noto Sans Devanagari" w:ascii="Garamond" w:hAnsi="Garamond"/>
+          <w:color w:val="auto"/>
+          <w:kern w:val="2"/>
+          <w:sz w:val="36"/>
+          <w:szCs w:val="36"/>
+          <w:lang w:val="pt-BR" w:eastAsia="zh-CN" w:bidi="hi-IN"/>
+        </w:rPr>
+        <w:t>5</w:t>
+      </w:r>
+      <w:r>
+        <w:rPr>
+          <w:rFonts w:eastAsia="Noto Serif CJK SC" w:cs="Noto Sans Devanagari" w:ascii="Garamond" w:hAnsi="Garamond"/>
+          <w:color w:val="auto"/>
+          <w:kern w:val="2"/>
+          <w:sz w:val="36"/>
+          <w:szCs w:val="36"/>
+          <w:lang w:val="pt-BR" w:eastAsia="zh-CN" w:bidi="hi-IN"/>
+        </w:rPr>
+        <w:t>51</w:t>
+      </w:r>
+      <w:r>
+        <w:rPr>
+          <w:rFonts w:ascii="Garamond" w:hAnsi="Garamond"/>
+          <w:sz w:val="36"/>
+          <w:szCs w:val="36"/>
+        </w:rPr>
+        <w:t>. Pode um homem mau, com o auxílio de um mau Espírito que lhe</w:t>
+      </w:r>
+      <w:r>
+        <w:rPr>
+          <w:rFonts w:ascii="Garamond" w:hAnsi="Garamond"/>
+          <w:sz w:val="36"/>
+          <w:szCs w:val="36"/>
+        </w:rPr>
+        <w:t xml:space="preserve"> </w:t>
+      </w:r>
+      <w:r>
+        <w:rPr>
+          <w:rFonts w:ascii="Garamond" w:hAnsi="Garamond"/>
+          <w:sz w:val="36"/>
+          <w:szCs w:val="36"/>
+        </w:rPr>
+        <w:t>seja dedicado, fazer mal ao seu próximo?</w:t>
+      </w:r>
+    </w:p>
+    <w:p>
+      <w:pPr>
+        <w:pStyle w:val="Normal"/>
+        <w:bidi w:val="0"/>
+        <w:jc w:val="both"/>
+        <w:rPr>
+          <w:rFonts w:ascii="Garamond" w:hAnsi="Garamond"/>
+          <w:sz w:val="36"/>
+          <w:szCs w:val="36"/>
+        </w:rPr>
+      </w:pPr>
+      <w:r>
+        <w:rPr>
+          <w:rFonts w:ascii="Garamond" w:hAnsi="Garamond"/>
+          <w:sz w:val="36"/>
+          <w:szCs w:val="36"/>
+        </w:rPr>
+      </w:r>
+    </w:p>
+    <w:p>
+      <w:pPr>
+        <w:pStyle w:val="Normal"/>
+        <w:bidi w:val="0"/>
+        <w:ind w:hanging="0"/>
+        <w:jc w:val="both"/>
+        <w:rPr>
+          <w:rFonts w:ascii="Garamond" w:hAnsi="Garamond"/>
+          <w:sz w:val="36"/>
+          <w:szCs w:val="36"/>
+        </w:rPr>
+      </w:pPr>
+      <w:r>
+        <w:rPr>
+          <w:rFonts w:ascii="Garamond" w:hAnsi="Garamond"/>
+          <w:i/>
+          <w:iCs/>
+          <w:sz w:val="36"/>
+          <w:szCs w:val="36"/>
+        </w:rPr>
+        <w:t>“</w:t>
+      </w:r>
+      <w:r>
+        <w:rPr>
+          <w:rFonts w:ascii="Garamond" w:hAnsi="Garamond"/>
+          <w:i/>
+          <w:iCs/>
+          <w:sz w:val="36"/>
+          <w:szCs w:val="36"/>
+        </w:rPr>
+        <w:t>Não; Deus não o permitiria.”</w:t>
+      </w:r>
+    </w:p>
+    <w:p>
+      <w:pPr>
+        <w:pStyle w:val="Normal"/>
+        <w:bidi w:val="0"/>
+        <w:ind w:hanging="0"/>
+        <w:jc w:val="both"/>
+        <w:rPr>
+          <w:rFonts w:ascii="Garamond" w:hAnsi="Garamond"/>
+          <w:sz w:val="36"/>
+          <w:szCs w:val="36"/>
+        </w:rPr>
+      </w:pPr>
+      <w:r>
+        <w:rPr>
+          <w:rFonts w:eastAsia="Noto Serif CJK SC" w:cs="Noto Sans Devanagari" w:ascii="Garamond" w:hAnsi="Garamond"/>
+          <w:i w:val="false"/>
+          <w:iCs w:val="false"/>
+          <w:color w:val="00A0FC"/>
+          <w:kern w:val="2"/>
+          <w:sz w:val="36"/>
+          <w:szCs w:val="36"/>
+          <w:lang w:val="pt-BR" w:eastAsia="zh-CN" w:bidi="hi-IN"/>
+        </w:rPr>
+      </w:r>
+    </w:p>
+    <w:p>
+      <w:pPr>
+        <w:pStyle w:val="Normal"/>
+        <w:bidi w:val="0"/>
+        <w:ind w:left="709" w:hanging="0"/>
+        <w:jc w:val="both"/>
+        <w:rPr>
+          <w:i w:val="false"/>
+          <w:i w:val="false"/>
+          <w:iCs w:val="false"/>
+        </w:rPr>
+      </w:pPr>
+      <w:r>
+        <w:rPr>
+          <w:rFonts w:eastAsia="Noto Serif CJK SC" w:cs="Noto Sans Devanagari" w:ascii="Garamond" w:hAnsi="Garamond"/>
+          <w:i w:val="false"/>
+          <w:iCs w:val="false"/>
+          <w:color w:val="00A0FC"/>
+          <w:kern w:val="2"/>
+          <w:sz w:val="36"/>
+          <w:szCs w:val="36"/>
+          <w:lang w:val="pt-BR" w:eastAsia="zh-CN" w:bidi="hi-IN"/>
+        </w:rPr>
+        <w:t>A pergunta de Kardec é direta; não precisa de esclarecimentos.</w:t>
+      </w:r>
+    </w:p>
+    <w:p>
+      <w:pPr>
+        <w:pStyle w:val="Normal"/>
+        <w:bidi w:val="0"/>
+        <w:ind w:left="709" w:hanging="0"/>
+        <w:jc w:val="both"/>
+        <w:rPr>
+          <w:i w:val="false"/>
+          <w:i w:val="false"/>
+          <w:iCs w:val="false"/>
+        </w:rPr>
+      </w:pPr>
+      <w:r>
+        <w:rPr/>
+      </w:r>
+    </w:p>
+    <w:p>
+      <w:pPr>
+        <w:pStyle w:val="Normal"/>
+        <w:bidi w:val="0"/>
+        <w:ind w:left="709" w:hanging="0"/>
+        <w:jc w:val="both"/>
+        <w:rPr>
+          <w:i w:val="false"/>
+          <w:i w:val="false"/>
+          <w:iCs w:val="false"/>
+        </w:rPr>
+      </w:pPr>
+      <w:r>
+        <w:rPr>
+          <w:rFonts w:eastAsia="Noto Serif CJK SC" w:cs="Noto Sans Devanagari" w:ascii="Garamond" w:hAnsi="Garamond"/>
+          <w:i w:val="false"/>
+          <w:iCs w:val="false"/>
+          <w:color w:val="00A0FC"/>
+          <w:kern w:val="2"/>
+          <w:sz w:val="36"/>
+          <w:szCs w:val="36"/>
+          <w:lang w:val="pt-BR" w:eastAsia="zh-CN" w:bidi="hi-IN"/>
+        </w:rPr>
+        <w:t>Já a resposta da Espiritualidade merece uma análise mais profunda.</w:t>
+      </w:r>
+      <w:r>
+        <w:rPr>
+          <w:rFonts w:eastAsia="Noto Serif CJK SC" w:cs="Noto Sans Devanagari" w:ascii="Garamond" w:hAnsi="Garamond"/>
+          <w:i w:val="false"/>
+          <w:iCs w:val="false"/>
+          <w:color w:val="00A0FC"/>
+          <w:kern w:val="2"/>
+          <w:sz w:val="36"/>
+          <w:szCs w:val="36"/>
+          <w:lang w:val="pt-BR" w:eastAsia="zh-CN" w:bidi="hi-IN"/>
+        </w:rPr>
+        <w:t xml:space="preserve"> </w:t>
+      </w:r>
+      <w:r>
+        <w:rPr>
+          <w:rFonts w:eastAsia="Noto Serif CJK SC" w:cs="Noto Sans Devanagari" w:ascii="Garamond" w:hAnsi="Garamond"/>
+          <w:i w:val="false"/>
+          <w:iCs w:val="false"/>
+          <w:color w:val="00A0FC"/>
+          <w:kern w:val="2"/>
+          <w:sz w:val="36"/>
+          <w:szCs w:val="36"/>
+          <w:lang w:val="pt-BR" w:eastAsia="zh-CN" w:bidi="hi-IN"/>
+        </w:rPr>
+        <w:t xml:space="preserve">Num primeiro momento, </w:t>
+      </w:r>
+      <w:r>
+        <w:rPr>
+          <w:rFonts w:eastAsia="Noto Serif CJK SC" w:cs="Noto Sans Devanagari" w:ascii="Garamond" w:hAnsi="Garamond"/>
+          <w:i w:val="false"/>
+          <w:iCs w:val="false"/>
+          <w:color w:val="00A0FC"/>
+          <w:kern w:val="2"/>
+          <w:sz w:val="36"/>
+          <w:szCs w:val="36"/>
+          <w:lang w:val="pt-BR" w:eastAsia="zh-CN" w:bidi="hi-IN"/>
+        </w:rPr>
+        <w:t xml:space="preserve">ela </w:t>
+      </w:r>
+      <w:r>
+        <w:rPr>
+          <w:rFonts w:eastAsia="Noto Serif CJK SC" w:cs="Noto Sans Devanagari" w:ascii="Garamond" w:hAnsi="Garamond"/>
+          <w:i w:val="false"/>
+          <w:iCs w:val="false"/>
+          <w:color w:val="00A0FC"/>
+          <w:kern w:val="2"/>
+          <w:sz w:val="36"/>
+          <w:szCs w:val="36"/>
+          <w:lang w:val="pt-BR" w:eastAsia="zh-CN" w:bidi="hi-IN"/>
+        </w:rPr>
+        <w:t xml:space="preserve">parece estar  </w:t>
+      </w:r>
+      <w:r>
+        <w:rPr>
+          <w:rFonts w:eastAsia="Noto Serif CJK SC" w:cs="Noto Sans Devanagari" w:ascii="Garamond" w:hAnsi="Garamond"/>
+          <w:i w:val="false"/>
+          <w:iCs w:val="false"/>
+          <w:color w:val="00A0FC"/>
+          <w:kern w:val="2"/>
+          <w:sz w:val="36"/>
+          <w:szCs w:val="36"/>
+          <w:lang w:val="pt-BR" w:eastAsia="zh-CN" w:bidi="hi-IN"/>
+        </w:rPr>
+        <w:t xml:space="preserve">completamente </w:t>
+      </w:r>
+      <w:r>
+        <w:rPr>
+          <w:rFonts w:eastAsia="Noto Serif CJK SC" w:cs="Noto Sans Devanagari" w:ascii="Garamond" w:hAnsi="Garamond"/>
+          <w:i w:val="false"/>
+          <w:iCs w:val="false"/>
+          <w:color w:val="00A0FC"/>
+          <w:kern w:val="2"/>
+          <w:sz w:val="36"/>
+          <w:szCs w:val="36"/>
+          <w:lang w:val="pt-BR" w:eastAsia="zh-CN" w:bidi="hi-IN"/>
+        </w:rPr>
+        <w:t xml:space="preserve">errada. Afinal de contas, </w:t>
+      </w:r>
+      <w:r>
+        <w:rPr>
+          <w:rFonts w:eastAsia="Noto Serif CJK SC" w:cs="Noto Sans Devanagari" w:ascii="Garamond" w:hAnsi="Garamond"/>
+          <w:i w:val="false"/>
+          <w:iCs w:val="false"/>
+          <w:color w:val="00A0FC"/>
+          <w:kern w:val="2"/>
+          <w:sz w:val="36"/>
+          <w:szCs w:val="36"/>
+          <w:lang w:val="pt-BR" w:eastAsia="zh-CN" w:bidi="hi-IN"/>
+        </w:rPr>
+        <w:t>os noticiários estão repletos</w:t>
+      </w:r>
+      <w:r>
+        <w:rPr>
+          <w:rFonts w:eastAsia="Noto Serif CJK SC" w:cs="Noto Sans Devanagari" w:ascii="Garamond" w:hAnsi="Garamond"/>
+          <w:i w:val="false"/>
+          <w:iCs w:val="false"/>
+          <w:color w:val="00A0FC"/>
+          <w:kern w:val="2"/>
+          <w:sz w:val="36"/>
+          <w:szCs w:val="36"/>
+          <w:lang w:val="pt-BR" w:eastAsia="zh-CN" w:bidi="hi-IN"/>
+        </w:rPr>
+        <w:t xml:space="preserve"> de crimes bárbaros </w:t>
+      </w:r>
+      <w:r>
+        <w:rPr>
+          <w:rFonts w:eastAsia="Noto Serif CJK SC" w:cs="Noto Sans Devanagari" w:ascii="Garamond" w:hAnsi="Garamond"/>
+          <w:i w:val="false"/>
+          <w:iCs w:val="false"/>
+          <w:color w:val="00A0FC"/>
+          <w:kern w:val="2"/>
+          <w:sz w:val="36"/>
+          <w:szCs w:val="36"/>
+          <w:lang w:val="pt-BR" w:eastAsia="zh-CN" w:bidi="hi-IN"/>
+        </w:rPr>
+        <w:t>nos quais pessoas são prejudicadas, feridas ou mortas pela ação de outras pessoas.</w:t>
+      </w:r>
+    </w:p>
+    <w:p>
+      <w:pPr>
+        <w:pStyle w:val="Normal"/>
+        <w:bidi w:val="0"/>
+        <w:ind w:left="709" w:hanging="0"/>
+        <w:jc w:val="both"/>
+        <w:rPr>
+          <w:i w:val="false"/>
+          <w:i w:val="false"/>
+          <w:iCs w:val="false"/>
+        </w:rPr>
+      </w:pPr>
+      <w:r>
+        <w:rPr/>
+      </w:r>
+    </w:p>
+    <w:p>
+      <w:pPr>
+        <w:pStyle w:val="Normal"/>
+        <w:bidi w:val="0"/>
+        <w:ind w:left="709" w:hanging="0"/>
+        <w:jc w:val="both"/>
+        <w:rPr>
+          <w:i w:val="false"/>
+          <w:i w:val="false"/>
+          <w:iCs w:val="false"/>
+        </w:rPr>
+      </w:pPr>
+      <w:r>
+        <w:rPr>
+          <w:rFonts w:eastAsia="Noto Serif CJK SC" w:cs="Noto Sans Devanagari" w:ascii="Garamond" w:hAnsi="Garamond"/>
+          <w:i w:val="false"/>
+          <w:iCs w:val="false"/>
+          <w:color w:val="00A0FC"/>
+          <w:kern w:val="2"/>
+          <w:sz w:val="36"/>
+          <w:szCs w:val="36"/>
+          <w:lang w:val="pt-BR" w:eastAsia="zh-CN" w:bidi="hi-IN"/>
+        </w:rPr>
+        <w:t xml:space="preserve">Não resta dúvida também que, os autores de tais crimes, tiveram a companhia de Espíritos inferiores na execução de seus atos. Ainda que esses </w:t>
+      </w:r>
+      <w:r>
+        <w:rPr>
+          <w:rFonts w:eastAsia="Noto Serif CJK SC" w:cs="Noto Sans Devanagari" w:ascii="Garamond" w:hAnsi="Garamond"/>
+          <w:i w:val="false"/>
+          <w:iCs w:val="false"/>
+          <w:color w:val="00A0FC"/>
+          <w:kern w:val="2"/>
+          <w:sz w:val="36"/>
+          <w:szCs w:val="36"/>
+          <w:lang w:val="pt-BR" w:eastAsia="zh-CN" w:bidi="hi-IN"/>
+        </w:rPr>
+        <w:t>Espíritos</w:t>
+      </w:r>
+      <w:r>
+        <w:rPr>
+          <w:rFonts w:eastAsia="Noto Serif CJK SC" w:cs="Noto Sans Devanagari" w:ascii="Garamond" w:hAnsi="Garamond"/>
+          <w:i w:val="false"/>
+          <w:iCs w:val="false"/>
+          <w:color w:val="00A0FC"/>
+          <w:kern w:val="2"/>
+          <w:sz w:val="36"/>
+          <w:szCs w:val="36"/>
+          <w:lang w:val="pt-BR" w:eastAsia="zh-CN" w:bidi="hi-IN"/>
+        </w:rPr>
+        <w:t xml:space="preserve"> não tenham </w:t>
+      </w:r>
+      <w:r>
+        <w:rPr>
+          <w:rFonts w:eastAsia="Noto Serif CJK SC" w:cs="Noto Sans Devanagari" w:ascii="Garamond" w:hAnsi="Garamond"/>
+          <w:i w:val="false"/>
+          <w:iCs w:val="false"/>
+          <w:color w:val="00A0FC"/>
+          <w:kern w:val="2"/>
+          <w:sz w:val="36"/>
+          <w:szCs w:val="36"/>
+          <w:lang w:val="pt-BR" w:eastAsia="zh-CN" w:bidi="hi-IN"/>
+        </w:rPr>
+        <w:t xml:space="preserve">sido </w:t>
+      </w:r>
+      <w:r>
+        <w:rPr>
+          <w:rFonts w:eastAsia="Noto Serif CJK SC" w:cs="Noto Sans Devanagari" w:ascii="Garamond" w:hAnsi="Garamond"/>
+          <w:i w:val="false"/>
+          <w:iCs w:val="false"/>
+          <w:color w:val="00A0FC"/>
+          <w:kern w:val="2"/>
+          <w:sz w:val="36"/>
+          <w:szCs w:val="36"/>
+          <w:lang w:val="pt-BR" w:eastAsia="zh-CN" w:bidi="hi-IN"/>
+        </w:rPr>
+        <w:t xml:space="preserve">explicitamente </w:t>
+      </w:r>
+      <w:r>
+        <w:rPr>
+          <w:rFonts w:eastAsia="Noto Serif CJK SC" w:cs="Noto Sans Devanagari" w:ascii="Garamond" w:hAnsi="Garamond"/>
+          <w:i w:val="false"/>
+          <w:iCs w:val="false"/>
+          <w:color w:val="00A0FC"/>
+          <w:kern w:val="2"/>
+          <w:sz w:val="36"/>
+          <w:szCs w:val="36"/>
+          <w:lang w:val="pt-BR" w:eastAsia="zh-CN" w:bidi="hi-IN"/>
+        </w:rPr>
+        <w:t>invocados</w:t>
+      </w:r>
+      <w:r>
+        <w:rPr>
+          <w:rFonts w:eastAsia="Noto Serif CJK SC" w:cs="Noto Sans Devanagari" w:ascii="Garamond" w:hAnsi="Garamond"/>
+          <w:i w:val="false"/>
+          <w:iCs w:val="false"/>
+          <w:color w:val="00A0FC"/>
+          <w:kern w:val="2"/>
+          <w:sz w:val="36"/>
+          <w:szCs w:val="36"/>
+          <w:lang w:val="pt-BR" w:eastAsia="zh-CN" w:bidi="hi-IN"/>
+        </w:rPr>
+        <w:t xml:space="preserve">, certamente esses foram atraídos pela </w:t>
+      </w:r>
+      <w:r>
+        <w:rPr>
+          <w:rFonts w:eastAsia="Noto Serif CJK SC" w:cs="Noto Sans Devanagari" w:ascii="Garamond" w:hAnsi="Garamond"/>
+          <w:i w:val="false"/>
+          <w:iCs w:val="false"/>
+          <w:color w:val="00A0FC"/>
+          <w:kern w:val="2"/>
+          <w:sz w:val="36"/>
+          <w:szCs w:val="36"/>
+          <w:lang w:val="pt-BR" w:eastAsia="zh-CN" w:bidi="hi-IN"/>
+        </w:rPr>
+        <w:t>natureza dos crimes em si.</w:t>
+      </w:r>
+    </w:p>
+    <w:p>
+      <w:pPr>
+        <w:pStyle w:val="Normal"/>
+        <w:bidi w:val="0"/>
+        <w:ind w:left="709" w:hanging="0"/>
+        <w:jc w:val="both"/>
+        <w:rPr>
+          <w:i w:val="false"/>
+          <w:i w:val="false"/>
+          <w:iCs w:val="false"/>
+        </w:rPr>
+      </w:pPr>
+      <w:r>
+        <w:rPr/>
+      </w:r>
+    </w:p>
+    <w:p>
+      <w:pPr>
+        <w:pStyle w:val="Normal"/>
+        <w:bidi w:val="0"/>
+        <w:ind w:left="709" w:hanging="0"/>
+        <w:jc w:val="both"/>
+        <w:rPr>
+          <w:i w:val="false"/>
+          <w:i w:val="false"/>
+          <w:iCs w:val="false"/>
+        </w:rPr>
+      </w:pPr>
+      <w:r>
+        <w:rPr>
+          <w:rFonts w:eastAsia="Noto Serif CJK SC" w:cs="Noto Sans Devanagari" w:ascii="Garamond" w:hAnsi="Garamond"/>
+          <w:i w:val="false"/>
+          <w:iCs w:val="false"/>
+          <w:color w:val="00A0FC"/>
+          <w:kern w:val="2"/>
+          <w:sz w:val="36"/>
+          <w:szCs w:val="36"/>
+          <w:lang w:val="pt-BR" w:eastAsia="zh-CN" w:bidi="hi-IN"/>
+        </w:rPr>
+        <w:t xml:space="preserve">Na pergunta feita à Espiritualidade, Kardec não se refere à quaisquer Espíritos inferiores; ele fala </w:t>
+      </w:r>
+      <w:r>
+        <w:rPr>
+          <w:rFonts w:eastAsia="Noto Serif CJK SC" w:cs="Noto Sans Devanagari" w:ascii="Garamond" w:hAnsi="Garamond"/>
+          <w:i/>
+          <w:iCs/>
+          <w:color w:val="00A0FC"/>
+          <w:kern w:val="2"/>
+          <w:sz w:val="36"/>
+          <w:szCs w:val="36"/>
+          <w:lang w:val="pt-BR" w:eastAsia="zh-CN" w:bidi="hi-IN"/>
+        </w:rPr>
+        <w:t>um mau Espírito que lhe seja dedicado</w:t>
+      </w:r>
+      <w:r>
+        <w:rPr>
+          <w:rFonts w:eastAsia="Noto Serif CJK SC" w:cs="Noto Sans Devanagari" w:ascii="Garamond" w:hAnsi="Garamond"/>
+          <w:i w:val="false"/>
+          <w:iCs w:val="false"/>
+          <w:color w:val="00A0FC"/>
+          <w:kern w:val="2"/>
+          <w:sz w:val="36"/>
+          <w:szCs w:val="36"/>
+          <w:lang w:val="pt-BR" w:eastAsia="zh-CN" w:bidi="hi-IN"/>
+        </w:rPr>
+        <w:t xml:space="preserve">, ou seja, um Espírito devotado a uma pessoa que deseja fazer o mal ao seu próximo. </w:t>
+      </w:r>
+    </w:p>
+    <w:p>
+      <w:pPr>
+        <w:pStyle w:val="Normal"/>
+        <w:bidi w:val="0"/>
+        <w:ind w:left="709" w:hanging="0"/>
+        <w:jc w:val="both"/>
+        <w:rPr>
+          <w:i w:val="false"/>
+          <w:i w:val="false"/>
+          <w:iCs w:val="false"/>
+        </w:rPr>
+      </w:pPr>
+      <w:r>
+        <w:rPr>
+          <w:rFonts w:eastAsia="Noto Serif CJK SC" w:cs="Noto Sans Devanagari" w:ascii="Garamond" w:hAnsi="Garamond"/>
+          <w:i w:val="false"/>
+          <w:iCs w:val="false"/>
+          <w:color w:val="00A0FC"/>
+          <w:kern w:val="2"/>
+          <w:sz w:val="36"/>
+          <w:szCs w:val="36"/>
+          <w:lang w:val="pt-BR" w:eastAsia="zh-CN" w:bidi="hi-IN"/>
+        </w:rPr>
+        <w:t>Mas podemos entender que crimes são cometidos com o auxílio de um único ou de vários Espíritos inferiores. Então a Espiritualidade errou ao dizer que uma pessoa, auxiliada por um mal Espírito dedicado a ela, não conseguiria fazer o mal ao próximo? Obviamente que a Espiritualidade não errou.</w:t>
+      </w:r>
+    </w:p>
+    <w:p>
+      <w:pPr>
+        <w:pStyle w:val="Normal"/>
+        <w:bidi w:val="0"/>
+        <w:ind w:left="709" w:hanging="0"/>
+        <w:jc w:val="both"/>
+        <w:rPr>
+          <w:i w:val="false"/>
+          <w:i w:val="false"/>
+          <w:iCs w:val="false"/>
+        </w:rPr>
+      </w:pPr>
+      <w:r>
+        <w:rPr/>
+      </w:r>
+    </w:p>
+    <w:p>
+      <w:pPr>
+        <w:pStyle w:val="Normal"/>
+        <w:bidi w:val="0"/>
+        <w:ind w:left="709" w:hanging="0"/>
+        <w:jc w:val="both"/>
+        <w:rPr>
+          <w:i w:val="false"/>
+          <w:i w:val="false"/>
+          <w:iCs w:val="false"/>
+        </w:rPr>
+      </w:pPr>
+      <w:r>
+        <w:rPr>
+          <w:rFonts w:eastAsia="Noto Serif CJK SC" w:cs="Noto Sans Devanagari" w:ascii="Garamond" w:hAnsi="Garamond"/>
+          <w:i w:val="false"/>
+          <w:iCs w:val="false"/>
+          <w:color w:val="00A0FC"/>
+          <w:kern w:val="2"/>
+          <w:sz w:val="36"/>
+          <w:szCs w:val="36"/>
+          <w:lang w:val="pt-BR" w:eastAsia="zh-CN" w:bidi="hi-IN"/>
+        </w:rPr>
+        <w:t>A Espiritualidade respondeu dentro do contexto em que a pergunta foi feita. Nessa parte de O Livro dos Espíritos estamos falando de pactos e  conjurações, algo que envolve um certo misticismo.</w:t>
+      </w:r>
+    </w:p>
+    <w:p>
+      <w:pPr>
+        <w:pStyle w:val="Normal"/>
+        <w:bidi w:val="0"/>
+        <w:ind w:left="709" w:hanging="0"/>
+        <w:jc w:val="both"/>
+        <w:rPr>
+          <w:i w:val="false"/>
+          <w:i w:val="false"/>
+          <w:iCs w:val="false"/>
+        </w:rPr>
+      </w:pPr>
+      <w:r>
+        <w:rPr/>
+      </w:r>
+    </w:p>
+    <w:p>
+      <w:pPr>
+        <w:pStyle w:val="Normal"/>
+        <w:bidi w:val="0"/>
+        <w:ind w:left="709" w:hanging="0"/>
+        <w:jc w:val="both"/>
+        <w:rPr>
+          <w:i w:val="false"/>
+          <w:i w:val="false"/>
+          <w:iCs w:val="false"/>
+        </w:rPr>
+      </w:pPr>
+      <w:r>
+        <w:rPr>
+          <w:rFonts w:eastAsia="Noto Serif CJK SC" w:cs="Noto Sans Devanagari" w:ascii="Garamond" w:hAnsi="Garamond"/>
+          <w:i w:val="false"/>
+          <w:iCs w:val="false"/>
+          <w:color w:val="00A0FC"/>
+          <w:kern w:val="2"/>
+          <w:sz w:val="36"/>
+          <w:szCs w:val="36"/>
+          <w:lang w:val="pt-BR" w:eastAsia="zh-CN" w:bidi="hi-IN"/>
+        </w:rPr>
+        <w:t xml:space="preserve">Em outras palavras: basta alguém invocar um mau Espírito e solicitar auxílio na prática do mal que o objetivo será alcançado? De maneira alguma. </w:t>
+      </w:r>
+    </w:p>
+    <w:p>
+      <w:pPr>
+        <w:pStyle w:val="Normal"/>
+        <w:bidi w:val="0"/>
+        <w:ind w:left="709" w:hanging="0"/>
+        <w:jc w:val="both"/>
+        <w:rPr>
+          <w:i w:val="false"/>
+          <w:i w:val="false"/>
+          <w:iCs w:val="false"/>
+        </w:rPr>
+      </w:pPr>
+      <w:r>
+        <w:rPr/>
+      </w:r>
+    </w:p>
+    <w:p>
+      <w:pPr>
+        <w:pStyle w:val="Normal"/>
+        <w:bidi w:val="0"/>
+        <w:ind w:left="709" w:hanging="0"/>
+        <w:jc w:val="both"/>
+        <w:rPr>
+          <w:i w:val="false"/>
+          <w:i w:val="false"/>
+          <w:iCs w:val="false"/>
+        </w:rPr>
+      </w:pPr>
+      <w:r>
+        <w:rPr>
+          <w:rFonts w:eastAsia="Noto Serif CJK SC" w:cs="Noto Sans Devanagari" w:ascii="Garamond" w:hAnsi="Garamond"/>
+          <w:i w:val="false"/>
+          <w:iCs w:val="false"/>
+          <w:color w:val="00A0FC"/>
+          <w:kern w:val="2"/>
+          <w:sz w:val="36"/>
+          <w:szCs w:val="36"/>
+          <w:lang w:val="pt-BR" w:eastAsia="zh-CN" w:bidi="hi-IN"/>
+        </w:rPr>
+        <w:t xml:space="preserve">Na verdade a Espiritualidade já havia deixado claro na resposta da pergunta 549, que a Justiça Divina não permite que o mal seja feito contra alguém que não o merece. </w:t>
+      </w:r>
+    </w:p>
+    <w:p>
+      <w:pPr>
+        <w:pStyle w:val="Normal"/>
+        <w:bidi w:val="0"/>
+        <w:ind w:left="709" w:hanging="0"/>
+        <w:jc w:val="both"/>
+        <w:rPr>
+          <w:i w:val="false"/>
+          <w:i w:val="false"/>
+          <w:iCs w:val="false"/>
+        </w:rPr>
+      </w:pPr>
+      <w:r>
+        <w:rPr/>
+      </w:r>
+    </w:p>
+    <w:p>
+      <w:pPr>
+        <w:pStyle w:val="Normal"/>
+        <w:bidi w:val="0"/>
+        <w:ind w:left="709" w:hanging="0"/>
+        <w:jc w:val="both"/>
+        <w:rPr>
+          <w:i w:val="false"/>
+          <w:i w:val="false"/>
+          <w:iCs w:val="false"/>
+        </w:rPr>
+      </w:pPr>
+      <w:r>
+        <w:rPr>
+          <w:rFonts w:eastAsia="Noto Serif CJK SC" w:cs="Noto Sans Devanagari" w:ascii="Garamond" w:hAnsi="Garamond"/>
+          <w:i w:val="false"/>
+          <w:iCs w:val="false"/>
+          <w:color w:val="00A0FC"/>
+          <w:kern w:val="2"/>
+          <w:sz w:val="36"/>
+          <w:szCs w:val="36"/>
+          <w:lang w:val="pt-BR" w:eastAsia="zh-CN" w:bidi="hi-IN"/>
+        </w:rPr>
+        <w:t>Quando a Espiritualidade falou que meu vizinho poderia facilmente se livrar das minhas más intenções, conquistando a companhia dos bons Espíritos, ali já ficou claro que a Justiça Divina não permite que alguém seja vítima de um mal se não tiver que passar por isso.</w:t>
+      </w:r>
+    </w:p>
+    <w:p>
+      <w:pPr>
+        <w:pStyle w:val="Normal"/>
+        <w:bidi w:val="0"/>
+        <w:ind w:left="709" w:hanging="0"/>
+        <w:jc w:val="both"/>
+        <w:rPr>
+          <w:i w:val="false"/>
+          <w:i w:val="false"/>
+          <w:iCs w:val="false"/>
+        </w:rPr>
+      </w:pPr>
+      <w:r>
+        <w:rPr/>
+      </w:r>
+    </w:p>
+    <w:p>
+      <w:pPr>
+        <w:pStyle w:val="Normal"/>
+        <w:bidi w:val="0"/>
+        <w:ind w:left="709" w:hanging="0"/>
+        <w:jc w:val="both"/>
+        <w:rPr>
+          <w:i w:val="false"/>
+          <w:i w:val="false"/>
+          <w:iCs w:val="false"/>
+        </w:rPr>
+      </w:pPr>
+      <w:r>
+        <w:rPr>
+          <w:rFonts w:eastAsia="Noto Serif CJK SC" w:cs="Noto Sans Devanagari" w:ascii="Garamond" w:hAnsi="Garamond"/>
+          <w:i w:val="false"/>
+          <w:iCs w:val="false"/>
+          <w:color w:val="00A0FC"/>
+          <w:kern w:val="2"/>
+          <w:sz w:val="36"/>
+          <w:szCs w:val="36"/>
+          <w:lang w:val="pt-BR" w:eastAsia="zh-CN" w:bidi="hi-IN"/>
+        </w:rPr>
+        <w:t>Então, a resposta da Espiritualidade aqui  na questão 551 é nesse sentido: ninguém que deseje fazer o mal ao seu próximo, solicitando o auxílio de um ou mais Espíritos inferiores, terá êxito em suas intenções se Deus entender que aquele que seria vítima não merece passar por aquilo.</w:t>
+      </w:r>
+    </w:p>
+    <w:p>
+      <w:pPr>
+        <w:pStyle w:val="Normal"/>
+        <w:bidi w:val="0"/>
+        <w:ind w:left="709" w:hanging="0"/>
+        <w:jc w:val="both"/>
+        <w:rPr>
+          <w:i w:val="false"/>
+          <w:i w:val="false"/>
+          <w:iCs w:val="false"/>
+        </w:rPr>
+      </w:pPr>
+      <w:r>
+        <w:rPr/>
+      </w:r>
+    </w:p>
+    <w:p>
+      <w:pPr>
+        <w:pStyle w:val="Normal"/>
+        <w:bidi w:val="0"/>
+        <w:ind w:left="709" w:hanging="0"/>
+        <w:jc w:val="both"/>
+        <w:rPr>
+          <w:i w:val="false"/>
+          <w:i w:val="false"/>
+          <w:iCs w:val="false"/>
+        </w:rPr>
+      </w:pPr>
+      <w:r>
+        <w:rPr>
+          <w:rFonts w:eastAsia="Noto Serif CJK SC" w:cs="Noto Sans Devanagari" w:ascii="Garamond" w:hAnsi="Garamond"/>
+          <w:b/>
+          <w:bCs/>
+          <w:i w:val="false"/>
+          <w:iCs w:val="false"/>
+          <w:color w:val="auto"/>
+          <w:kern w:val="2"/>
+          <w:sz w:val="48"/>
+          <w:szCs w:val="48"/>
+          <w:lang w:val="pt-BR" w:eastAsia="zh-CN" w:bidi="hi-IN"/>
+        </w:rPr>
+        <w:t>[ Parei aqui em 07/05/2026 ]</w:t>
       </w:r>
     </w:p>
     <w:p>
@@ -9061,7 +8992,6 @@
         </w:tabs>
         <w:ind w:left="720" w:hanging="360"/>
       </w:pPr>
-      <w:rPr/>
     </w:lvl>
     <w:lvl w:ilvl="1">
       <w:start w:val="1"/>
@@ -9074,7 +9004,6 @@
         </w:tabs>
         <w:ind w:left="1080" w:hanging="360"/>
       </w:pPr>
-      <w:rPr/>
     </w:lvl>
     <w:lvl w:ilvl="2">
       <w:start w:val="1"/>
@@ -9087,7 +9016,6 @@
         </w:tabs>
         <w:ind w:left="1440" w:hanging="360"/>
       </w:pPr>
-      <w:rPr/>
     </w:lvl>
     <w:lvl w:ilvl="3">
       <w:start w:val="1"/>
@@ -9100,7 +9028,6 @@
         </w:tabs>
         <w:ind w:left="1800" w:hanging="360"/>
       </w:pPr>
-      <w:rPr/>
     </w:lvl>
     <w:lvl w:ilvl="4">
       <w:start w:val="1"/>
@@ -9113,7 +9040,6 @@
         </w:tabs>
         <w:ind w:left="2160" w:hanging="360"/>
       </w:pPr>
-      <w:rPr/>
     </w:lvl>
     <w:lvl w:ilvl="5">
       <w:start w:val="1"/>
@@ -9126,7 +9052,6 @@
         </w:tabs>
         <w:ind w:left="2520" w:hanging="360"/>
       </w:pPr>
-      <w:rPr/>
     </w:lvl>
     <w:lvl w:ilvl="6">
       <w:start w:val="1"/>
@@ -9139,7 +9064,6 @@
         </w:tabs>
         <w:ind w:left="2880" w:hanging="360"/>
       </w:pPr>
-      <w:rPr/>
     </w:lvl>
     <w:lvl w:ilvl="7">
       <w:start w:val="1"/>
@@ -9152,7 +9076,6 @@
         </w:tabs>
         <w:ind w:left="3240" w:hanging="360"/>
       </w:pPr>
-      <w:rPr/>
     </w:lvl>
     <w:lvl w:ilvl="8">
       <w:start w:val="1"/>
@@ -9165,7 +9088,6 @@
         </w:tabs>
         <w:ind w:left="3600" w:hanging="360"/>
       </w:pPr>
-      <w:rPr/>
     </w:lvl>
   </w:abstractNum>
   <w:num w:numId="1">
@@ -9201,7 +9123,7 @@
     <w:pPr>
       <w:widowControl/>
       <w:suppressAutoHyphens w:val="true"/>
-      <w:overflowPunct w:val="false"/>
+      <w:overflowPunct w:val="true"/>
       <w:bidi w:val="0"/>
       <w:spacing w:before="0" w:after="0"/>
       <w:jc w:val="left"/>

</xml_diff>